<commit_message>
Humanise the prose of the CBC research proposal
Rewrite the abstract and Chapters One to Three in plainer, more natural
academic English with varied sentence rhythm and fewer stock transitions.
Citations, tables, figures and structure are unchanged; a few empirical
claims are restated to follow the cited sources more closely.

Co-Authored-By: Claude Opus 5.5 <noreply@anthropic.com>
Claude-Session: https://claude.ai/code/session_01MJoZ5fMVrPBePWFDmyN3pz
</commit_message>
<xml_diff>
--- a/Research_Proposal_Teachers_Competence_CBC_Habaswein.docx
+++ b/Research_Proposal_Teachers_Competence_CBC_Habaswein.docx
@@ -736,7 +736,7 @@
           <w:sz w:val="24"/>
           <w:szCs w:val="24"/>
         </w:rPr>
-        <w:t xml:space="preserve">	5</w:t>
+        <w:t xml:space="preserve">	4</w:t>
       </w:r>
     </w:p>
     <w:p>
@@ -761,7 +761,7 @@
           <w:sz w:val="24"/>
           <w:szCs w:val="24"/>
         </w:rPr>
-        <w:t xml:space="preserve">	5</w:t>
+        <w:t xml:space="preserve">	4</w:t>
       </w:r>
     </w:p>
     <w:p>
@@ -836,7 +836,7 @@
           <w:sz w:val="24"/>
           <w:szCs w:val="24"/>
         </w:rPr>
-        <w:t xml:space="preserve">	6</w:t>
+        <w:t xml:space="preserve">	5</w:t>
       </w:r>
     </w:p>
     <w:p>
@@ -961,7 +961,7 @@
           <w:sz w:val="24"/>
           <w:szCs w:val="24"/>
         </w:rPr>
-        <w:t xml:space="preserve">	8</w:t>
+        <w:t xml:space="preserve">	7</w:t>
       </w:r>
     </w:p>
     <w:p>
@@ -1188,7 +1188,7 @@
           <w:sz w:val="24"/>
           <w:szCs w:val="24"/>
         </w:rPr>
-        <w:t xml:space="preserve">	13</w:t>
+        <w:t xml:space="preserve">	12</w:t>
       </w:r>
     </w:p>
     <w:p>
@@ -1213,7 +1213,7 @@
           <w:sz w:val="24"/>
           <w:szCs w:val="24"/>
         </w:rPr>
-        <w:t xml:space="preserve">	14</w:t>
+        <w:t xml:space="preserve">	13</w:t>
       </w:r>
     </w:p>
     <w:p>
@@ -1238,7 +1238,7 @@
           <w:sz w:val="24"/>
           <w:szCs w:val="24"/>
         </w:rPr>
-        <w:t xml:space="preserve">	14</w:t>
+        <w:t xml:space="preserve">	13</w:t>
       </w:r>
     </w:p>
     <w:p>
@@ -1313,7 +1313,7 @@
           <w:sz w:val="24"/>
           <w:szCs w:val="24"/>
         </w:rPr>
-        <w:t xml:space="preserve">	18</w:t>
+        <w:t xml:space="preserve">	17</w:t>
       </w:r>
     </w:p>
     <w:p>
@@ -1338,7 +1338,7 @@
           <w:sz w:val="24"/>
           <w:szCs w:val="24"/>
         </w:rPr>
-        <w:t xml:space="preserve">	19</w:t>
+        <w:t xml:space="preserve">	18</w:t>
       </w:r>
     </w:p>
     <w:p>
@@ -1363,7 +1363,7 @@
           <w:sz w:val="24"/>
           <w:szCs w:val="24"/>
         </w:rPr>
-        <w:t xml:space="preserve">	20</w:t>
+        <w:t xml:space="preserve">	19</w:t>
       </w:r>
     </w:p>
     <w:p>
@@ -1388,7 +1388,7 @@
           <w:sz w:val="24"/>
           <w:szCs w:val="24"/>
         </w:rPr>
-        <w:t xml:space="preserve">	22</w:t>
+        <w:t xml:space="preserve">	21</w:t>
       </w:r>
     </w:p>
     <w:p>
@@ -1415,7 +1415,7 @@
           <w:sz w:val="24"/>
           <w:szCs w:val="24"/>
         </w:rPr>
-        <w:t xml:space="preserve">	24</w:t>
+        <w:t xml:space="preserve">	23</w:t>
       </w:r>
     </w:p>
     <w:p>
@@ -1440,7 +1440,7 @@
           <w:sz w:val="24"/>
           <w:szCs w:val="24"/>
         </w:rPr>
-        <w:t xml:space="preserve">	24</w:t>
+        <w:t xml:space="preserve">	23</w:t>
       </w:r>
     </w:p>
     <w:p>
@@ -1465,7 +1465,7 @@
           <w:sz w:val="24"/>
           <w:szCs w:val="24"/>
         </w:rPr>
-        <w:t xml:space="preserve">	24</w:t>
+        <w:t xml:space="preserve">	23</w:t>
       </w:r>
     </w:p>
     <w:p>
@@ -1490,7 +1490,7 @@
           <w:sz w:val="24"/>
           <w:szCs w:val="24"/>
         </w:rPr>
-        <w:t xml:space="preserve">	24</w:t>
+        <w:t xml:space="preserve">	23</w:t>
       </w:r>
     </w:p>
     <w:p>
@@ -1515,7 +1515,7 @@
           <w:sz w:val="24"/>
           <w:szCs w:val="24"/>
         </w:rPr>
-        <w:t xml:space="preserve">	25</w:t>
+        <w:t xml:space="preserve">	24</w:t>
       </w:r>
     </w:p>
     <w:p>
@@ -1540,7 +1540,7 @@
           <w:sz w:val="24"/>
           <w:szCs w:val="24"/>
         </w:rPr>
-        <w:t xml:space="preserve">	26</w:t>
+        <w:t xml:space="preserve">	25</w:t>
       </w:r>
     </w:p>
     <w:p>
@@ -1565,7 +1565,7 @@
           <w:sz w:val="24"/>
           <w:szCs w:val="24"/>
         </w:rPr>
-        <w:t xml:space="preserve">	26</w:t>
+        <w:t xml:space="preserve">	25</w:t>
       </w:r>
     </w:p>
     <w:p>
@@ -1590,7 +1590,7 @@
           <w:sz w:val="24"/>
           <w:szCs w:val="24"/>
         </w:rPr>
-        <w:t xml:space="preserve">	27</w:t>
+        <w:t xml:space="preserve">	25</w:t>
       </w:r>
     </w:p>
     <w:p>
@@ -1615,7 +1615,7 @@
           <w:sz w:val="24"/>
           <w:szCs w:val="24"/>
         </w:rPr>
-        <w:t xml:space="preserve">	28</w:t>
+        <w:t xml:space="preserve">	26</w:t>
       </w:r>
     </w:p>
     <w:p>
@@ -1640,7 +1640,7 @@
           <w:sz w:val="24"/>
           <w:szCs w:val="24"/>
         </w:rPr>
-        <w:t xml:space="preserve">	28</w:t>
+        <w:t xml:space="preserve">	26</w:t>
       </w:r>
     </w:p>
     <w:p>
@@ -1665,7 +1665,7 @@
           <w:sz w:val="24"/>
           <w:szCs w:val="24"/>
         </w:rPr>
-        <w:t xml:space="preserve">	28</w:t>
+        <w:t xml:space="preserve">	27</w:t>
       </w:r>
     </w:p>
     <w:p>
@@ -1690,7 +1690,7 @@
           <w:sz w:val="24"/>
           <w:szCs w:val="24"/>
         </w:rPr>
-        <w:t xml:space="preserve">	29</w:t>
+        <w:t xml:space="preserve">	27</w:t>
       </w:r>
     </w:p>
     <w:p>
@@ -1715,7 +1715,7 @@
           <w:sz w:val="24"/>
           <w:szCs w:val="24"/>
         </w:rPr>
-        <w:t xml:space="preserve">	29</w:t>
+        <w:t xml:space="preserve">	27</w:t>
       </w:r>
     </w:p>
     <w:p>
@@ -1740,7 +1740,7 @@
           <w:sz w:val="24"/>
           <w:szCs w:val="24"/>
         </w:rPr>
-        <w:t xml:space="preserve">	30</w:t>
+        <w:t xml:space="preserve">	28</w:t>
       </w:r>
     </w:p>
     <w:p>
@@ -1765,7 +1765,7 @@
           <w:sz w:val="24"/>
           <w:szCs w:val="24"/>
         </w:rPr>
-        <w:t xml:space="preserve">	30</w:t>
+        <w:t xml:space="preserve">	28</w:t>
       </w:r>
     </w:p>
     <w:p>
@@ -1790,7 +1790,7 @@
           <w:sz w:val="24"/>
           <w:szCs w:val="24"/>
         </w:rPr>
-        <w:t xml:space="preserve">	30</w:t>
+        <w:t xml:space="preserve">	29</w:t>
       </w:r>
     </w:p>
     <w:p>
@@ -1815,7 +1815,7 @@
           <w:sz w:val="24"/>
           <w:szCs w:val="24"/>
         </w:rPr>
-        <w:t xml:space="preserve">	31</w:t>
+        <w:t xml:space="preserve">	29</w:t>
       </w:r>
     </w:p>
     <w:p>
@@ -1840,7 +1840,7 @@
           <w:sz w:val="24"/>
           <w:szCs w:val="24"/>
         </w:rPr>
-        <w:t xml:space="preserve">	31</w:t>
+        <w:t xml:space="preserve">	29</w:t>
       </w:r>
     </w:p>
     <w:p>
@@ -1865,7 +1865,7 @@
           <w:sz w:val="24"/>
           <w:szCs w:val="24"/>
         </w:rPr>
-        <w:t xml:space="preserve">	32</w:t>
+        <w:t xml:space="preserve">	30</w:t>
       </w:r>
     </w:p>
     <w:p>
@@ -1890,7 +1890,7 @@
           <w:sz w:val="24"/>
           <w:szCs w:val="24"/>
         </w:rPr>
-        <w:t xml:space="preserve">	32</w:t>
+        <w:t xml:space="preserve">	30</w:t>
       </w:r>
     </w:p>
     <w:p>
@@ -1915,7 +1915,7 @@
           <w:sz w:val="24"/>
           <w:szCs w:val="24"/>
         </w:rPr>
-        <w:t xml:space="preserve">	32</w:t>
+        <w:t xml:space="preserve">	31</w:t>
       </w:r>
     </w:p>
     <w:p>
@@ -1940,7 +1940,7 @@
           <w:sz w:val="24"/>
           <w:szCs w:val="24"/>
         </w:rPr>
-        <w:t xml:space="preserve">	33</w:t>
+        <w:t xml:space="preserve">	31</w:t>
       </w:r>
     </w:p>
     <w:p>
@@ -1965,7 +1965,7 @@
           <w:sz w:val="24"/>
           <w:szCs w:val="24"/>
         </w:rPr>
-        <w:t xml:space="preserve">	33</w:t>
+        <w:t xml:space="preserve">	31</w:t>
       </w:r>
     </w:p>
     <w:p>
@@ -1990,7 +1990,7 @@
           <w:sz w:val="24"/>
           <w:szCs w:val="24"/>
         </w:rPr>
-        <w:t xml:space="preserve">	33</w:t>
+        <w:t xml:space="preserve">	32</w:t>
       </w:r>
     </w:p>
     <w:p>
@@ -2017,7 +2017,7 @@
           <w:sz w:val="24"/>
           <w:szCs w:val="24"/>
         </w:rPr>
-        <w:t xml:space="preserve">	35</w:t>
+        <w:t xml:space="preserve">	33</w:t>
       </w:r>
     </w:p>
     <w:p>
@@ -2044,7 +2044,7 @@
           <w:sz w:val="24"/>
           <w:szCs w:val="24"/>
         </w:rPr>
-        <w:t xml:space="preserve">	39</w:t>
+        <w:t xml:space="preserve">	37</w:t>
       </w:r>
     </w:p>
     <w:p>
@@ -2071,7 +2071,7 @@
           <w:sz w:val="24"/>
           <w:szCs w:val="24"/>
         </w:rPr>
-        <w:t xml:space="preserve">	40</w:t>
+        <w:t xml:space="preserve">	38</w:t>
       </w:r>
     </w:p>
     <w:p>
@@ -2098,7 +2098,7 @@
           <w:sz w:val="24"/>
           <w:szCs w:val="24"/>
         </w:rPr>
-        <w:t xml:space="preserve">	41</w:t>
+        <w:t xml:space="preserve">	39</w:t>
       </w:r>
     </w:p>
     <w:p>
@@ -2125,7 +2125,7 @@
           <w:sz w:val="24"/>
           <w:szCs w:val="24"/>
         </w:rPr>
-        <w:t xml:space="preserve">	42</w:t>
+        <w:t xml:space="preserve">	40</w:t>
       </w:r>
     </w:p>
     <w:p>
@@ -2150,7 +2150,7 @@
           <w:sz w:val="24"/>
           <w:szCs w:val="24"/>
         </w:rPr>
-        <w:t xml:space="preserve">	42</w:t>
+        <w:t xml:space="preserve">	40</w:t>
       </w:r>
     </w:p>
     <w:p>
@@ -2175,7 +2175,7 @@
           <w:sz w:val="24"/>
           <w:szCs w:val="24"/>
         </w:rPr>
-        <w:t xml:space="preserve">	42</w:t>
+        <w:t xml:space="preserve">	40</w:t>
       </w:r>
     </w:p>
     <w:p>
@@ -2200,7 +2200,7 @@
           <w:sz w:val="24"/>
           <w:szCs w:val="24"/>
         </w:rPr>
-        <w:t xml:space="preserve">	43</w:t>
+        <w:t xml:space="preserve">	41</w:t>
       </w:r>
     </w:p>
     <w:p>
@@ -2225,7 +2225,7 @@
           <w:sz w:val="24"/>
           <w:szCs w:val="24"/>
         </w:rPr>
-        <w:t xml:space="preserve">	44</w:t>
+        <w:t xml:space="preserve">	42</w:t>
       </w:r>
     </w:p>
     <w:p>
@@ -2250,7 +2250,7 @@
           <w:sz w:val="24"/>
           <w:szCs w:val="24"/>
         </w:rPr>
-        <w:t xml:space="preserve">	45</w:t>
+        <w:t xml:space="preserve">	43</w:t>
       </w:r>
     </w:p>
     <w:p>
@@ -2275,7 +2275,7 @@
           <w:sz w:val="24"/>
           <w:szCs w:val="24"/>
         </w:rPr>
-        <w:t xml:space="preserve">	45</w:t>
+        <w:t xml:space="preserve">	43</w:t>
       </w:r>
     </w:p>
     <w:p>
@@ -2302,7 +2302,7 @@
           <w:sz w:val="24"/>
           <w:szCs w:val="24"/>
         </w:rPr>
-        <w:t xml:space="preserve">	46</w:t>
+        <w:t xml:space="preserve">	44</w:t>
       </w:r>
     </w:p>
     <w:p>
@@ -2329,7 +2329,7 @@
           <w:sz w:val="24"/>
           <w:szCs w:val="24"/>
         </w:rPr>
-        <w:t xml:space="preserve">	48</w:t>
+        <w:t xml:space="preserve">	46</w:t>
       </w:r>
     </w:p>
     <w:p>
@@ -2356,7 +2356,7 @@
           <w:sz w:val="24"/>
           <w:szCs w:val="24"/>
         </w:rPr>
-        <w:t xml:space="preserve">	49</w:t>
+        <w:t xml:space="preserve">	47</w:t>
       </w:r>
     </w:p>
     <w:p>
@@ -2383,7 +2383,7 @@
           <w:sz w:val="24"/>
           <w:szCs w:val="24"/>
         </w:rPr>
-        <w:t xml:space="preserve">	50</w:t>
+        <w:t xml:space="preserve">	48</w:t>
       </w:r>
     </w:p>
     <w:p>
@@ -2420,7 +2420,7 @@
           <w:sz w:val="24"/>
           <w:szCs w:val="24"/>
         </w:rPr>
-        <w:t xml:space="preserve">	22</w:t>
+        <w:t xml:space="preserve">	21</w:t>
       </w:r>
     </w:p>
     <w:p>
@@ -2445,7 +2445,7 @@
           <w:sz w:val="24"/>
           <w:szCs w:val="24"/>
         </w:rPr>
-        <w:t xml:space="preserve">	26</w:t>
+        <w:t xml:space="preserve">	24</w:t>
       </w:r>
     </w:p>
     <w:p>
@@ -2470,7 +2470,7 @@
           <w:sz w:val="24"/>
           <w:szCs w:val="24"/>
         </w:rPr>
-        <w:t xml:space="preserve">	27</w:t>
+        <w:t xml:space="preserve">	26</w:t>
       </w:r>
     </w:p>
     <w:p>
@@ -2495,7 +2495,7 @@
           <w:sz w:val="24"/>
           <w:szCs w:val="24"/>
         </w:rPr>
-        <w:t xml:space="preserve">	29</w:t>
+        <w:t xml:space="preserve">	28</w:t>
       </w:r>
     </w:p>
     <w:p>
@@ -2520,7 +2520,7 @@
           <w:sz w:val="24"/>
           <w:szCs w:val="24"/>
         </w:rPr>
-        <w:t xml:space="preserve">	49</w:t>
+        <w:t xml:space="preserve">	47</w:t>
       </w:r>
     </w:p>
     <w:p>
@@ -2545,7 +2545,7 @@
           <w:sz w:val="24"/>
           <w:szCs w:val="24"/>
         </w:rPr>
-        <w:t xml:space="preserve">	50</w:t>
+        <w:t xml:space="preserve">	48</w:t>
       </w:r>
     </w:p>
     <w:p>
@@ -2582,7 +2582,7 @@
           <w:sz w:val="24"/>
           <w:szCs w:val="24"/>
         </w:rPr>
-        <w:t xml:space="preserve">	21</w:t>
+        <w:t xml:space="preserve">	20</w:t>
       </w:r>
     </w:p>
     <w:p>
@@ -3218,7 +3218,7 @@
           <w:sz w:val="24"/>
           <w:szCs w:val="24"/>
         </w:rPr>
-        <w:t xml:space="preserve">The Competency-Based Curriculum (CBC) introduced in Kenya in 2017 seeks to develop learners who can think critically, solve problems, communicate and apply knowledge in real life. Its success depends largely on teachers, who are expected to understand the philosophy of the curriculum, use learner-centred pedagogy and assess learners through a range of authentic tools. Evidence from different parts of the country, however, suggests that many teachers have not yet acquired the competence the curriculum demands, and that this gap may be wider in marginalised arid and semi-arid counties such as Wajir. The purpose of this study is to assess teachers’ competence and its influence on the effective implementation of the CBC in public primary schools in Habaswein Sub-County, Wajir County, Kenya. The study is guided by four objectives: to assess the level of teachers’ knowledge and understanding of the principles and practices of the CBC; to analyse the level of teachers’ pedagogical competence in implementing the CBC; to identify the factors affecting teachers’ competence; and to establish the relationship between teachers’ competence and the effective implementation of the CBC. The study is anchored on the Concerns-Based Adoption Model, the Teacher Professional Competence Model and the Technological Pedagogical Content Knowledge framework. A convergent parallel mixed methods design combining a descriptive survey and a correlational approach will be used. The target population comprises approximately 42 public primary schools, 42 head teachers, 336 teachers and 3 Curriculum Support Officers. Stratified random sampling will be used to select 21 schools, and a sample of 183 teachers will be determined using a finite population formula and distributed proportionately across the strata. The 21 head teachers of the sampled schools and all 3 Curriculum Support Officers will also take part. Data will be collected through questionnaires, semi-structured interviews and classroom observation checklists. The instruments will be piloted in Wajir South Sub-County, content validity will be established through expert judgement and reliability will be tested using Cronbach’s alpha. Quantitative data will be analysed using descriptive statistics, Pearson correlation and multiple linear regression with the aid of SPSS, while qualitative data will be analysed thematically. The findings are expected to inform the Ministry of Education, the Teachers Service Commission, the Kenya Institute of Curriculum Development and the County Government of Wajir in designing targeted teacher support for marginalised areas.</w:t>
+        <w:t xml:space="preserve">Kenya introduced the Competency-Based Curriculum (CBC) in 2017 to raise learners who can think critically, solve problems, communicate well and use what they learn in real life. Whether the reform succeeds rests largely on teachers. They are expected to understand what the curriculum is trying to achieve, to teach in learner-centred ways and to assess learners through a range of authentic tools. Studies from different parts of the country suggest that many teachers have not yet developed this competence, and the gap may be widest in marginalised arid and semi-arid counties such as Wajir. This study therefore sets out to assess teachers’ competence and its influence on the effective implementation of the CBC in public primary schools in Habaswein Sub-County, Wajir County, Kenya. It has four objectives: to assess teachers’ knowledge and understanding of the principles and practices of the CBC; to analyse their pedagogical competence in implementing it; to identify the factors that affect their competence; and to establish the relationship between teachers’ competence and effective implementation. The study draws on the Concerns-Based Adoption Model, the Teacher Professional Competence Model and the Technological Pedagogical Content Knowledge framework. It will use a convergent parallel mixed methods design that combines a descriptive survey with a correlational approach. The target population is about 42 public primary schools, 42 head teachers, 336 teachers and 3 Curriculum Support Officers. Stratified random sampling will be used to select 21 schools, and a sample of 183 teachers, worked out with a finite population formula, will be spread proportionately across the strata. The head teachers of the 21 schools and all 3 Curriculum Support Officers will also take part. Data will be gathered through questionnaires, semi-structured interviews and classroom observation. The instruments will be piloted in Wajir South Sub-County, with content validity checked by experts and reliability tested using Cronbach’s alpha. Quantitative data will be analysed in SPSS using descriptive statistics, Pearson correlation and multiple linear regression, while qualitative data will be analysed thematically. The findings should help the Ministry of Education, the Teachers Service Commission, the Kenya Institute of Curriculum Development and the County Government of Wajir to plan better-targeted support for teachers in marginalised areas.</w:t>
       </w:r>
     </w:p>
     <w:p>
@@ -3294,7 +3294,7 @@
           <w:sz w:val="24"/>
           <w:szCs w:val="24"/>
         </w:rPr>
-        <w:t xml:space="preserve">Across the world, school systems are steadily moving away from curricula that reward the memorisation of content towards curricula that ask learners to do something meaningful with what they know. This shift, commonly described as competency-based education, places the emphasis on skills, values and attitudes that learners can apply in real situations, rather than on the volume of facts they can reproduce in an examination (Jentsch &amp; König, 2022). The global push for this kind of learning has come at the same time as a serious shortage of qualified teachers. UNESCO and the International Task Force on Teachers for Education 2030 (2024) estimate that the world will need 44 million additional primary and secondary teachers by 2030, with sub-Saharan Africa alone requiring about 15 million. The report stresses that recruiting more teachers is not enough; the teachers already in classrooms must be supported to acquire the professional competence that new curricula demand.</w:t>
+        <w:t xml:space="preserve">Schools in many parts of the world are rethinking what it means to learn. For a long time, a good pupil was one who could recall facts and reproduce them in an examination. Today, many education systems want more than that. They want learners who can use what they know to solve problems, work with others and make sound decisions in everyday life. This approach, usually called competency-based education, gives weight to skills, values and attitudes rather than to the amount of content a learner can remember (Jentsch &amp; König, 2022). The change is happening at a difficult time. UNESCO and the International Task Force on Teachers for Education 2030 (2024) estimate that the world will need 44 million more primary and secondary teachers by 2030, about 15 million of them in sub-Saharan Africa. The same report warns that hiring alone will not close the gap. Teachers who are already in service also need help to build the kind of competence that newer curricula ask of them.</w:t>
       </w:r>
     </w:p>
     <w:p>
@@ -3308,7 +3308,7 @@
           <w:sz w:val="24"/>
           <w:szCs w:val="24"/>
         </w:rPr>
-        <w:t xml:space="preserve">Competence, in the professional sense, is more than a teaching certificate. Jentsch and König (2022) describe teacher competence as a combination of professional knowledge, practical skills, beliefs and motivation that together allow a teacher to cope with the demands of real classrooms. Their review of international large-scale studies shows that these cognitive and affective dimensions develop over time, both during initial training and through continuous professional development, and that they are closely linked to the quality of instruction learners receive. Mishra et al. (2023) add that the knowledge base of teachers is not static; as curricula and technologies evolve, teachers must continually integrate content knowledge, pedagogical knowledge and technological knowledge if their teaching is to remain relevant. In short, a curriculum can only be as good as the teachers who deliver it.</w:t>
+        <w:t xml:space="preserve">What, then, makes a teacher competent? A certificate is only the starting point. Jentsch and König (2022) see teacher competence as a blend of professional knowledge, practical skill, beliefs and motivation, which together allow a teacher to handle the everyday demands of a real classroom. Drawing on large international studies, they show that these qualities grow over time, during initial training and later through professional development, and that they shape the quality of teaching that learners receive. Mishra et al. (2023) make a related point: teachers’ knowledge cannot stand still. As curricula and technologies change, teachers have to keep bringing together what they know about content, about teaching and about the tools available to them. Put simply, a curriculum is only as strong as the people who teach it.</w:t>
       </w:r>
     </w:p>
     <w:p>
@@ -3322,7 +3322,7 @@
           <w:sz w:val="24"/>
           <w:szCs w:val="24"/>
         </w:rPr>
-        <w:t xml:space="preserve">On the African continent, several countries have adopted competence-based curricula in the past decade, and their experiences offer useful lessons. Wawire et al. (2026), in a scoping review covering Ghana, Kenya, Rwanda, South Africa, Tanzania, Uganda and Zambia, found that although policy documents across the region promote learner-centred pedagogy and formative assessment, classroom practice in many schools still leans towards teacher talk, copying of notes and summative testing. In Tanzania, Kasuga and Kalolo (2025) documented a set of dilemmas in Njombe Region, among them inadequate teacher preparation, an uneven distribution of teaching resources and a tension between the new competency approach and societal expectations that remain tied to examination results. Uganda’s experience with its revised lower secondary curriculum tells a similar story. Kidega et al. (2024) reported that teachers in Gulu City struggled with large classes, limited materials and insufficient training, while Barasa et al. (2025) raised concerns that schools serving poorer communities were falling behind in implementing the reform, thereby widening rather than narrowing inequality.</w:t>
+        <w:t xml:space="preserve">Several African countries have introduced competence-based curricula over the past decade, and their experience is instructive. Wawire et al. (2026) reviewed studies from Ghana, Kenya, Rwanda, South Africa, Tanzania, Uganda and Zambia. On paper, these countries all promote learner-centred teaching and formative assessment. In many classrooms, though, lessons are still dominated by teacher talk, note copying and end-of-term tests. Kasuga and Kalolo (2025) describe similar tensions in Njombe Region, Tanzania, where poorly prepared teachers, an uneven spread of resources and parents’ continued focus on examination results pulled against the new approach. Uganda tells much the same story. Teachers in Gulu City reported large classes, few materials and too little training (Kidega et al., 2024), and Barasa et al. (2025) worry that schools serving poorer families are falling behind, so that a reform meant to reduce inequality may end up widening it.</w:t>
       </w:r>
     </w:p>
     <w:p>
@@ -3336,7 +3336,7 @@
           <w:sz w:val="24"/>
           <w:szCs w:val="24"/>
         </w:rPr>
-        <w:t xml:space="preserve">Kenya began its own journey in 2017, when the Competency-Based Curriculum (CBC) replaced the 8-4-4 system in a phased rollout that started with pre-primary and lower primary grades. The reform was designed to nurture every learner’s potential through seven core competencies: communication and collaboration, critical thinking and problem solving, imagination and creativity, citizenship, digital literacy, learning to learn, and self-efficacy (Akala, 2021). It introduced a new structure in which learners spend two years in pre-primary, six years in primary, three years in junior school and three years in senior school before proceeding to tertiary education. In 2022, the government constituted the Presidential Working Party on Education Reform (PWPER) to review the implementation of the curriculum. The Working Party endorsed the competency approach but recommended a reduction in the number of learning areas, a lighter assessment load and a stronger programme of teacher capacity building (Presidential Working Party on Education Reform [PWPER], 2023). Following these recommendations, the reform has increasingly been referred to as Competency-Based Education (CBE), although the classroom expectations placed on teachers remain largely the same.</w:t>
+        <w:t xml:space="preserve">Kenya started its own reform in 2017, when the Competency-Based Curriculum (CBC) began to replace the 8-4-4 system, beginning with pre-primary and the lower primary grades. The new curriculum aims to nurture every learner’s potential through seven core competencies: communication and collaboration, critical thinking and problem solving, imagination and creativity, citizenship, digital literacy, learning to learn, and self-efficacy (Akala, 2021). Learners now spend two years in pre-primary, six in primary, three in junior school and three in senior school before moving on to tertiary education. In 2022, the government set up the Presidential Working Party on Education Reform (PWPER) to review how the reform was working. The Working Party kept the competency approach. It did, however, ask for fewer learning areas, a lighter assessment burden and a much stronger investment in teacher capacity (Presidential Working Party on Education Reform [PWPER], 2023). Since then, the reform has increasingly been described as Competency-Based Education (CBE), although what is expected of teachers in the classroom has hardly changed.</w:t>
       </w:r>
     </w:p>
     <w:p>
@@ -3350,7 +3350,7 @@
           <w:sz w:val="24"/>
           <w:szCs w:val="24"/>
         </w:rPr>
-        <w:t xml:space="preserve">A central feature of the Kenyan reform is its assessment model. The Kenya National Examinations Council (KNEC, 2021) developed a competency-based assessment framework that requires teachers to use a range of formative tools such as observation schedules, rating scales, checklists, portfolios, projects and rubrics, alongside summative assessment. This model assumes that teachers can design authentic tasks, judge learner performance against clear criteria and keep accurate records for every child. Macheso, Kati, and Wafula (2024) found that, even several years into the reform, many primary school teachers in western Kenya were still relying on a narrow range of assessment tools, with portfolios, anecdotal records and projects being used far less often than written tests. Such findings suggest that the competence required by the curriculum has not been fully acquired by the teachers expected to implement it.</w:t>
+        <w:t xml:space="preserve">Assessment sits at the heart of the Kenyan reform. The Kenya National Examinations Council (KNEC, 2021) introduced a competency-based assessment framework in which teachers combine summative tests with a range of formative tools, among them observation schedules, rating scales, checklists, portfolios, projects and rubrics. The framework takes for granted that teachers can design authentic tasks, judge learners’ work against clear criteria and keep accurate records for every child. That assumption does not always hold. Several years into the reform, Macheso, Kati, and Wafula (2024) found that many primary teachers in western Kenya still leaned heavily on written tests, while portfolios, anecdotal records and projects were used far less often. The competence the curriculum depends on, in other words, has not yet taken root among many of the teachers expected to deliver it.</w:t>
       </w:r>
     </w:p>
     <w:p>
@@ -3364,7 +3364,7 @@
           <w:sz w:val="24"/>
           <w:szCs w:val="24"/>
         </w:rPr>
-        <w:t xml:space="preserve">The wider body of Kenyan research points in the same direction. Studies conducted in Nairobi, Nyamira, Kirinyaga, Kinangop, Moiben and Bomet have repeatedly found that teachers were either inadequately trained for the new curriculum or trained in a hurried manner that left gaps in their understanding (Isaboke et al., 2021; Karua et al., 2025; Keter &amp; Wabuke, 2025; Mohamed et al., 2022; Mutai et al., 2024; Okeyo &amp; Mokua, 2023). Mwangi et al. (2026) observed that although 95% of teachers in their sample had attended CBC training, 65% still held negative perceptions of the curriculum, which suggests that attendance at a workshop does not automatically translate into competence or commitment. Similarly, Mwang’ombe (2021) noted that teachers’ understanding of CBC was often vague, and that this vagueness showed up in lesson planning, classroom delivery and assessment. In a large classroom-based study, the African Population and Health Research Center (APHRC, 2022) found that while some teachers delivered effective CBC lessons, many lessons fell short on learner engagement and the integration of core competencies.</w:t>
+        <w:t xml:space="preserve">Other Kenyan studies paint a similar picture. Research in Nairobi, Nyamira, Kirinyaga, Kinangop, Moiben and Bomet has found, again and again, that teachers were either not trained for the new curriculum or were trained in a rush that left gaps in their understanding (Isaboke et al., 2021; Karua et al., 2025; Keter &amp; Wabuke, 2025; Mohamed et al., 2022; Mutai et al., 2024; Okeyo &amp; Mokua, 2023). One finding stands out. Mwangi et al. (2026) report that 95% of the teachers they studied had attended CBC training, yet 65% still viewed the curriculum negatively. Sitting through a workshop, it seems, does not by itself make a teacher competent or committed. Mwang’ombe (2021) described teachers’ grasp of the CBC as vague, a weakness that showed in their planning, their teaching and their assessment. In a classroom-based evaluation, the African Population and Health Research Center (APHRC, 2022) found that some teachers were delivering effective CBC lessons, but many lessons fell short on learner engagement and on the integration of core competencies.</w:t>
       </w:r>
     </w:p>
     <w:p>
@@ -3378,7 +3378,7 @@
           <w:sz w:val="24"/>
           <w:szCs w:val="24"/>
         </w:rPr>
-        <w:t xml:space="preserve">The difficulties described above are likely to be more pronounced in the arid and semi-arid lands (ASAL) of northern Kenya. Hussein (2023) reported that poor infrastructure, a shortage of learning resources and limited teacher training undermined CBC implementation across northern Kenya, while Ongubo (2025) found that more than 60% of public primary school teachers in Township Ward, Garissa County, had not received comprehensive in-service training on CBC. Wajir County, where this study is located, shares many of these characteristics. The County Integrated Development Plan acknowledges persistent challenges in the education sector, including a shortage of teachers, long distances to school, the effects of recurrent drought on enrolment and attendance, and a pastoralist lifestyle that disrupts continuous schooling (County Government of Wajir, 2023). Insecurity along the border with Somalia has also led to the transfer of many non-local teachers, leaving schools understaffed and heavily reliant on teachers employed by Boards of Management.</w:t>
+        <w:t xml:space="preserve">These problems are likely to be sharper in the arid and semi-arid lands (ASAL) of northern Kenya. Hussein (2023) found that poor infrastructure, scarce learning resources and limited training were holding back the CBC across the region. In Township Ward, Garissa County, more than 60% of public primary teachers had not received comprehensive in-service training on the curriculum (Ongubo, 2025). Wajir County, the setting of this study, faces many of the same pressures. Its County Integrated Development Plan lists a shortage of teachers, long distances to school, recurrent drought that disrupts enrolment and attendance, and a pastoralist way of life that makes continuous schooling hard to sustain (County Government of Wajir, 2023). Insecurity in the border areas has added to the strain, as many teachers from outside the region have sought transfers, leaving schools short-staffed and increasingly dependent on teachers hired by Boards of Management.</w:t>
       </w:r>
     </w:p>
     <w:p>
@@ -3392,7 +3392,7 @@
           <w:sz w:val="24"/>
           <w:szCs w:val="24"/>
         </w:rPr>
-        <w:t xml:space="preserve">Habaswein Sub-County lies in the southern part of Wajir County, along the Garissa to Wajir road. Most of its public primary schools serve pastoralist and agro-pastoralist communities, and a number of them operate as low-cost boarding schools to keep children from mobile households in school. Teachers in these schools work under demanding conditions: classes can be large, instructional materials are few, electricity and internet access are unreliable, and opportunities for professional development are scarce. Yet the curriculum they are expected to deliver is exactly the same as the one taught in well-resourced urban schools, and their learners sit the same national assessments. It is therefore important to understand how competent teachers in Habaswein are to implement the CBC, what shapes that competence, and how it relates to the quality of implementation in their classrooms.</w:t>
+        <w:t xml:space="preserve">Habaswein Sub-County lies in the south of Wajir County, along the road between Garissa and Wajir. Most of its public primary schools serve pastoralist and agro-pastoralist families, and several run low-cost boarding facilities so that children from mobile households can stay in school. The teachers here work in tough conditions. Classes are often large, teaching materials are few, electricity and internet are unreliable and chances for professional development are rare. Even so, they teach the same curriculum as teachers in well-equipped urban schools, and their learners sit the same national assessments. It is worth asking, then, how well prepared these teachers are to deliver the CBC, what shapes their competence and how that competence shows up in their classrooms. These are the questions this study sets out to answer.</w:t>
       </w:r>
     </w:p>
     <w:p>
@@ -3417,7 +3417,7 @@
           <w:sz w:val="24"/>
           <w:szCs w:val="24"/>
         </w:rPr>
-        <w:t xml:space="preserve">The success of the CBC depends on teachers who understand its philosophy, use learner-centred methods, integrate core competencies and pertinent and contemporary issues into their lessons, and assess learners in authentic ways. Ideally, every public primary school teacher in Kenya should possess these competences, and the classroom experience of a learner in Habaswein should be comparable to that of a learner in Nairobi or Nakuru. The government has made deliberate efforts towards this ideal through national training programmes, the supply of curriculum designs and textbooks, and the work of Curriculum Support Officers (PWPER, 2023).</w:t>
+        <w:t xml:space="preserve">For the CBC to work, teachers need to understand what it is trying to achieve. They need to teach in learner-centred ways, weave core competencies and pertinent and contemporary issues into their lessons and assess learners through authentic tasks. In an ideal situation, every public primary teacher in Kenya would have these abilities, and a child in Habaswein would enjoy much the same classroom experience as a child in Nairobi or Nakuru. The government has taken real steps in this direction through national training, the supply of curriculum designs and textbooks, and the work of Curriculum Support Officers (PWPER, 2023).</w:t>
       </w:r>
     </w:p>
     <w:p>
@@ -3431,7 +3431,7 @@
           <w:sz w:val="24"/>
           <w:szCs w:val="24"/>
         </w:rPr>
-        <w:t xml:space="preserve">In reality, the evidence suggests a wide gap between what the curriculum expects of teachers and what many teachers are able to do. Studies across the country show that a considerable proportion of teachers have limited understanding of CBC principles, find it difficult to prepare schemes of work and lesson plans in the required format, and rely on a narrow set of assessment tools (Karua et al., 2025; Macheso, Kati, &amp; Wafula, 2024; Mwang’ombe, 2021). In northern Kenya, these gaps are compounded by teacher shortages, insecurity, inadequate infrastructure and the limited reach of in-service training (Hussein, 2023; Ongubo, 2025). When teachers lack the necessary competence, the likely consequence is superficial implementation, in which the language of the new curriculum is adopted while classroom practice remains largely teacher-centred and examination-driven (Awiti, 2023; Wawire et al., 2026). Learners in marginalised areas then miss out on the very competencies that the reform was meant to develop, and existing inequalities are deepened rather than reduced (Barasa et al., 2025).</w:t>
+        <w:t xml:space="preserve">The reality falls short of this ideal. Research from across the country shows that many teachers have only a partial understanding of the principles of the CBC, struggle to prepare schemes of work and lesson plans in the required format and use a narrow set of assessment tools (Karua et al., 2025; Macheso, Kati, &amp; Wafula, 2024; Mwang’ombe, 2021). In northern Kenya, teacher shortages, insecurity, weak infrastructure and patchy in-service training make matters worse (Hussein, 2023; Ongubo, 2025). Where teachers lack the competence they need, implementation tends to stay on the surface. The vocabulary of the new curriculum is adopted, but lessons remain teacher-centred and driven by examinations (Awiti, 2023; Wawire et al., 2026). Learners in marginalised areas then miss out on the very skills the reform was designed to build, and old inequalities grow deeper (Barasa et al., 2025).</w:t>
       </w:r>
     </w:p>
     <w:p>
@@ -3445,7 +3445,7 @@
           <w:sz w:val="24"/>
           <w:szCs w:val="24"/>
         </w:rPr>
-        <w:t xml:space="preserve">Although many studies have examined teacher preparedness for CBC, most of them were conducted in urban or relatively well-served counties such as Nairobi, Machakos, Kirinyaga, Nyandarua and Uasin Gishu (Isaboke et al., 2021; Mogere, 2022; Mutua &amp; Waweru, 2023). Very little empirical work has been done in Wajir County, and none that the researcher is aware of has examined teachers’ competence and its influence on CBC implementation in Habaswein Sub-County. Moreover, many previous studies measured preparedness mainly in terms of attendance at training, without assessing teachers’ actual knowledge, pedagogical practice and assessment competence, or statistically testing how these dimensions relate to the effectiveness of implementation. This lack of context-specific evidence makes it difficult for the Ministry of Education, the Teachers Service Commission and the County Government of Wajir to design targeted interventions. The present study therefore seeks to assess teachers’ competence and establish its influence on the effective implementation of the CBC in public primary schools in Habaswein Sub-County, Wajir County.</w:t>
+        <w:t xml:space="preserve">Plenty of studies have looked at teacher preparedness for the CBC, but most were carried out in urban or relatively well-served counties such as Nairobi, Machakos, Kirinyaga, Nyandarua and Uasin Gishu (Isaboke et al., 2021; Mogere, 2022; Mutua &amp; Waweru, 2023). Wajir County has received little attention, and the researcher knows of no study that has examined teachers’ competence and CBC implementation in Habaswein Sub-County. A second weakness is one of measurement. Many earlier studies judged preparedness mainly by whether teachers had attended training. They did not assess what teachers actually know, how they teach or how they assess learners, and they rarely tested statistically how these abilities relate to the quality of implementation. Without evidence of this kind, the Ministry of Education, the Teachers Service Commission and the County Government of Wajir have little to guide targeted support. This study responds to that gap by assessing teachers’ competence and establishing its influence on the effective implementation of the CBC in public primary schools in Habaswein Sub-County, Wajir County.</w:t>
       </w:r>
     </w:p>
     <w:p>
@@ -3470,7 +3470,7 @@
           <w:sz w:val="24"/>
           <w:szCs w:val="24"/>
         </w:rPr>
-        <w:t xml:space="preserve">The purpose of this study is to assess the competence of teachers and to establish how that competence influences the effective implementation of the Competency-Based Curriculum in public primary schools in Habaswein Sub-County, Wajir County, Kenya, with a view to generating evidence that can inform teacher support and policy in marginalised settings.</w:t>
+        <w:t xml:space="preserve">The purpose of this study is to assess teachers’ competence and to establish how it influences the effective implementation of the Competency-Based Curriculum in public primary schools in Habaswein Sub-County, Wajir County, Kenya. The aim is to produce evidence that can guide teacher support and education policy in marginalised settings.</w:t>
       </w:r>
     </w:p>
     <w:p>
@@ -3853,7 +3853,7 @@
           <w:sz w:val="24"/>
           <w:szCs w:val="24"/>
         </w:rPr>
-        <w:t xml:space="preserve">To give statistical direction to the fourth objective, the following null hypotheses will be tested at the 0.05 level of significance:</w:t>
+        <w:t xml:space="preserve">The fourth objective will be tested statistically through the following null hypotheses, each at the 0.05 level of significance:</w:t>
       </w:r>
     </w:p>
     <w:p>
@@ -3980,7 +3980,21 @@
           <w:sz w:val="24"/>
           <w:szCs w:val="24"/>
         </w:rPr>
-        <w:t xml:space="preserve">Several reasons justify this study. First, the CBC is one of the most far-reaching education reforms in Kenya’s history, and its first full cohort of learners has only recently transitioned into junior and senior school. Evidence on how well it is being implemented in different parts of the country is therefore both timely and necessary. Second, the reform was meant to promote equity, yet studies from other countries in the region show that competence-based reforms can widen gaps between advantaged and disadvantaged schools when teacher support is uneven (Barasa et al., 2025; Kasuga &amp; Kalolo, 2025). Habaswein represents precisely the kind of marginalised setting in which such gaps are likely to appear. Third, the PWPER (2023) placed strong emphasis on teacher capacity building, and the Teachers Service Commission continues to invest in in-service training. For these investments to be effective, they must be informed by evidence on where teachers’ competence is strong, where it is weak and what factors hold it back. Finally, most of the existing Kenyan literature is concentrated in central, western and urban regions. By focusing on a sub-county in the North Eastern region, this study will help to balance the national evidence base.</w:t>
+        <w:t xml:space="preserve">The CBC is one of the most ambitious education reforms Kenya has ever undertaken, and the first learners to go through it have only recently moved into junior and senior school. This is the right moment to ask how well it is working in different parts of the country. Equity is a second reason. The reform was meant to widen opportunity, yet experience elsewhere in the region shows that competence-based reforms can deepen the divide between advantaged and disadvantaged schools when support for teachers is uneven (Barasa et al., 2025; Kasuga &amp; Kalolo, 2025). Habaswein is exactly the kind of place where such a divide would appear first.</w:t>
+      </w:r>
+    </w:p>
+    <w:p>
+      <w:pPr>
+        <w:spacing w:after="160" w:before="0" w:line="360"/>
+        <w:jc w:val="both"/>
+      </w:pPr>
+      <w:r>
+        <w:rPr>
+          <w:rFonts w:ascii="Times New Roman" w:cs="Times New Roman" w:eastAsia="Times New Roman" w:hAnsi="Times New Roman"/>
+          <w:sz w:val="24"/>
+          <w:szCs w:val="24"/>
+        </w:rPr>
+        <w:t xml:space="preserve">There is also a practical case. The PWPER (2023) called for stronger teacher capacity building, and the Teachers Service Commission continues to spend on in-service training. That money will be better used if it is guided by evidence on where teachers are strong, where they struggle and what stands in their way. Finally, Kenyan research on the CBC has been concentrated in central, western and urban areas. A study set in the North Eastern region will add a missing voice to the national picture.</w:t>
       </w:r>
     </w:p>
     <w:p>
@@ -4005,7 +4019,7 @@
           <w:sz w:val="24"/>
           <w:szCs w:val="24"/>
         </w:rPr>
-        <w:t xml:space="preserve">The findings of the study are expected to benefit several groups. The Ministry of Education and the Kenya Institute of Curriculum Development (KICD) may use the findings to refine curriculum support strategies for ASAL counties, including the design of simplified curriculum materials and context-sensitive guidance on assessment. The Teachers Service Commission (TSC) may draw on the results to design targeted in-service training and teacher professional development programmes, and to reconsider staffing and incentive policies for hardship areas.</w:t>
+        <w:t xml:space="preserve">The findings should be of use to several groups. The Ministry of Education and the Kenya Institute of Curriculum Development (KICD) could draw on them to adjust curriculum support for ASAL counties, for example by simplifying materials or offering assessment guidance that suits local conditions. The Teachers Service Commission (TSC) could use them to shape in-service training and professional development, and to revisit staffing and incentive policies for hardship areas.</w:t>
       </w:r>
     </w:p>
     <w:p>
@@ -4019,7 +4033,7 @@
           <w:sz w:val="24"/>
           <w:szCs w:val="24"/>
         </w:rPr>
-        <w:t xml:space="preserve">Teacher training colleges and universities may use the findings to strengthen the pre-service preparation of teachers, especially in learner-centred pedagogy, competency-based assessment and teaching in multi-grade and resource-constrained classrooms. The County Government of Wajir, through its education department, may find the results useful in planning early childhood and basic education support, as well as in lobbying for additional national resources. Head teachers and Curriculum Support Officers in Habaswein may use the findings to plan school-based professional learning, peer mentoring and instructional supervision. Teachers themselves may gain insight into the specific areas of their practice that need strengthening. Finally, researchers and scholars will have an additional reference on CBC implementation in marginalised contexts, and the study may open avenues for further research.</w:t>
+        <w:t xml:space="preserve">Teacher training colleges and universities may find the results helpful in strengthening pre-service preparation, particularly in learner-centred teaching, competency-based assessment and teaching in multi-grade or poorly resourced classrooms. The County Government of Wajir could use the evidence when planning support for basic education and when making the case for more national resources. Closer to the classroom, head teachers and Curriculum Support Officers in Habaswein could use the findings to plan school-based professional learning, mentoring and supervision, while teachers may gain a clearer sense of which parts of their practice need attention. For researchers, the study adds to a thin body of work on the CBC in marginalised settings and points to questions that deserve further inquiry.</w:t>
       </w:r>
     </w:p>
     <w:p>
@@ -4044,7 +4058,21 @@
           <w:sz w:val="24"/>
           <w:szCs w:val="24"/>
         </w:rPr>
-        <w:t xml:space="preserve">The study is likely to face certain limitations. First, part of the data will be self-reported by teachers through questionnaires, and some respondents may overstate their competence to present themselves favourably. To reduce this risk, the researcher will triangulate questionnaire responses with classroom observations and interviews with head teachers and Curriculum Support Officers. Second, the vast distances between schools, poor road networks and occasional insecurity in parts of the sub-county may make some schools difficult to reach. The researcher will plan fieldwork during the dry season, coordinate with local education and security offices, and use trained research assistants familiar with the area. Third, some schools may be temporarily closed or have reduced attendance because of drought or the movement of pastoralist families. Where this happens, replacement schools will be drawn from the same stratum. Fourth, because the study is limited to one sub-county, its findings may not be fully generalisable to other parts of Kenya, although they are expected to be relevant to other ASAL settings with similar characteristics.</w:t>
+        <w:t xml:space="preserve">A few limitations are expected. Part of the data will come from teachers’ own reports in questionnaires, and some teachers may rate their competence more highly than is warranted. To guard against this, the researcher will compare questionnaire responses with classroom observations and with interviews with head teachers and Curriculum Support Officers.</w:t>
+      </w:r>
+    </w:p>
+    <w:p>
+      <w:pPr>
+        <w:spacing w:after="160" w:before="0" w:line="360"/>
+        <w:jc w:val="both"/>
+      </w:pPr>
+      <w:r>
+        <w:rPr>
+          <w:rFonts w:ascii="Times New Roman" w:cs="Times New Roman" w:eastAsia="Times New Roman" w:hAnsi="Times New Roman"/>
+          <w:sz w:val="24"/>
+          <w:szCs w:val="24"/>
+        </w:rPr>
+        <w:t xml:space="preserve">Access is another concern. Schools in the sub-county are far apart, roads are poor and some areas experience occasional insecurity. The researcher will plan fieldwork for the dry months, work closely with local education and security offices and engage research assistants who know the area well. Drought or the seasonal movement of pastoralist families may also close some schools for a time or reduce attendance. If that happens, a replacement school will be drawn from the same stratum. Lastly, because the study covers a single sub-county, its findings cannot simply be applied to the rest of Kenya, though they should speak to other ASAL areas with similar conditions.</w:t>
       </w:r>
     </w:p>
     <w:p>
@@ -4069,7 +4097,7 @@
           <w:sz w:val="24"/>
           <w:szCs w:val="24"/>
         </w:rPr>
-        <w:t xml:space="preserve">The study will be confined to public primary schools in Habaswein Sub-County, Wajir County. Private primary schools, pre-primary centres and junior schools will be excluded because their staffing, resourcing and management differ in ways that would complicate comparison. The respondents will be limited to TSC-employed and Board of Management teachers who teach in Grades 1 to 6, head teachers of the sampled schools and Curriculum Support Officers serving the sub-county. In terms of content, the study will focus on four dimensions: teachers’ knowledge and understanding of CBC, their pedagogical competence, the factors that affect their competence, and the relationship between competence and effective implementation. Other factors, such as parental involvement and learner characteristics, will be acknowledged but not examined in depth.</w:t>
+        <w:t xml:space="preserve">The study is limited to public primary schools in Habaswein Sub-County, Wajir County. Private primary schools, pre-primary centres and junior schools are left out because they are staffed, funded and managed differently, which would make comparison difficult. Respondents will be TSC and Board of Management teachers who teach Grades 1 to 6, the head teachers of the sampled schools and the Curriculum Support Officers who serve the sub-county. The study focuses on four areas: teachers’ knowledge and understanding of the CBC, their pedagogical competence, the factors that affect their competence, and the link between competence and effective implementation. Other influences, such as parental involvement and learner characteristics, are recognised but will not be examined in depth.</w:t>
       </w:r>
     </w:p>
     <w:p>
@@ -4265,7 +4293,7 @@
           <w:sz w:val="24"/>
           <w:szCs w:val="24"/>
         </w:rPr>
-        <w:t xml:space="preserve"> The curriculum introduced in Kenya from 2017 that focuses on developing learners’ core competencies, values and practical skills through learner-centred teaching and continuous assessment. In this study, the term also covers the current reference to Competency-Based Education (CBE).</w:t>
+        <w:t xml:space="preserve"> The curriculum introduced in Kenya from 2017, which aims to develop learners’ core competencies, values and practical skills through learner-centred teaching and continuous assessment. In this study, the term also covers the current reference to Competency-Based Education (CBE).</w:t>
       </w:r>
     </w:p>
     <w:p>
@@ -4289,7 +4317,7 @@
           <w:sz w:val="24"/>
           <w:szCs w:val="24"/>
         </w:rPr>
-        <w:t xml:space="preserve"> The combination of knowledge, pedagogical skills, assessment skills and attitudes that enable a teacher to plan, deliver and assess CBC lessons as intended. In this study it will be measured through teachers’ knowledge of CBC, their pedagogical competence and their assessment practice.</w:t>
+        <w:t xml:space="preserve"> The mix of knowledge, teaching skills, assessment skills and attitudes that allows a teacher to plan, teach and assess CBC lessons as intended. It will be measured through teachers’ knowledge of the CBC, their pedagogical competence and their assessment practice.</w:t>
       </w:r>
     </w:p>
     <w:p>
@@ -4313,7 +4341,7 @@
           <w:sz w:val="24"/>
           <w:szCs w:val="24"/>
         </w:rPr>
-        <w:t xml:space="preserve"> The extent to which a teacher can correctly explain the goals, core competencies, values, pertinent and contemporary issues, learning areas and assessment requirements of the CBC.</w:t>
+        <w:t xml:space="preserve"> How well a teacher can explain the goals, core competencies, values, pertinent and contemporary issues, learning areas and assessment requirements of the CBC.</w:t>
       </w:r>
     </w:p>
     <w:p>
@@ -4337,7 +4365,7 @@
           <w:sz w:val="24"/>
           <w:szCs w:val="24"/>
         </w:rPr>
-        <w:t xml:space="preserve"> A teacher’s ability to plan and deliver lessons using learner-centred methods, integrate core competencies and values, manage learner activities, and use locally available resources effectively.</w:t>
+        <w:t xml:space="preserve"> A teacher’s ability to plan and deliver lessons using learner-centred methods, build core competencies and values into lessons, manage learner activities and make good use of locally available resources.</w:t>
       </w:r>
     </w:p>
     <w:p>
@@ -4361,7 +4389,7 @@
           <w:sz w:val="24"/>
           <w:szCs w:val="24"/>
         </w:rPr>
-        <w:t xml:space="preserve"> The degree to which classroom practice reflects the intentions of the CBC, measured by learner engagement, integration of core competencies, use of competency-based assessment, lesson planning in the prescribed format and timely coverage of learning areas.</w:t>
+        <w:t xml:space="preserve"> The extent to which classroom practice matches what the CBC intends, as shown by learner engagement, the integration of core competencies, the use of competency-based assessment, lesson planning in the prescribed format and timely coverage of learning areas.</w:t>
       </w:r>
     </w:p>
     <w:p>
@@ -4385,7 +4413,7 @@
           <w:sz w:val="24"/>
           <w:szCs w:val="24"/>
         </w:rPr>
-        <w:t xml:space="preserve"> School-based, teacher-based and contextual conditions, such as training, workload, resources, supervision and the physical environment, that enhance or limit a teacher’s ability to implement the CBC.</w:t>
+        <w:t xml:space="preserve"> Conditions in the school, in the teacher and in the wider setting, such as training, workload, resources, supervision and the physical environment, that help or hinder a teacher in implementing the CBC.</w:t>
       </w:r>
     </w:p>
     <w:p>
@@ -4409,7 +4437,7 @@
           <w:sz w:val="24"/>
           <w:szCs w:val="24"/>
         </w:rPr>
-        <w:t xml:space="preserve"> A region that experiences low access to social services, poor infrastructure and limited economic opportunity, as is the case in many ASAL counties including Wajir.</w:t>
+        <w:t xml:space="preserve"> An area with poor access to social services, weak infrastructure and limited economic opportunity, as is the case in many ASAL counties, Wajir included.</w:t>
       </w:r>
     </w:p>
     <w:p>
@@ -4434,7 +4462,7 @@
           <w:sz w:val="24"/>
           <w:szCs w:val="24"/>
         </w:rPr>
-        <w:t xml:space="preserve">This proposal is organised into three chapters. Chapter One presents the background to the study, the statement of the problem, the purpose, objectives, research questions and hypotheses, justification, significance, limitations, delimitations, assumptions and operational definitions of key terms. Chapter Two reviews the theories that underpin the study, examines empirical literature related to each objective, presents the conceptual framework and identifies the research gaps. Chapter Three describes the research methodology, including the research design, location, target population, sampling procedures, research instruments, piloting, data collection and analysis procedures, and ethical considerations. The references and appendices follow.</w:t>
+        <w:t xml:space="preserve">The proposal has three chapters. Chapter One introduces the study. It sets out the background, the problem, the purpose, the objectives, research questions and hypotheses, and then explains why the study matters, where its boundaries lie and what it assumes, before defining key terms. Chapter Two reviews the theories behind the study and the empirical literature related to each objective, and closes with the conceptual framework and the gaps the study will address. Chapter Three explains how the study will be done, covering the design, location, population, sampling, instruments, piloting, data collection and analysis, and ethical safeguards. References and appendices come at the end.</w:t>
       </w:r>
     </w:p>
     <w:p>
@@ -4475,7 +4503,7 @@
           <w:sz w:val="24"/>
           <w:szCs w:val="24"/>
         </w:rPr>
-        <w:t xml:space="preserve">This chapter reviews the literature that informs the study. It begins with the theories that explain how teachers take up and implement curriculum innovations and what constitutes teacher competence. It then describes the nature of the Competency-Based Curriculum in Kenya before reviewing empirical studies under each of the four study objectives. The chapter closes with a critique of the existing literature, the conceptual framework that links the study variables, and a summary of the research gaps the study intends to fill.</w:t>
+        <w:t xml:space="preserve">This chapter looks at what other scholars have said about teacher competence and curriculum reform. It opens with three theories that help explain how teachers take up a new curriculum and what it means to be a competent teacher. A short description of Kenya’s Competency-Based Curriculum follows. The chapter then reviews empirical studies under each of the four objectives, offers a critique of that body of work, presents the conceptual framework and ends by setting out the gaps this study hopes to fill.</w:t>
       </w:r>
     </w:p>
     <w:p>
@@ -4500,7 +4528,7 @@
           <w:sz w:val="24"/>
           <w:szCs w:val="24"/>
         </w:rPr>
-        <w:t xml:space="preserve">Three theories provide the lens for this study. The Concerns-Based Adoption Model explains how teachers move through stages of concern and levels of use when a new curriculum is introduced. The Teacher Professional Competence Model explains what teacher competence consists of and how it translates into classroom performance. Finally, the Technological Pedagogical Content Knowledge framework explains the integrated knowledge that teachers need to teach specific content well, including through the use of technology, which is one of the core competencies in the CBC.</w:t>
+        <w:t xml:space="preserve">The study draws on three theories. The Concerns-Based Adoption Model describes how teachers’ worries and practices change as they get used to an innovation. The Teacher Professional Competence Model explains what competence is made of and how it turns into classroom performance. The Technological Pedagogical Content Knowledge framework describes the combined knowledge teachers need in order to teach particular content well with the tools at hand, a point that matters because digital literacy is one of the CBC’s core competencies.</w:t>
       </w:r>
     </w:p>
     <w:p>
@@ -4525,7 +4553,7 @@
           <w:sz w:val="24"/>
           <w:szCs w:val="24"/>
         </w:rPr>
-        <w:t xml:space="preserve">The Concerns-Based Adoption Model (CBAM) was developed by Gene Hall and his colleagues at the University of Texas in the 1970s as a way of understanding how individuals, especially teachers, experience and adopt educational innovations. The model rests on the idea that change is a process rather than an event, and that it is carried out by individuals before it becomes an institutional reality. It has three diagnostic dimensions: stages of concern, levels of use and innovation configurations (Okeyo &amp; Mokua, 2023).</w:t>
+        <w:t xml:space="preserve">The Concerns-Based Adoption Model (CBAM) grew out of work by Gene Hall and his colleagues at the University of Texas in the 1970s. They wanted to understand how people, teachers in particular, experience and adopt new ideas in education. Their starting point was simple but important: change is a process, not an event, and it happens first in individuals before it becomes part of an institution. The model looks at change through three lenses, namely stages of concern, levels of use and innovation configurations (Okeyo &amp; Mokua, 2023).</w:t>
       </w:r>
     </w:p>
     <w:p>
@@ -4539,7 +4567,7 @@
           <w:sz w:val="24"/>
           <w:szCs w:val="24"/>
         </w:rPr>
-        <w:t xml:space="preserve">The stages of concern describe how a teacher’s feelings and worries about an innovation evolve. At the earliest stages, teachers are mainly concerned with getting information about the innovation and understanding how it will affect them personally. As they begin using it, their concerns shift to management issues such as time, materials and organisation. At the more advanced stages, their concerns focus on the consequences of the innovation for learners, on collaboration with colleagues and on refining the innovation to make it work better. The levels of use describe what teachers actually do with the innovation, ranging from non-use, through mechanical and routine use, to refinement and renewal. Innovation configurations, on the other hand, describe the different forms an innovation takes when it is adapted in practice by different teachers (Okeyo &amp; Mokua, 2023).</w:t>
+        <w:t xml:space="preserve">Stages of concern trace how a teacher’s feelings about an innovation shift over time. Early on, teachers mostly want information. They want to know what the innovation is and how it will affect them. Once they start using it, their worries turn to practical matters such as time, materials and organisation. Later still, they begin to think about its effect on learners, about working with colleagues and about how to make it work better. Levels of use describe what teachers actually do, moving from non-use, through mechanical and routine use, to refinement and renewal. Innovation configurations capture the fact that different teachers often end up using the same innovation in quite different ways (Okeyo &amp; Mokua, 2023).</w:t>
       </w:r>
     </w:p>
     <w:p>
@@ -4553,7 +4581,7 @@
           <w:sz w:val="24"/>
           <w:szCs w:val="24"/>
         </w:rPr>
-        <w:t xml:space="preserve">CBAM has been widely applied in African curriculum reform studies. In Kenya, Okeyo and Mokua (2023) used it to examine teachers’ preparedness for CBC in Nyamira South and found that most teachers were still at early stages of concern, anxious about what the curriculum required of them. The model is relevant to the present study because it offers a way of interpreting teachers’ knowledge and practice as points on a developmental path. A teacher who has only superficial knowledge of CBC is likely to be at an informational or personal stage of concern and a mechanical level of use, while a highly competent teacher is likely to be concerned with learner outcomes and to refine the curriculum creatively. The model also highlights that teachers’ concerns must be addressed through appropriate support, which links directly to the third objective on factors affecting competence.</w:t>
+        <w:t xml:space="preserve">The model has been used widely in studies of curriculum reform in Africa. In Kenya, Okeyo and Mokua (2023) applied it to teachers’ preparedness for the CBC in Nyamira South and found that most teachers were ill-prepared for the new curriculum. For this study, CBAM offers a helpful way of reading teachers’ knowledge and practice as points along a path of growth. A teacher with only a surface understanding of the CBC is likely to be stuck at an early, self-focused stage and to use the curriculum mechanically. A highly competent teacher, by contrast, is more likely to be thinking about learners’ progress and adapting the curriculum with some creativity. The model also reminds us that teachers’ concerns need the right kind of support, which ties in with the third objective on factors affecting competence.</w:t>
       </w:r>
     </w:p>
     <w:p>
@@ -4567,7 +4595,7 @@
           <w:sz w:val="24"/>
           <w:szCs w:val="24"/>
         </w:rPr>
-        <w:t xml:space="preserve">The main criticism of CBAM is that it focuses on the individual teacher and pays relatively little attention to structural conditions such as funding, class size, infrastructure and policy coherence, which may block implementation regardless of the teacher’s stage of concern. It has also been criticised for suggesting a neat, linear progression, whereas teachers may move back and forth between stages when conditions change. For these reasons, the present study complements CBAM with a model of teacher competence and pays explicit attention to contextual factors in Habaswein.</w:t>
+        <w:t xml:space="preserve">CBAM is not without its critics. It concentrates on the individual teacher and says relatively little about structural barriers such as funding, class size, infrastructure and inconsistent policy, any of which can stall implementation no matter how willing a teacher is. It has also been faulted for implying a tidy, one-way progression, when in reality teachers can slip back to earlier concerns as conditions change. For these reasons, the study pairs CBAM with a model of teacher competence and pays close attention to the particular conditions in Habaswein.</w:t>
       </w:r>
     </w:p>
     <w:p>
@@ -4592,7 +4620,7 @@
           <w:sz w:val="24"/>
           <w:szCs w:val="24"/>
         </w:rPr>
-        <w:t xml:space="preserve">The second theory is the Teacher Professional Competence Model, which has its roots in the work of German and international researchers, notably Sigrid Blömeke and colleagues, who proposed that competence should be understood as a continuum. According to this model, teachers’ dispositions, which include professional knowledge as well as beliefs, motivation and self-regulation, feed into situation-specific skills: the ability to perceive what is happening in a classroom, interpret it and decide how to respond. These skills, in turn, produce observable performance in the classroom (Jentsch &amp; König, 2022).</w:t>
+        <w:t xml:space="preserve">The second theory is the Teacher Professional Competence Model. It draws on the work of German and international researchers, Sigrid Blömeke and her colleagues among them, who argued that competence is best seen as a continuum. At one end are a teacher’s dispositions: professional knowledge, but also beliefs, motivation and self-regulation. These feed into situation-specific skills, meaning the ability to notice what is happening in a lesson, make sense of it and decide what to do next. Those skills, in turn, show up as observable performance in the classroom (Jentsch &amp; König, 2022).</w:t>
       </w:r>
     </w:p>
     <w:p>
@@ -4606,7 +4634,7 @@
           <w:sz w:val="24"/>
           <w:szCs w:val="24"/>
         </w:rPr>
-        <w:t xml:space="preserve">Jentsch and König (2022) explain that the cognitive part of competence includes content knowledge, pedagogical content knowledge and general pedagogical knowledge, while the affective-motivational part includes teachers’ beliefs about teaching and learning, their enthusiasm and their self-efficacy. They show, drawing on international large-scale studies, that both parts matter for the quality of instruction and for learner achievement, and that both can be developed through initial teacher education and continuous professional development. An important implication of the model is that knowledge on its own does not guarantee good teaching. A teacher may know the principles of the CBC but still fail to apply them if they lack confidence, hold negative beliefs about the curriculum or cannot read and respond to classroom situations.</w:t>
+        <w:t xml:space="preserve">Jentsch and König (2022) divide competence into two broad parts. The cognitive part covers content knowledge, pedagogical content knowledge and general pedagogical knowledge. The affective-motivational part covers teachers’ beliefs about teaching and learning, their enthusiasm and their confidence in their own ability. Evidence from large international studies suggests that both parts affect the quality of teaching and what learners achieve, and that both can be developed during initial training and through ongoing professional learning. The lesson for this study is that knowledge alone is not enough. A teacher may know the principles of the CBC perfectly well and still struggle to apply them if confidence is low, if they doubt the curriculum’s value or if they find it hard to read and respond to what is happening in class.</w:t>
       </w:r>
     </w:p>
     <w:p>
@@ -4620,7 +4648,7 @@
           <w:sz w:val="24"/>
           <w:szCs w:val="24"/>
         </w:rPr>
-        <w:t xml:space="preserve">This model is useful for the present study for three reasons. First, it offers a clear structure for the independent variable, allowing teachers’ competence to be broken down into knowledge and understanding of CBC (dispositions) and pedagogical competence (situation-specific skills and performance). Second, it explains why training attendance alone is a weak indicator of competence, which is a key criticism of earlier CBC studies. Third, it suggests that competence can be observed in practice, which justifies the use of classroom observation alongside questionnaires. The model’s limitation is that it was developed largely in well-resourced systems and may underestimate the extent to which contextual constraints in marginalised areas limit what competent teachers can do. The study addresses this by examining contextual factors under the third objective.</w:t>
+        <w:t xml:space="preserve">The model is useful here in three ways. It gives a clear structure to the independent variable, allowing competence to be split into knowledge and understanding of the CBC on the one hand and pedagogical competence on the other. It also explains why simply counting how many teachers attended training says little about competence, a weakness in much of the earlier CBC research. And because it treats competence as something that becomes visible in practice, it supports the decision to observe lessons as well as to use questionnaires. Its main weakness is that it was developed mostly in well-resourced school systems. It may therefore underplay how much hard conditions in marginalised areas can limit even very capable teachers, which is why the study examines contextual factors under the third objective.</w:t>
       </w:r>
     </w:p>
     <w:p>
@@ -4645,7 +4673,7 @@
           <w:sz w:val="24"/>
           <w:szCs w:val="24"/>
         </w:rPr>
-        <w:t xml:space="preserve">The third lens is the Technological Pedagogical Content Knowledge (TPACK) framework, first proposed by Punya Mishra and Matthew Koehler in the mid-2000s as an extension of the notion of pedagogical content knowledge. The framework holds that effective teaching requires an integration of three kinds of knowledge: content knowledge (what to teach), pedagogical knowledge (how to teach) and technological knowledge (the tools that can support teaching). The areas where these types of knowledge overlap, such as pedagogical content knowledge and technological pedagogical knowledge, represent the specialised knowledge that distinguishes an expert teacher from a subject specialist or a technology enthusiast (Mishra et al., 2023).</w:t>
+        <w:t xml:space="preserve">The third lens is the Technological Pedagogical Content Knowledge (TPACK) framework, proposed by Punya Mishra and Matthew Koehler in the mid-2000s as an extension of the idea of pedagogical content knowledge. It holds that good teaching draws on three kinds of knowledge at once: knowledge of content (what to teach), knowledge of pedagogy (how to teach it) and knowledge of technology (the tools that can support learning). Where these overlap, for instance in pedagogical content knowledge or technological pedagogical knowledge, we find the specialised understanding that sets an expert teacher apart from someone who simply knows a subject or enjoys using gadgets (Mishra et al., 2023).</w:t>
       </w:r>
     </w:p>
     <w:p>
@@ -4659,7 +4687,7 @@
           <w:sz w:val="24"/>
           <w:szCs w:val="24"/>
         </w:rPr>
-        <w:t xml:space="preserve">Mishra et al. (2023) revisited the framework in light of new technologies and argued that teachers must also consider contextual knowledge, which they describe as the knowledge of the circumstances, constraints and opportunities in which teaching takes place. This addition is highly relevant to Habaswein, where the availability of electricity, devices and internet connectivity cannot be taken for granted. Digital literacy is one of the core competencies in the CBC, and teachers are expected to integrate it across learning areas. Murithi and Yoo (2021) found that many Kenyan primary teachers lacked the capacity to integrate technology meaningfully into CBC lessons, having received only basic computer literacy training. TPACK therefore helps the study to examine whether teachers can combine content, pedagogy and available technology, including low-cost resources, in ways that promote the intended competencies. Its main limitation is that its knowledge domains overlap and can be difficult to measure separately; the study will therefore use it as an interpretive framework rather than as a measurement model.</w:t>
+        <w:t xml:space="preserve">In revisiting the framework, Mishra et al. (2023) stress that teachers also need contextual knowledge, an understanding of the circumstances, limits and opportunities of the setting in which they teach. That point carries real weight in Habaswein, where electricity, devices and internet access cannot be taken for granted. Digital literacy is one of the CBC’s core competencies, and teachers are expected to build it into every learning area. Yet Murithi and Yoo (2021) found that many Kenyan primary teachers had received only basic computer training and lacked the capacity to use technology meaningfully in CBC lessons. TPACK therefore helps the study to ask whether teachers can bring together content, pedagogy and whatever technology is available, including low-cost alternatives, to develop the intended competencies. Because its knowledge areas overlap and are hard to measure one by one, the study will use TPACK to interpret findings rather than as a measurement tool.</w:t>
       </w:r>
     </w:p>
     <w:p>
@@ -4684,7 +4712,7 @@
           <w:sz w:val="24"/>
           <w:szCs w:val="24"/>
         </w:rPr>
-        <w:t xml:space="preserve">Kenya’s move to a competency-based curriculum was informed by concerns that the 8-4-4 system had become too examination-oriented and was not producing graduates with the practical skills and values needed in a changing economy (Akala, 2021). The Basic Education Curriculum Framework introduced a vision of nurturing every learner’s potential, and set out seven core competencies, a set of national values and a range of pertinent and contemporary issues (PCIs), such as health, environmental awareness, citizenship and life skills, to be integrated across learning areas. Learners are expected to take part in activities that help them to discover, create and apply knowledge, while teachers act as facilitators rather than the sole source of information (Thukia, 2025).</w:t>
+        <w:t xml:space="preserve">Kenya turned to a competency-based curriculum partly because the 8-4-4 system had become heavily focused on examinations and was not producing school leavers with the practical skills and values a changing economy needs (Akala, 2021). The Basic Education Curriculum Framework set out a vision of nurturing every learner’s potential. It named seven core competencies and a set of national values, and it listed pertinent and contemporary issues (PCIs), such as health, the environment, citizenship and life skills, to be woven across learning areas. Learners are meant to discover, create and apply knowledge through activities, while teachers guide the process rather than serving as the only source of information (Thukia, 2025).</w:t>
       </w:r>
     </w:p>
     <w:p>
@@ -4698,7 +4726,7 @@
           <w:sz w:val="24"/>
           <w:szCs w:val="24"/>
         </w:rPr>
-        <w:t xml:space="preserve">Thukia (2025) analysed the reform using Basil Bernstein’s ideas about curriculum and pedagogy and argued that the CBC represents a shift from a strongly framed, teacher-controlled model to a more weakly framed model in which learners have greater control over the pace and sequence of learning. The author notes, however, that such a shift places heavy demands on teachers, who must be confident enough to relinquish some control while still guiding learning purposefully. Where teachers lack this confidence or the necessary skills, the result can be a hybrid in which new terminology is adopted but old routines persist.</w:t>
+        <w:t xml:space="preserve">Thukia (2025) reads the reform through Basil Bernstein’s ideas on curriculum and pedagogy. In this reading, the CBC moves away from a tightly controlled, teacher-led model towards one in which learners have more say over the pace and order of their learning. The shift is demanding. Teachers must be secure enough to let go of some control while still steering learning with purpose. Where that confidence or skill is missing, schools may end up with a hybrid: new terminology on the surface, old routines underneath.</w:t>
       </w:r>
     </w:p>
     <w:p>
@@ -4712,7 +4740,7 @@
           <w:sz w:val="24"/>
           <w:szCs w:val="24"/>
         </w:rPr>
-        <w:t xml:space="preserve">Assessment is a central pillar of the reform. The KNEC (2021) framework requires teachers to carry out school-based assessment using a variety of tools and to record learner progress against four levels of achievement: exceeding expectations, meeting expectations, approaching expectations and below expectations. The PWPER (2023) acknowledged that the implementation of the curriculum had been hampered by inadequate teacher preparation, an overloaded timetable and insufficient resources, and recommended that the number of learning areas be reduced and that teacher capacity building be intensified. These recommendations confirm that teacher competence is widely recognised as a decisive factor in the success of the reform. They also show that the curriculum is still evolving, which means teachers must continually update their knowledge.</w:t>
+        <w:t xml:space="preserve">Assessment is one of the pillars of the reform. Under the KNEC (2021) framework, teachers carry out school-based assessment with a variety of tools and record learners’ progress at four levels: exceeding expectations, meeting expectations, approaching expectations and below expectations. The PWPER (2023) acknowledged that inadequate teacher preparation, an overloaded timetable and a shortage of resources had held implementation back. It recommended fewer learning areas and a stronger push on teacher capacity building. These recommendations make clear that teacher competence is widely seen as decisive for the reform. They also show that the curriculum is still changing, so teachers will need to keep updating what they know.</w:t>
       </w:r>
     </w:p>
     <w:p>
@@ -4737,7 +4765,7 @@
           <w:sz w:val="24"/>
           <w:szCs w:val="24"/>
         </w:rPr>
-        <w:t xml:space="preserve">This section reviews empirical studies related to each of the four objectives of the study. Studies from other countries are reviewed first where relevant, followed by studies from Kenya, so that the reader can see how the issues play out at different levels.</w:t>
+        <w:t xml:space="preserve">This section reviews empirical studies under each of the four objectives. Where relevant, evidence from other countries comes first and Kenyan studies follow, so that the issues can be seen at both regional and national level.</w:t>
       </w:r>
     </w:p>
     <w:p>
@@ -4762,7 +4790,7 @@
           <w:sz w:val="24"/>
           <w:szCs w:val="24"/>
         </w:rPr>
-        <w:t xml:space="preserve">A teacher who does not understand what a curriculum is trying to achieve can hardly implement it well. International evidence consistently shows that teachers’ understanding of competence-based reforms is often partial. In their scoping review of competence-based curriculum implementation in seven African countries, Wawire et al. (2026) found that many teachers equated the new curriculum with a set of new activities or a new lesson plan template, without grasping the deeper shift from content coverage to competence development. In Tanzania, Kasuga and Kalolo (2025) reported that teachers in Njombe Region expressed uncertainty about what exactly counted as a competence and how it should be assessed, which led them to fall back on traditional practices. Similar observations were made in Uganda, where Kidega et al. (2024) found that teachers in Gulu City struggled to interpret the new curriculum’s generic skills and project-based learning requirements.</w:t>
+        <w:t xml:space="preserve">It is hard to implement a curriculum well without understanding what it is trying to do. Across Africa, teachers’ understanding of competence-based reforms appears to be uneven. In their review of studies from seven countries, Wawire et al. (2026) found a clear gap between policy and practice: the reforms call for a shift from covering content to developing competences, yet much classroom practice still reflects the older approach. Kasuga and Kalolo (2025) point to inadequate training and support as a central problem in Tanzania, noting that many teachers had not been properly prepared for the new way of working. In Uganda, Kidega et al. (2024) likewise traced many of the difficulties teachers faced in Gulu City back to insufficient training on the new curriculum.</w:t>
       </w:r>
     </w:p>
     <w:p>
@@ -4776,7 +4804,7 @@
           <w:sz w:val="24"/>
           <w:szCs w:val="24"/>
         </w:rPr>
-        <w:t xml:space="preserve">In Kenya, early studies set the tone. Mwang’ombe (2021) examined teachers’ understanding and skills in relation to CBC and concluded that their understanding was often vague and uneven. In practice, such vagueness can mean that a teacher is able to name the core competencies without being sure how to develop them in a particular lesson. Isaboke et al. (2021), working in public pre-primary schools in Nairobi City County, found that 65.9% of teachers had not received any training on CBC. The authors linked this gap in training, together with inadequate facilities and large classes, to weak implementation. The study used a population of 450 pre-primary teachers, 225 ECD centre managers and 225 head teachers, and its findings are striking because Nairobi is among the best-resourced counties in the country.</w:t>
+        <w:t xml:space="preserve">Kenyan evidence points the same way. Mwang’ombe (2021) looked at teachers’ understanding and skills in relation to the CBC and found that understanding was often vague and uneven. In practice, this kind of vagueness can mean a teacher is able to list the core competencies but is unsure how to develop them in a particular lesson. Working in public pre-primary schools in Nairobi City County, Isaboke et al. (2021) found that 65.9% of teachers had received no CBC training at all. The authors linked this lack of training, along with poor facilities and large classes, to weak implementation. Their study targeted 450 pre-primary teachers, 225 ECD centre managers and 225 head teachers, and the findings are all the more striking because Nairobi is one of the best-resourced counties in Kenya.</w:t>
       </w:r>
     </w:p>
     <w:p>
@@ -4790,7 +4818,7 @@
           <w:sz w:val="24"/>
           <w:szCs w:val="24"/>
         </w:rPr>
-        <w:t xml:space="preserve">Later studies have produced mixed results. Mutua and Waweru (2023), studying public primary schools in Machakos County, reported that yearly in-service training for teachers was considered adequate. However, they found that constraints such as a shortage of learning materials and a high pupil-teacher ratio limited the translation of knowledge into practice. Karua et al. (2025) examined teachers’ awareness of the tenets of CBC in Kinangop Sub-County and found that while most teachers had heard of the core competencies and values, a majority (52.3%) were not competent in preparing schemes of work in line with the curriculum. This suggests that knowledge in the sense of awareness may coexist with poor procedural knowledge.</w:t>
+        <w:t xml:space="preserve">More recent studies give a mixed picture. In Machakos County, Mutua and Waweru (2023) found that yearly in-service training was considered adequate, yet shortages of learning materials and a high pupil-teacher ratio still got in the way. Karua et al. (2025) examined teachers’ awareness of the tenets of the CBC in Kinangop Sub-County and found that a majority (52.3%) were not competent in preparing schemes of work in line with the curriculum. Being aware of a curriculum, it seems, is not the same as knowing how to plan for it.</w:t>
       </w:r>
     </w:p>
     <w:p>
@@ -4804,7 +4832,7 @@
           <w:sz w:val="24"/>
           <w:szCs w:val="24"/>
         </w:rPr>
-        <w:t xml:space="preserve">Mwangi et al. (2026) offered another useful perspective. Although 95% of the teachers in their study had been trained, 65% held negative perceptions of the curriculum. Their findings suggest that training programmes may have focused on transmitting information rather than building deep understanding and ownership. This aligns with the view of Jentsch and König (2022) that teacher competence involves beliefs and motivation, and not just information. In junior secondary schools in Bomet County, Keter and Wabuke (2025) found that teachers’ preparedness, including their understanding of the curriculum, was significantly associated with the level of implementation, and that gaps in preparation continued to limit the quality of implementation.</w:t>
+        <w:t xml:space="preserve">Mwangi et al. (2026) add a further twist. Although 95% of the teachers in their study had been trained, 65% held negative views of the curriculum. This suggests that training may have passed on information without building real understanding or a sense of ownership, which fits the argument of Jentsch and König (2022) that competence involves beliefs and motivation as well as knowledge. In junior secondary schools in Bomet County, Keter and Wabuke (2025) found that teacher preparedness was significantly associated with the level of implementation, and that gaps in preparation continued to hold back the quality of that implementation.</w:t>
       </w:r>
     </w:p>
     <w:p>
@@ -4818,7 +4846,7 @@
           <w:sz w:val="24"/>
           <w:szCs w:val="24"/>
         </w:rPr>
-        <w:t xml:space="preserve">Few studies have assessed teachers’ knowledge in the ASAL counties. Hussein (2023) reported that teachers in northern Kenya had limited exposure to CBC training and lacked a clear grasp of competency-based grading, while Ongubo (2025) found that over 60% of public primary teachers in Township Ward, Garissa, had not received comprehensive in-service training. Neither study, however, assessed teachers’ knowledge in a systematic way using a knowledge scale or linked it statistically to implementation outcomes. The present study will address this gap in Habaswein.</w:t>
+        <w:t xml:space="preserve">Very little of this research has been done in the ASAL counties. Hussein (2023) reported that teachers in northern Kenya had little exposure to CBC training and that poor infrastructure and scarce resources made proper grading difficult. Ongubo (2025) found that more than 60% of public primary teachers in Township Ward, Garissa, had not received comprehensive in-service training. Neither study, however, measured teachers’ knowledge systematically or linked it statistically to implementation. The present study will do both in Habaswein.</w:t>
       </w:r>
     </w:p>
     <w:p>
@@ -4843,7 +4871,7 @@
           <w:sz w:val="24"/>
           <w:szCs w:val="24"/>
         </w:rPr>
-        <w:t xml:space="preserve">Pedagogical competence refers to what teachers do in the classroom: how they plan, how they organise learning activities, how they engage learners and how they use resources. The CBC expects teachers to use learner-centred approaches such as inquiry, cooperative learning, role play, projects, field visits and problem solving, and to integrate values and PCIs into lessons. Wawire et al. (2026) observed that across African countries implementing competence-based curricula, lessons were still frequently dominated by teacher explanations, choral responses and note-taking, with limited opportunities for learners to collaborate, investigate or create. They attributed this to large classes, a shortage of materials and gaps in teacher preparation, but also to entrenched habits formed under earlier examination-oriented systems.</w:t>
+        <w:t xml:space="preserve">Pedagogical competence is about what teachers actually do in class: how they plan, how they organise activities, how they draw learners in and how they use the resources available. The CBC asks teachers to use learner-centred approaches such as inquiry, cooperative learning, role play, projects, field visits and problem solving, and to build values and PCIs into their lessons. Wawire et al. (2026) found that across African countries using competence-based curricula, classroom practice remained largely teacher-centred. Learners had few chances to work together, investigate or create. The reasons are partly practical, such as large classes, a lack of materials and weak preparation, and partly a matter of habits formed over many years of examination-driven teaching.</w:t>
       </w:r>
     </w:p>
     <w:p>
@@ -4857,7 +4885,7 @@
           <w:sz w:val="24"/>
           <w:szCs w:val="24"/>
         </w:rPr>
-        <w:t xml:space="preserve">In Kenya, the classroom-based study by APHRC (2022) provides one of the most detailed pictures of pedagogical practice under CBC. The study evaluated the quality of CBC implementation by examining lessons in schools and sought to identify the features of effective lessons, such as clear learning outcomes, active learner engagement and deliberate integration of core competencies. Its evidence suggests that effective CBC lessons are possible within Kenyan public schools, but that their quality varies considerably, with many lessons only partly reflecting the curriculum’s expectations. Mohamed et al. (2022), studying geography teachers in Kirinyaga County, found that teachers’ pedagogical preparedness was low, with many teachers having limited experience with learner-centred methods and inadequate exposure to CBC-oriented training.</w:t>
+        <w:t xml:space="preserve">In Kenya, the APHRC (2022) evaluation offers one of the closest looks at CBC teaching in practice. It examined lessons in schools and tried to identify what an effective CBC lesson looks like, with features such as clear learning outcomes, active learner involvement and deliberate attention to core competencies. The evidence shows that such lessons are possible in Kenyan public schools, but their quality varies a great deal, and many lessons meet the curriculum’s expectations only in part. In Kirinyaga County, Mohamed et al. (2022) found that geography teachers’ pedagogical preparedness for the CBC was low.</w:t>
       </w:r>
     </w:p>
     <w:p>
@@ -4871,7 +4899,7 @@
           <w:sz w:val="24"/>
           <w:szCs w:val="24"/>
         </w:rPr>
-        <w:t xml:space="preserve">Alwang’a and Were (2026) examined the status of teachers’ pedagogical knowledge and its link with CBC implementation in public primary schools in Sabatia Sub-County, Vihiga County. Their study linked the state of teachers’ pedagogical knowledge to the manner in which the curriculum was being implemented, underlining pedagogical knowledge as a key ingredient of effective CBC delivery. Karua et al. (2025) found that teachers in Kinangop had a low capacity to select appropriate teaching and learning approaches for CBC classes, while Mutai et al. (2024) reported, from a survey of 605 respondents in Moiben Sub-County, that teacher preparedness in terms of pedagogical skills had a significant influence on CBC implementation.</w:t>
+        <w:t xml:space="preserve">In Sabatia Sub-County, Vihiga County, Alwang’a and Were (2026) looked at the state of teachers’ pedagogical knowledge and its connection to CBC implementation in public primary schools. Their work ties the quality of implementation to the strength of teachers’ pedagogical knowledge and marks it out as a key ingredient of effective delivery. Karua et al. (2025) found that teachers in Kinangop had limited capacity to choose suitable teaching and learning approaches for CBC classes. Mutai et al. (2024), surveying 605 respondents in Moiben Sub-County, reported that teacher preparedness had a significant influence on how the CBC was implemented.</w:t>
       </w:r>
     </w:p>
     <w:p>
@@ -4885,7 +4913,7 @@
           <w:sz w:val="24"/>
           <w:szCs w:val="24"/>
         </w:rPr>
-        <w:t xml:space="preserve">Assessment is an integral part of pedagogy under CBC. Macheso, Kati, and Wafula (2024) found that teachers in western Kenya used written tests and oral questions far more often than portfolios, projects and anecdotal records, even though the KNEC (2021) framework expects a wide range of tools. In a related study of Grade 6 science and technology teachers in Bungoma, Busia and Trans-Nzoia, Macheso, Wafula, and Kati (2024) found that teachers’ self-efficacy was associated with the extent to which they implemented competency-based assessment. In other words, teachers who felt confident about assessment tended to implement competency-based assessment more fully. These findings are important because they show that pedagogical competence is shaped not only by skill but also by teachers’ belief in their own ability, which is consistent with the Teacher Professional Competence Model.</w:t>
+        <w:t xml:space="preserve">Assessment is part and parcel of teaching under the CBC. Macheso, Kati, and Wafula (2024) found that teachers in western Kenya relied on written tests far more than on portfolios, projects and anecdotal records, even though the KNEC (2021) framework calls for a wide range of tools. In a companion study of Grade 6 science and technology teachers in Bungoma, Busia and Trans-Nzoia, Macheso, Wafula, and Kati (2024) found that teachers’ self-efficacy was linked to how far they implemented competency-based assessment. Put plainly, teachers who felt confident about assessment tended to carry it out more fully. This matters because it shows that pedagogical competence depends not only on skill but also on teachers’ belief in their own ability, just as the Teacher Professional Competence Model would predict.</w:t>
       </w:r>
     </w:p>
     <w:p>
@@ -4899,7 +4927,7 @@
           <w:sz w:val="24"/>
           <w:szCs w:val="24"/>
         </w:rPr>
-        <w:t xml:space="preserve">Digital pedagogy is another dimension. Murithi and Yoo (2021) surveyed 351 teachers and found that although teachers viewed ICT as necessary for CBC, most had received only basic computer literacy training and struggled to integrate technology into lessons. In a place like Habaswein, where connectivity and electricity are limited, the challenge is likely to be even greater. It remains unclear how teachers in such settings interpret and implement the digital literacy competency, and whether they use alternative low-cost approaches.</w:t>
+        <w:t xml:space="preserve">Digital teaching is a further dimension. Murithi and Yoo (2021) surveyed 351 teachers. Most saw ICT as necessary for the CBC, but they had received only basic computer training and found it hard to use technology in their lessons. In Habaswein, where power and connectivity are limited, the challenge is probably greater still. We know little about how teachers in such places understand and teach the digital literacy competency, or whether they turn to low-cost alternatives.</w:t>
       </w:r>
     </w:p>
     <w:p>
@@ -4924,7 +4952,7 @@
           <w:sz w:val="24"/>
           <w:szCs w:val="24"/>
         </w:rPr>
-        <w:t xml:space="preserve">The literature identifies several groups of factors that shape teachers’ competence. These can be grouped into training and professional development, instructional resources and infrastructure, workload and staffing, supervision and support, attitudes and beliefs, and contextual conditions.</w:t>
+        <w:t xml:space="preserve">The literature points to several sets of factors that shape teachers’ competence. They can be grouped under training and professional development, resources and infrastructure, workload and staffing, supervision and support, attitudes and beliefs, and the wider context.</w:t>
       </w:r>
     </w:p>
     <w:p>
@@ -4938,7 +4966,7 @@
           <w:sz w:val="24"/>
           <w:szCs w:val="24"/>
         </w:rPr>
-        <w:t xml:space="preserve">The first and most frequently cited factor is training. UNESCO and the International Task Force on Teachers for Education 2030 (2024) argue that professional development must be continuous, practice-based and responsive to teachers’ needs if it is to improve teaching. In Kenya, however, the initial CBC training was widely described as brief and rushed. Okeyo and Mokua (2023) concluded that training should not be hurriedly done as a public relations exercise, after finding that most teachers in Nyamira South were ill-prepared. Ongubo (2025) reported that in Garissa, the reach of in-service training was limited, and that teachers who missed the initial cascade sessions had few opportunities to catch up. Mogere (2022), in a study of public primary schools in Nairobi County, likewise identified teacher training as an important determinant of how well the CBC was being implemented.</w:t>
+        <w:t xml:space="preserve">Training is the factor mentioned most often. UNESCO and the International Task Force on Teachers for Education 2030 (2024) argue that professional development only improves teaching when it is continuous, grounded in practice and responsive to what teachers need. In Kenya, by contrast, early CBC training was widely described as short and rushed. Having found most teachers in Nyamira South ill-prepared, Okeyo and Mokua (2023) warned that training should not be carried out hurriedly as a public relations exercise. Ongubo (2025) found that the reach of in-service training in Township Ward, Garissa, was limited. In Nairobi County, Mogere (2022) likewise identified teacher training as an important determinant of how well the CBC was being implemented.</w:t>
       </w:r>
     </w:p>
     <w:p>
@@ -4952,7 +4980,7 @@
           <w:sz w:val="24"/>
           <w:szCs w:val="24"/>
         </w:rPr>
-        <w:t xml:space="preserve">The second group of factors relates to instructional resources and infrastructure. Cheruiyot (2024) identified a shortage of learning materials, inadequate classrooms and limited technological infrastructure as major challenges in junior schools, alongside resistance to change among teachers, parents and learners. Hussein (2023) found that poor infrastructure and a lack of learning resources undermined proper assessment in northern Kenya. Mutua and Waweru (2023) similarly reported that inadequate teaching and learning materials hindered implementation in Machakos. When resources are scarce, even competent teachers may be unable to use the methods they know to be effective.</w:t>
+        <w:t xml:space="preserve">Resources and infrastructure form the second set. Cheruiyot (2024) identified shortages of learning materials, inadequate classrooms and weak technological infrastructure as major problems in junior schools, together with resistance to change among teachers, parents and learners. In northern Kenya, Hussein (2023) found that poor infrastructure and a lack of learning resources made proper assessment difficult. Mutua and Waweru (2023) reported that a shortage of teaching and learning materials held back implementation in Machakos. When resources are this thin, even skilled teachers may be unable to use the methods they know would work best.</w:t>
       </w:r>
     </w:p>
     <w:p>
@@ -4966,7 +4994,7 @@
           <w:sz w:val="24"/>
           <w:szCs w:val="24"/>
         </w:rPr>
-        <w:t xml:space="preserve">Third, workload and staffing affect how much time and energy teachers can devote to planning, assessment and reflection. The CBC requires detailed lesson planning and continuous assessment records for every learner, which can be overwhelming in large classes. Isaboke et al. (2021) listed large class sizes and understaffing among the major barriers in Nairobi, while Mutua and Waweru (2023) highlighted the high pupil-teacher ratio. In ASAL counties, the shortage of teachers is more acute. The County Government of Wajir (2023) acknowledges that teacher shortages, compounded by the transfer of non-local teachers due to insecurity, remain a serious challenge in the county’s schools. In such conditions, schools often depend on Board of Management teachers who may not have received any formal CBC training.</w:t>
+        <w:t xml:space="preserve">Workload and staffing come next, because they decide how much time and energy teachers have for planning, assessment and reflection. The CBC calls for detailed lesson plans and continuous assessment records for every learner, which can quickly become overwhelming in a large class. Isaboke et al. (2021) listed large classes and understaffing among the main barriers in Nairobi, and Mutua and Waweru (2023) drew attention to the high pupil-teacher ratio. The shortage of teachers is sharper still in ASAL counties. The County Government of Wajir (2023) recognises it as a serious and continuing problem. In practice, many schools lean on Board of Management teachers, some of whom may never have received formal CBC training.</w:t>
       </w:r>
     </w:p>
     <w:p>
@@ -4980,7 +5008,7 @@
           <w:sz w:val="24"/>
           <w:szCs w:val="24"/>
         </w:rPr>
-        <w:t xml:space="preserve">Fourth, supervision and support from head teachers and Curriculum Support Officers influence the development of teacher competence. Awiti (2023), in a study of primary schools in Nairobi City, examined a range of school-level factors affecting CBC implementation and pointed to the importance of the support that teachers receive within their schools. In principle, head teachers who regularly observe lessons, review schemes of work and organise peer learning sessions create the conditions in which teachers can grow in confidence. Keter and Wabuke (2025) likewise emphasised the role of continuous support in strengthening teacher preparedness.</w:t>
+        <w:t xml:space="preserve">Supervision and support make up a fourth set. Awiti (2023), studying primary schools in Nairobi City, examined a range of school-level factors affecting CBC implementation and underlined the importance of the support teachers receive within their schools. It is reasonable to expect that where head teachers observe lessons regularly, review schemes of work and organise peer learning, teachers will grow in confidence. Keter and Wabuke (2025) also stress the value of continuous support in strengthening teacher preparedness.</w:t>
       </w:r>
     </w:p>
     <w:p>
@@ -4994,7 +5022,7 @@
           <w:sz w:val="24"/>
           <w:szCs w:val="24"/>
         </w:rPr>
-        <w:t xml:space="preserve">Fifth, attitudes and beliefs matter. Mwangi et al. (2026) found that a majority of teachers held negative perceptions of CBC despite being trained, while Cheruiyot (2024) identified resistance to change among teachers as a barrier. The Teacher Professional Competence Model predicts that such beliefs will affect how teachers perceive classroom situations and how they respond to them. Teachers who doubt the value of learner-centred methods may revert to lecturing, especially when under pressure to cover the syllabus.</w:t>
+        <w:t xml:space="preserve">Attitudes and beliefs are a fifth. Mwangi et al. (2026) found that most teachers held negative views of the CBC despite having been trained, and Cheruiyot (2024) identified resistance to change among teachers as a barrier. The Teacher Professional Competence Model suggests that such beliefs colour how teachers read classroom situations and how they respond. A teacher who doubts the value of learner-centred methods may slip back into lecturing, especially when there is pressure to finish the syllabus.</w:t>
       </w:r>
     </w:p>
     <w:p>
@@ -5008,7 +5036,7 @@
           <w:sz w:val="24"/>
           <w:szCs w:val="24"/>
         </w:rPr>
-        <w:t xml:space="preserve">Finally, contextual conditions in marginalised areas deserve attention. Barasa et al. (2025) showed in Uganda that schools serving low-income communities struggled more with competence-based reform than schools serving wealthier families, and warned that without deliberate support the reform could entrench inequality. Kasuga and Kalolo (2025) made a similar point about rural schools in Tanzania. In northern Kenya, drought, pastoralist mobility, long distances and insecurity disrupt both learner attendance and teachers’ access to training (County Government of Wajir, 2023; Hussein, 2023). These conditions may lower teacher morale and increase turnover, weakening the continuity required for competence to develop. Very few studies have explored how these contextual factors interact with teacher competence in the Kenyan CBC context, and this study will seek to do so.</w:t>
+        <w:t xml:space="preserve">The last set concerns the wider context, which is especially important in marginalised areas. Barasa et al. (2025) showed that in Uganda, schools serving low-income communities found the competence-based reform harder to implement than schools serving wealthier families, and they warned that without deliberate support the reform could lock in inequality. Kasuga and Kalolo (2025) made a similar point about rural schools in Tanzania. In northern Kenya, drought, pastoralist movement, long distances and insecurity disrupt both learners’ attendance and teachers’ access to training (County Government of Wajir, 2023; Hussein, 2023). Such conditions can wear down morale and push up staff turnover, breaking the continuity that competence needs in order to grow. Few studies have looked at how these conditions interact with teacher competence under the CBC in Kenya, and this study aims to do so.</w:t>
       </w:r>
     </w:p>
     <w:p>
@@ -5033,7 +5061,7 @@
           <w:sz w:val="24"/>
           <w:szCs w:val="24"/>
         </w:rPr>
-        <w:t xml:space="preserve">The final objective focuses on the relationship between teachers’ competence and the effectiveness of CBC implementation. Several Kenyan studies have explored related relationships, though often using preparedness rather than competence as the independent variable. Mutai et al. (2024) found a significant positive relationship between teacher preparedness and CBC implementation in Moiben Sub-County. Keter and Wabuke (2025) reported that teacher preparedness significantly influenced the implementation of the curriculum in public junior secondary schools in Bomet County. Mutua and Waweru (2023) examined teachers’ competence in terms of values, attitudes, knowledge and skills alongside the extent of CBC implementation in Machakos County, and concluded that implementation depended both on teachers and on the conditions under which they worked, such as the supply of materials and the pupil-teacher ratio.</w:t>
+        <w:t xml:space="preserve">The fourth objective concerns the link between teachers’ competence and how effectively the CBC is implemented. A number of Kenyan studies have explored related links, though most used preparedness rather than competence as the explanatory variable. Mutai et al. (2024) found a significant positive relationship between teacher preparedness and CBC implementation in Moiben Sub-County. Keter and Wabuke (2025) reported that teacher preparedness significantly influenced implementation in public junior secondary schools in Bomet County. Mutua and Waweru (2023) examined teachers’ competence, in terms of values, attitudes, knowledge and skills, alongside the extent of CBC implementation in Machakos County. They concluded that implementation depended both on the teachers and on the conditions in which they worked, such as the supply of materials and the pupil-teacher ratio.</w:t>
       </w:r>
     </w:p>
     <w:p>
@@ -5047,7 +5075,7 @@
           <w:sz w:val="24"/>
           <w:szCs w:val="24"/>
         </w:rPr>
-        <w:t xml:space="preserve">Alwang’a and Were (2026) went further by focusing on pedagogical knowledge as a specific dimension of competence. Their work suggests that the status of teachers’ pedagogical knowledge has a direct bearing on the implementation of the CBC in Sabatia, which strengthens the case for targeted professional development in learner-centred strategies. Macheso, Wafula, and Kati (2024) found that teacher efficacy was linked to the implementation of competency-based assessment. The APHRC (2022) evaluation likewise suggests that the quality of CBC lessons depends heavily on what teachers bring to the classroom, including their planning and their understanding of the intended competencies.</w:t>
+        <w:t xml:space="preserve">Alwang’a and Were (2026) narrowed the focus to pedagogical knowledge as one specific dimension of competence. Their work suggests that the state of teachers’ pedagogical knowledge has a direct bearing on how the CBC is implemented in Sabatia, which strengthens the case for targeted professional development in learner-centred methods. Macheso, Wafula, and Kati (2024) found that teacher efficacy was linked to the implementation of competency-based assessment. The APHRC (2022) evaluation also suggests that the quality of CBC lessons depends heavily on what teachers bring into the classroom, including how they plan and how well they understand the intended competencies.</w:t>
       </w:r>
     </w:p>
     <w:p>
@@ -5061,7 +5089,7 @@
           <w:sz w:val="24"/>
           <w:szCs w:val="24"/>
         </w:rPr>
-        <w:t xml:space="preserve">Outside Kenya, Wawire et al. (2026) concluded that competence-based reforms in Africa were more likely to succeed where teachers had sustained professional support, adequate resources and a clear understanding of the reform’s goals. Kidega et al. (2024) similarly recommended sustained training and school-level support for teachers in Uganda, noting that the challenges teachers faced were closely tied to gaps in their preparation for the new curriculum. Jentsch and König (2022), drawing on international studies, provide the theoretical rationale for these findings: teacher competence influences the quality of instruction, which in turn influences learner outcomes.</w:t>
+        <w:t xml:space="preserve">Beyond Kenya, the review by Wawire et al. (2026) shows that the gap between competence-based policy and classroom practice is closely bound up with teacher preparation and the resources available to schools. In Uganda, Kidega et al. (2024) recommended sustained training and support for teachers, noting that many of the challenges they faced came from gaps in their preparation for the new curriculum. Jentsch and König (2022) supply the theoretical thread that ties these findings together: teacher competence affects the quality of teaching, and the quality of teaching affects what learners gain.</w:t>
       </w:r>
     </w:p>
     <w:p>
@@ -5075,7 +5103,7 @@
           <w:sz w:val="24"/>
           <w:szCs w:val="24"/>
         </w:rPr>
-        <w:t xml:space="preserve">Despite this growing evidence, three weaknesses remain. First, most of the studies measured competence or preparedness through self-report questionnaires alone, which may inflate estimates of competence. Second, few studies distinguished between different dimensions of competence and tested their separate contributions to implementation. Third, almost none of these studies were conducted in the ASAL counties of North Eastern Kenya. The present study will address these weaknesses by combining questionnaires with classroom observation and interviews, by testing the separate and combined contributions of knowledge and pedagogical competence, and by focusing on Habaswein Sub-County.</w:t>
+        <w:t xml:space="preserve">Useful as this evidence is, it has three weaknesses. Most studies measured competence or preparedness through self-report questionnaires alone, which may paint too rosy a picture. Few separated the different dimensions of competence or tested what each contributes to implementation. And almost none were carried out in the ASAL counties of North Eastern Kenya. This study responds by combining questionnaires with classroom observation and interviews, by testing the separate and combined effects of knowledge and pedagogical competence, and by focusing on Habaswein Sub-County.</w:t>
       </w:r>
     </w:p>
     <w:p>
@@ -5100,7 +5128,7 @@
           <w:sz w:val="24"/>
           <w:szCs w:val="24"/>
         </w:rPr>
-        <w:t xml:space="preserve">The literature reviewed shows broad agreement that teacher competence is central to the success of the CBC, and that many Kenyan teachers have not yet acquired the full range of competences required. Nonetheless, several weaknesses can be identified. To begin with, there is a strong geographical bias. Studies have been concentrated in Nairobi, central Kenya, the Rift Valley and western Kenya (Isaboke et al., 2021; Karua et al., 2025; Mohamed et al., 2022; Mutai et al., 2024). The few studies conducted in northern Kenya, such as Hussein (2023) and Ongubo (2025), were largely descriptive and did not test relationships between competence and implementation.</w:t>
+        <w:t xml:space="preserve">Taken together, the literature agrees that teacher competence is central to the success of the CBC and that many Kenyan teachers have yet to acquire the full set of competences the curriculum requires. The body of work does, however, have its weak spots. The most obvious is geographical. Most studies have been carried out in Nairobi, central Kenya, the Rift Valley and western Kenya (Isaboke et al., 2021; Karua et al., 2025; Mohamed et al., 2022; Mutai et al., 2024). The handful of studies from northern Kenya, such as Hussein (2023) and Ongubo (2025), were mainly descriptive and did not test how competence relates to implementation.</w:t>
       </w:r>
     </w:p>
     <w:p>
@@ -5114,7 +5142,7 @@
           <w:sz w:val="24"/>
           <w:szCs w:val="24"/>
         </w:rPr>
-        <w:t xml:space="preserve">In addition, there is a conceptual inconsistency in the literature. Terms such as preparedness, readiness, competence and capacity are often used interchangeably, and many studies measured preparedness mainly by asking whether teachers had attended training. Mwangi et al. (2026) demonstrate that training attendance is a poor proxy for competence, since trained teachers may still lack understanding or hold negative attitudes. The present study adopts a clearer conception of competence based on the Teacher Professional Competence Model (Jentsch &amp; König, 2022), distinguishing knowledge from pedagogical competence.</w:t>
+        <w:t xml:space="preserve">There is also some confusion over concepts. Preparedness, readiness, competence and capacity are often used as if they meant the same thing, and many studies gauged preparedness mainly by asking whether teachers had attended training. The work of Mwangi et al. (2026) shows how weak that measure is, since trained teachers may still lack understanding or hold negative views of the curriculum. This study uses a clearer definition of competence, drawn from the Teacher Professional Competence Model (Jentsch &amp; König, 2022), which separates knowledge from pedagogical competence.</w:t>
       </w:r>
     </w:p>
     <w:p>
@@ -5128,7 +5156,7 @@
           <w:sz w:val="24"/>
           <w:szCs w:val="24"/>
         </w:rPr>
-        <w:t xml:space="preserve">There is also a methodological weakness. Many studies relied solely on questionnaires, which are prone to social desirability bias. Only a few, such as APHRC (2022) and Okeyo and Mokua (2023), used observation schedules or document analysis to verify teachers’ reported practice. Furthermore, some studies used small samples or purposive sampling that limit generalisation. For instance, Mohamed et al. (2022) drew their conclusions from only 40 respondents. The present study will use stratified random sampling, an adequate sample size and triangulation of data sources to strengthen the credibility of its findings.</w:t>
+        <w:t xml:space="preserve">Method is a third concern. Many studies relied on questionnaires alone, which invite respondents to present themselves in a good light. Only a few, among them APHRC (2022) and Okeyo and Mokua (2023), used observation or document analysis to check what teachers said against what they did. Some studies also worked with small or purposively chosen samples, which limits how far their findings can be generalised. Mohamed et al. (2022), for example, drew their sample from a target population of just 24 schools. This study will use stratified random sampling, an adequate sample and several sources of data to make its findings more credible.</w:t>
       </w:r>
     </w:p>
     <w:p>
@@ -5142,7 +5170,7 @@
           <w:sz w:val="24"/>
           <w:szCs w:val="24"/>
         </w:rPr>
-        <w:t xml:space="preserve">Finally, the literature has tended to treat contextual factors as background rather than as variables that interact with teacher competence. Barasa et al. (2025) and Kasuga and Kalolo (2025) show that context shapes how competence-based reforms unfold, yet Kenyan studies have rarely explored how factors such as drought, insecurity and pastoralist mobility affect teachers’ professional growth. The present study will examine these factors explicitly.</w:t>
+        <w:t xml:space="preserve">Lastly, context has usually been treated as background rather than as something that interacts with teacher competence. Barasa et al. (2025) and Kasuga and Kalolo (2025) show that context shapes how competence-based reforms play out, yet Kenyan studies have seldom asked how drought, insecurity and pastoralist movement affect teachers’ professional growth. This study will look at these factors directly.</w:t>
       </w:r>
     </w:p>
     <w:p>
@@ -5167,7 +5195,7 @@
           <w:sz w:val="24"/>
           <w:szCs w:val="24"/>
         </w:rPr>
-        <w:t xml:space="preserve">The conceptual framework presents the hypothesised relationship between the independent, intervening and dependent variables of the study, as shown in Figure 2.1.</w:t>
+        <w:t xml:space="preserve">Figure 2.1 shows the relationship the study expects to find between the independent, intervening and dependent variables.</w:t>
       </w:r>
     </w:p>
     <w:p>
@@ -5261,7 +5289,7 @@
           <w:sz w:val="24"/>
           <w:szCs w:val="24"/>
         </w:rPr>
-        <w:t xml:space="preserve">The independent variable is teachers’ competence, which is broken down into two dimensions. The first is knowledge and understanding of the CBC, reflected in teachers’ grasp of the curriculum’s goals, core competencies, values, PCIs, learning areas and assessment requirements. The second is pedagogical competence, reflected in teachers’ ability to prepare schemes of work and lesson plans in the required format, use learner-centred methods, integrate core competencies and values, use and improvise resources, and carry out competency-based assessment.</w:t>
+        <w:t xml:space="preserve">The independent variable is teachers’ competence, which has two dimensions. The first is knowledge and understanding of the CBC: how well teachers grasp the curriculum’s goals, core competencies, values, PCIs, learning areas and assessment requirements. The second is pedagogical competence: teachers’ ability to prepare schemes of work and lesson plans in the required format, teach through learner-centred methods, build core competencies and values into lessons, use and improvise resources and carry out competency-based assessment.</w:t>
       </w:r>
     </w:p>
     <w:p>
@@ -5275,7 +5303,7 @@
           <w:sz w:val="24"/>
           <w:szCs w:val="24"/>
         </w:rPr>
-        <w:t xml:space="preserve">The dependent variable is the effective implementation of the CBC. It will be measured by indicators that reflect the intentions of the curriculum: active learner participation, the integration of core competencies and PCIs in lessons, the use of varied assessment tools and proper learner records, coverage of learning areas as scheduled, and the involvement of parents in learning activities.</w:t>
+        <w:t xml:space="preserve">The dependent variable is the effective implementation of the CBC. It will be measured through indicators that reflect what the curriculum sets out to achieve: active learner participation, the integration of core competencies and PCIs in lessons, the use of varied assessment tools and proper learner records, coverage of learning areas on schedule and parents’ involvement in learning.</w:t>
       </w:r>
     </w:p>
     <w:p>
@@ -5289,7 +5317,7 @@
           <w:sz w:val="24"/>
           <w:szCs w:val="24"/>
         </w:rPr>
-        <w:t xml:space="preserve">The factors affecting teachers’ competence are treated as intervening variables. They include the adequacy of CBC training and continuous professional development, the availability of instructional resources and ICT infrastructure, teacher workload and class size, supervision and support from head teachers and Curriculum Support Officers, teachers’ attitudes towards the CBC, and contextual conditions such as drought, insecurity and pastoralist mobility. These factors may strengthen or weaken the relationship between competence and implementation. For example, a knowledgeable teacher may still be unable to use group work effectively in a class of 90 learners without desks. Government policy, including the reforms recommended by the PWPER (2023), is recognised as a broader influence but will not be measured directly.</w:t>
+        <w:t xml:space="preserve">The factors affecting teachers’ competence are treated as intervening variables. They include how adequate CBC training and continuous professional development have been, the availability of teaching resources and ICT, teachers’ workload and class size, supervision and support from head teachers and Curriculum Support Officers, teachers’ attitudes towards the CBC and local conditions such as drought, insecurity and pastoralist movement. These factors can strengthen or weaken the link between competence and implementation. A knowledgeable teacher, for instance, may still find group work almost impossible with 90 learners and no desks. Government policy, including the reforms recommended by the PWPER (2023), is acknowledged as a wider influence but will not be measured directly.</w:t>
       </w:r>
     </w:p>
     <w:p>
@@ -5314,7 +5342,7 @@
           <w:sz w:val="24"/>
           <w:szCs w:val="24"/>
         </w:rPr>
-        <w:t xml:space="preserve">The literature shows that the CBC places high demands on teachers, requiring a solid understanding of the curriculum, learner-centred pedagogy and competency-based assessment. The three theories reviewed help to explain these demands. CBAM shows that teachers adopt innovations gradually and need support tailored to their concerns; the Teacher Professional Competence Model shows that competence combines knowledge, beliefs and situation-specific skills; and TPACK highlights the integrated knowledge needed to teach content effectively with available tools in a specific context. Empirical studies in Kenya and elsewhere in Africa confirm that gaps in teacher competence are widespread and are shaped by training, resources, workload, supervision, attitudes and context. Table 2.1 summarises the key studies and the gaps they leave.</w:t>
+        <w:t xml:space="preserve">The review shows that the CBC asks a great deal of teachers: a solid understanding of the curriculum, skill in learner-centred teaching and the ability to assess competences. Each of the three theories sheds light on a different part of this demand. CBAM shows that teachers take up new ideas gradually and need support that matches their concerns. The Teacher Professional Competence Model shows that competence is a blend of knowledge, beliefs and situation-specific skills. TPACK draws attention to the combined knowledge needed to teach content well with the tools available in a given setting. Studies from Kenya and elsewhere in Africa confirm that gaps in teacher competence are common and that training, resources, workload, supervision, attitudes and context all play a part. Table 2.1 summarises the main studies and the gaps they leave.</w:t>
       </w:r>
     </w:p>
     <w:p>
@@ -6802,7 +6830,7 @@
           <w:sz w:val="24"/>
           <w:szCs w:val="24"/>
         </w:rPr>
-        <w:t xml:space="preserve">In summary, the reviewed literature reveals a contextual gap, since no known study has examined teacher competence and CBC implementation in Habaswein Sub-County or in Wajir County more generally. It also reveals a conceptual gap, because many studies have treated training attendance as a proxy for competence, and a methodological gap, since few studies have triangulated self-reported data with classroom observation or tested the separate contributions of different dimensions of competence. The present study is designed to address these gaps.</w:t>
+        <w:t xml:space="preserve">Three gaps stand out. The first is contextual: no known study has examined teacher competence and CBC implementation in Habaswein Sub-County, or in Wajir County more broadly. The second is conceptual, since many studies have used training attendance as a stand-in for competence. The third is methodological, as few studies have checked self-reported data against classroom observation or tested what each dimension of competence contributes on its own. This study has been designed with all three gaps in mind.</w:t>
       </w:r>
     </w:p>
     <w:p>
@@ -6843,7 +6871,7 @@
           <w:sz w:val="24"/>
           <w:szCs w:val="24"/>
         </w:rPr>
-        <w:t xml:space="preserve">This chapter describes how the study will be carried out. It presents the research design, the location of the study, the target population, the sampling techniques and sample size, the research instruments, the pilot study, the validity and reliability of the instruments, the data collection procedures, the data analysis techniques, the logistical arrangements and the ethical considerations that will guide the study.</w:t>
+        <w:t xml:space="preserve">This chapter explains how the study will be carried out. It covers the research design and the setting, the people who will take part and how they will be chosen, and the instruments that will be used. It also describes how the instruments will be piloted and checked, how data will be gathered and analysed, the practical arrangements for fieldwork and the ethical safeguards that will guide the whole process.</w:t>
       </w:r>
     </w:p>
     <w:p>
@@ -6868,7 +6896,7 @@
           <w:sz w:val="24"/>
           <w:szCs w:val="24"/>
         </w:rPr>
-        <w:t xml:space="preserve">The study will adopt a convergent parallel mixed methods design, combining a descriptive survey with a correlational component. In a convergent design, quantitative and qualitative data are collected during the same phase, analysed separately and then merged during interpretation so that each type of data can confirm, extend or challenge the other (Creswell &amp; Creswell, 2023). The descriptive survey element will allow the researcher to describe the current level of teachers’ knowledge, pedagogical competence and the factors affecting their competence, as they exist, without manipulating any variable. The correlational element will allow the researcher to test the strength and direction of the relationship between teachers’ competence and effective CBC implementation, as stated in the hypotheses.</w:t>
+        <w:t xml:space="preserve">The study will use a convergent parallel mixed methods design that combines a descriptive survey with a correlational component. In this kind of design, quantitative and qualitative data are gathered during the same period and analysed separately. The two sets of results are then brought together at the interpretation stage, so that each can confirm, extend or question the other (Creswell &amp; Creswell, 2023). The descriptive survey will show the current level of teachers’ knowledge and pedagogical competence and the factors that affect them, as they are, without any attempt to manipulate variables. The correlational part will test how strongly, and in which direction, teachers’ competence is related to effective CBC implementation, as set out in the hypotheses.</w:t>
       </w:r>
     </w:p>
     <w:p>
@@ -6882,7 +6910,7 @@
           <w:sz w:val="24"/>
           <w:szCs w:val="24"/>
         </w:rPr>
-        <w:t xml:space="preserve">This design is appropriate for three reasons. First, the study seeks both to describe a situation and to test relationships, which requires quantitative data from a relatively large number of teachers. Second, the concept of competence is complex, and self-reported questionnaire data alone may not capture it accurately; interviews with head teachers and Curriculum Support Officers, together with classroom observations, will provide richer and more credible evidence. Third, the design has been used successfully in similar studies of CBC implementation in Kenya. Okeyo and Mokua (2023), for example, used a convergent mixed methods design to study teacher preparedness in Nyamira South, and Mutua and Waweru (2023) used a descriptive survey to study teacher competence in Machakos. The design does, however, require careful planning to ensure that the two strands of data are properly integrated, and the researcher will address this through a joint display of findings during analysis.</w:t>
+        <w:t xml:space="preserve">The design suits the study for a few reasons. The study needs both to describe a situation and to test relationships, and that calls for quantitative data from a fairly large number of teachers. Competence, however, is a complex idea, and questionnaires alone may not capture it faithfully. Interviews with head teachers and Curriculum Support Officers, together with classroom observation, will add depth and make the evidence more believable. The approach also has a track record in Kenyan research on the CBC. Okeyo and Mokua (2023) used a convergent mixed methods design to study teacher preparedness in Nyamira South, while Mutua and Waweru (2023) used a descriptive survey to study teacher competence in Machakos. The main demand of the design is that the two strands of data must be properly brought together. The researcher will handle this by preparing a joint display of the findings during analysis.</w:t>
       </w:r>
     </w:p>
     <w:p>
@@ -6907,7 +6935,7 @@
           <w:sz w:val="24"/>
           <w:szCs w:val="24"/>
         </w:rPr>
-        <w:t xml:space="preserve">The study will be conducted in Habaswein Sub-County, one of the sub-counties of Wajir County in the North Eastern region of Kenya. The sub-county lies in the southern part of the county, along the main road linking Garissa and Wajir towns, and it borders Garissa County to the south and west. The area is largely arid, with low and erratic rainfall, high temperatures and recurrent droughts. The majority of residents are pastoralists who keep camels, cattle, goats and sheep, and many households move seasonally in search of water and pasture. Habaswein town serves as the administrative and commercial centre of the sub-county, while the rest of the population lives in smaller settlements spread over a vast area (County Government of Wajir, 2023).</w:t>
+        <w:t xml:space="preserve">The study will take place in Habaswein Sub-County, one of the sub-counties of Wajir County in Kenya’s North Eastern region. It lies in the southern part of the county, along the main road between Garissa and Wajir towns, and shares a boundary with Garissa County to the south and west. The land is mostly dry. Rainfall is low and unpredictable, temperatures are high and droughts come round often. Most residents are pastoralists who keep camels, cattle, goats and sheep, and many households move with the seasons in search of water and pasture. Habaswein town is the administrative and trading centre, while the rest of the population lives in small settlements scattered over a very large area (County Government of Wajir, 2023).</w:t>
       </w:r>
     </w:p>
     <w:p>
@@ -6921,7 +6949,7 @@
           <w:sz w:val="24"/>
           <w:szCs w:val="24"/>
         </w:rPr>
-        <w:t xml:space="preserve">Education indicators in Wajir County are among the lowest in Kenya. The County Integrated Development Plan identifies low enrolment and transition rates, a shortage of teachers, inadequate classrooms and sanitation facilities, and the negative effects of drought and insecurity on schooling as key challenges (County Government of Wajir, 2023). Several public primary schools in the sub-county operate low-cost boarding facilities to keep children from mobile households in school. The choice of Habaswein is based on three considerations: it is representative of the marginalised ASAL context in which CBC implementation is thought to be most difficult; no previous study has examined teacher competence and CBC implementation there; and the researcher is familiar with the area, which will ease access and communication with respondents.</w:t>
+        <w:t xml:space="preserve">Wajir County has some of the weakest education indicators in the country. Its County Integrated Development Plan names low enrolment and transition rates, too few teachers, inadequate classrooms and sanitation facilities, and the disruption caused by drought and insecurity as key challenges (County Government of Wajir, 2023). Several public primary schools in the sub-county run low-cost boarding facilities to keep children from mobile households in school. Habaswein was chosen for three reasons. It typifies the marginalised ASAL setting in which the CBC is thought to be hardest to implement. No earlier study has examined teacher competence and CBC implementation there. And the researcher knows the area well, which should make it easier to reach schools and communicate with respondents.</w:t>
       </w:r>
     </w:p>
     <w:p>
@@ -6946,7 +6974,7 @@
           <w:sz w:val="24"/>
           <w:szCs w:val="24"/>
         </w:rPr>
-        <w:t xml:space="preserve">The target population will comprise all public primary schools in Habaswein Sub-County, together with their head teachers and teachers, and the Curriculum Support Officers (CSOs) who serve the sub-county. The unit of analysis will be the school, while the units of observation will be the teachers, head teachers and CSOs. Teachers are included because they are the direct implementers of the CBC. Head teachers are included because they are responsible for instructional leadership, supervision and the allocation of resources at school level. CSOs are included because they provide professional support to teachers and monitor curriculum implementation across schools.</w:t>
+        <w:t xml:space="preserve">The target population is made up of all public primary schools in Habaswein Sub-County, their head teachers and teachers, and the Curriculum Support Officers (CSOs) who serve the sub-county. The school will be the unit of analysis, while teachers, head teachers and CSOs will be the units of observation. Teachers are included because they are the ones who deliver the CBC day to day. Head teachers lead teaching and learning in their schools, supervise staff and decide how resources are used. CSOs support teachers professionally and monitor how the curriculum is being implemented across schools.</w:t>
       </w:r>
     </w:p>
     <w:p>
@@ -6960,7 +6988,7 @@
           <w:sz w:val="24"/>
           <w:szCs w:val="24"/>
         </w:rPr>
-        <w:t xml:space="preserve">According to preliminary information gathered by the researcher, the sub-county has approximately 42 public primary schools with an estimated 336 teachers, including both TSC and Board of Management teachers, and 3 CSOs. These figures are provisional and will be confirmed with the Sub-County Director of Education and the TSC Sub-County Director before data collection begins. The distribution of the target population is shown in Table 3.1.</w:t>
+        <w:t xml:space="preserve">Preliminary information gathered by the researcher suggests that the sub-county has about 42 public primary schools, an estimated 336 teachers (both TSC and Board of Management) and 3 CSOs. These figures are provisional and will be confirmed with the Sub-County Director of Education and the TSC Sub-County Director before data collection starts. Table 3.1 shows how the population is distributed.</w:t>
       </w:r>
     </w:p>
     <w:p>
@@ -7596,7 +7624,7 @@
           <w:sz w:val="24"/>
           <w:szCs w:val="24"/>
         </w:rPr>
-        <w:t xml:space="preserve">In addition to the population in Table 3.1, the 3 Curriculum Support Officers serving Habaswein Sub-County will form part of the target population.</w:t>
+        <w:t xml:space="preserve">The 3 Curriculum Support Officers serving Habaswein Sub-County will also form part of the target population, in addition to the groups shown in Table 3.1.</w:t>
       </w:r>
     </w:p>
     <w:p>
@@ -7632,7 +7660,7 @@
           <w:sz w:val="24"/>
           <w:szCs w:val="24"/>
         </w:rPr>
-        <w:t xml:space="preserve">The study will use a combination of stratified random sampling, simple random sampling, proportionate allocation and census methods. Schools will first be divided into two strata according to their location: schools in Habaswein town and its environs, and schools in rural settlements. Stratification is necessary because schools in and around the town are likely to have better access to transport, electricity, training venues and supervision than rural schools, and these differences may affect teacher competence. Within each stratum, schools will be selected through simple random sampling using a table of random numbers or a computer-generated list, which gives every school an equal chance of selection and reduces selection bias (Creswell &amp; Creswell, 2023).</w:t>
+        <w:t xml:space="preserve">Several sampling methods will be combined: stratified random sampling, simple random sampling, proportionate allocation and a census. Schools will first be split into two strata by location, namely schools in Habaswein town and its surroundings and schools in rural settlements. The split matters because schools in and near the town probably enjoy better transport, electricity, access to training and supervision than those further out, and such differences may shape teachers’ competence. Within each stratum, schools will then be picked by simple random sampling, using a table of random numbers or a computer-generated list. This gives every school the same chance of selection and reduces bias (Creswell &amp; Creswell, 2023).</w:t>
       </w:r>
     </w:p>
     <w:p>
@@ -7646,7 +7674,7 @@
           <w:sz w:val="24"/>
           <w:szCs w:val="24"/>
         </w:rPr>
-        <w:t xml:space="preserve">Half of the schools in each stratum, that is 6 schools from the town stratum and 15 from the rural stratum, will be selected, giving a total of 21 schools. Selecting 50% of schools is considered adequate for a relatively small population of schools and allows the researcher to cover both strata meaningfully within the available time and budget. The head teachers of the 21 sampled schools will be included automatically in the sample, since each school has only one head teacher. All 3 CSOs will be included through census because their number is small and their perspective is important for understanding the support available to teachers.</w:t>
+        <w:t xml:space="preserve">Half of the schools in each stratum will be selected, which means 6 from the town stratum and 15 from the rural stratum, or 21 schools in all. Taking half of a fairly small number of schools gives good coverage of both strata while keeping the work within the time and money available. Because each school has only one head teacher, the head teachers of the 21 sampled schools will automatically form part of the sample. All 3 CSOs will be included through a census, as there are few of them and their view of the support available to teachers is important.</w:t>
       </w:r>
     </w:p>
     <w:p>
@@ -7671,7 +7699,7 @@
           <w:sz w:val="24"/>
           <w:szCs w:val="24"/>
         </w:rPr>
-        <w:t xml:space="preserve">The sample size of teachers will be determined using the following finite population formula, which is commonly applied in educational surveys when the population is known:</w:t>
+        <w:t xml:space="preserve">The number of teachers to be sampled will be worked out with the following formula, which is widely used in educational surveys when the size of the population is known:</w:t>
       </w:r>
     </w:p>
     <w:p>
@@ -7701,7 +7729,7 @@
           <w:sz w:val="24"/>
           <w:szCs w:val="24"/>
         </w:rPr>
-        <w:t xml:space="preserve">Where n is the required sample size, N is the target population of teachers (336) and e is the level of precision, set at 0.05 for a 95% confidence level. Substituting these values gives:</w:t>
+        <w:t xml:space="preserve">Here, n is the required sample size, N is the target population of teachers (336) and e is the level of precision, set at 0.05 for a 95% confidence level. Putting in these values gives:</w:t>
       </w:r>
     </w:p>
     <w:p>
@@ -7731,7 +7759,7 @@
           <w:sz w:val="24"/>
           <w:szCs w:val="24"/>
         </w:rPr>
-        <w:t xml:space="preserve">The sample of 183 teachers will be distributed proportionately between the two strata using the formula: stratum sample = (stratum population / total population) × 183. Within each sampled school, teachers will be listed from the staff register and selected through simple random sampling until the required number for that stratum is reached. Where a sampled school has fewer teachers than required, all its teachers will be included and the balance will be drawn from other sampled schools in the same stratum. The resulting sample distribution is shown in Table 3.2.</w:t>
+        <w:t xml:space="preserve">The 183 teachers will be shared between the two strata in proportion to their size, using the formula: stratum sample = (stratum population / total population) × 183. In each sampled school, teachers will be listed from the staff register and chosen by simple random sampling until the number needed for that stratum is reached. If a school has fewer teachers than required, all of them will be included and the shortfall made up from other sampled schools in the same stratum. Table 3.2 shows the resulting sample.</w:t>
       </w:r>
     </w:p>
     <w:p>
@@ -8641,7 +8669,7 @@
           <w:sz w:val="24"/>
           <w:szCs w:val="24"/>
         </w:rPr>
-        <w:t xml:space="preserve">In addition, 21 CBC lessons, one in each sampled school, will be observed using a classroom observation checklist. The teacher to be observed in each school will be randomly selected from among the sampled teachers who teach Grades 4 to 6, where most of the CBC upper primary learning areas and school-based assessments are concentrated. Participation in the observation will be voluntary.</w:t>
+        <w:t xml:space="preserve">On top of this, the researcher will observe 21 CBC lessons, one in each sampled school, using a classroom observation checklist. In each school, the teacher to be observed will be picked at random from the sampled teachers who handle Grades 4 to 6, where most upper primary learning areas and school-based assessments take place. Taking part in the observation will be voluntary.</w:t>
       </w:r>
     </w:p>
     <w:p>
@@ -8666,7 +8694,7 @@
           <w:sz w:val="24"/>
           <w:szCs w:val="24"/>
         </w:rPr>
-        <w:t xml:space="preserve">Three instruments will be used to collect data: a questionnaire for teachers, an interview guide for head teachers and CSOs, and a classroom observation checklist. Using multiple instruments will allow the researcher to triangulate the data and to strengthen the credibility of the findings.</w:t>
+        <w:t xml:space="preserve">Data will be collected with three instruments: a questionnaire for teachers, an interview guide for head teachers and CSOs, and a classroom observation checklist. Using more than one instrument will make it possible to cross-check the data and will add to the credibility of the findings.</w:t>
       </w:r>
     </w:p>
     <w:p>
@@ -8691,7 +8719,7 @@
           <w:sz w:val="24"/>
           <w:szCs w:val="24"/>
         </w:rPr>
-        <w:t xml:space="preserve">The teachers’ questionnaire (Appendix III) will be the main instrument for collecting quantitative data. It will be divided into six sections. Section A will collect demographic information, including gender, age, academic and professional qualifications, teaching experience, employer (TSC or Board of Management), grades taught and CBC training attended. Section B will measure teachers’ knowledge and understanding of the CBC. Section C will measure pedagogical competence, including planning, learner-centred methods, integration of competencies and assessment. Section D will focus on the factors affecting teachers’ competence. Section E will measure the effectiveness of CBC implementation. Section F will contain open-ended questions that give teachers the opportunity to express their views in their own words.</w:t>
+        <w:t xml:space="preserve">The teachers’ questionnaire (Appendix III) will be the main source of quantitative data. It has six sections. Section A asks about the respondent: gender, age, academic and professional qualifications, teaching experience, employer (TSC or Board of Management), grades taught and any CBC training attended. Section B deals with knowledge and understanding of the CBC, and Section C with pedagogical competence, covering planning, learner-centred methods, the integration of competencies and assessment. Section D looks at the factors that affect teachers’ competence, and Section E at how effectively the CBC is being implemented. Section F offers open-ended questions so that teachers can share their views in their own words.</w:t>
       </w:r>
     </w:p>
     <w:p>
@@ -8705,7 +8733,7 @@
           <w:sz w:val="24"/>
           <w:szCs w:val="24"/>
         </w:rPr>
-        <w:t xml:space="preserve">Sections B to E will use five-point Likert scale items ranging from 1 (Strongly Disagree) to 5 (Strongly Agree). Section B will also include a short set of knowledge items that require teachers to identify correct statements about the CBC, so that the measurement of knowledge does not rely entirely on self-rating. Questionnaires are appropriate for this study because they allow data to be collected from a large number of respondents within a short time, they guarantee anonymity, and the data can be easily coded and analysed statistically (Creswell &amp; Creswell, 2023). The questionnaire will be administered in English, which is the medium of instruction and the official working language of teachers.</w:t>
+        <w:t xml:space="preserve">Sections B to E use five-point Likert items that run from 1 (Strongly Disagree) to 5 (Strongly Agree). Section B also includes a short set of true-or-false knowledge items, so that knowledge is not measured by self-rating alone. A questionnaire makes sense for this study because it can reach many respondents in a short time, it protects their anonymity and it produces data that can be coded and analysed statistically without difficulty (Creswell &amp; Creswell, 2023). It will be given in English, which is both the language of instruction and teachers’ official working language.</w:t>
       </w:r>
     </w:p>
     <w:p>
@@ -8730,7 +8758,7 @@
           <w:sz w:val="24"/>
           <w:szCs w:val="24"/>
         </w:rPr>
-        <w:t xml:space="preserve">Semi-structured interviews will be conducted with the 21 head teachers and 3 CSOs using the interview guide in Appendix IV. The guide will explore their views on teachers’ knowledge and pedagogical practice, the support available to teachers, the challenges faced in implementing the CBC and their suggestions for improvement. Semi-structured interviews allow the researcher to probe for detail and clarification while still keeping the conversation focused on the study objectives. Each interview is expected to last between 30 and 45 minutes. With the permission of the interviewee, interviews will be audio-recorded and later transcribed; where permission is not given, detailed notes will be taken.</w:t>
+        <w:t xml:space="preserve">The 21 head teachers and 3 CSOs will take part in semi-structured interviews based on the guide in Appendix IV. The questions ask about teachers’ knowledge and classroom practice, the support available to them, the difficulties of implementing the CBC and ideas for improvement. A semi-structured format lets the researcher follow up on interesting answers and ask for clarification while keeping the conversation on the study’s objectives. Each interview should take 30 to 45 minutes. With the interviewee’s permission, it will be audio-recorded and transcribed later; where permission is refused, the researcher will take detailed notes instead.</w:t>
       </w:r>
     </w:p>
     <w:p>
@@ -8755,7 +8783,7 @@
           <w:sz w:val="24"/>
           <w:szCs w:val="24"/>
         </w:rPr>
-        <w:t xml:space="preserve">A structured classroom observation checklist (Appendix V) will be used to record what actually happens during CBC lessons. It will capture evidence of lesson planning, the use of learner-centred methods, the integration of core competencies, values and PCIs, the use of teaching and learning resources, learner participation and assessment practices. Each item will be rated on a scale from 1 (Not observed) to 4 (Fully observed), and the observer will also write brief field notes. Observation will help to verify the practices that teachers report in the questionnaire and will provide direct evidence of implementation. To reduce the effect of the observer’s presence, the researcher will spend a few minutes in the class before the lesson begins and will sit at the back of the room without interfering.</w:t>
+        <w:t xml:space="preserve">A structured checklist (Appendix V) will be used to record what actually happens in CBC lessons. It looks for evidence of lesson planning, learner-centred methods, the integration of core competencies, values and PCIs, the use of teaching and learning resources, learner participation and assessment. Each item is rated from 1 (Not observed) to 4 (Fully observed), and the observer will also keep short field notes. Observation offers a check on what teachers say in the questionnaire and gives direct evidence of implementation. To lessen the effect of having a visitor in the room, the researcher will arrive a few minutes before the lesson starts and sit quietly at the back without taking part.</w:t>
       </w:r>
     </w:p>
     <w:p>
@@ -8780,7 +8808,7 @@
           <w:sz w:val="24"/>
           <w:szCs w:val="24"/>
         </w:rPr>
-        <w:t xml:space="preserve">Table 3.3 shows how each variable will be measured and analysed.</w:t>
+        <w:t xml:space="preserve">Table 3.3 sets out how each variable will be measured and analysed.</w:t>
       </w:r>
     </w:p>
     <w:p>
@@ -9741,7 +9769,7 @@
           <w:sz w:val="24"/>
           <w:szCs w:val="24"/>
         </w:rPr>
-        <w:t xml:space="preserve">Before the main study, the instruments will be pre-tested in a pilot study in neighbouring Wajir South Sub-County, which shares similar climatic, social and educational characteristics with Habaswein but will not form part of the main study. Approximately 10% of the sample will be used in the pilot, which translates into 18 teachers, 2 head teachers and 2 classroom observations. The pilot will help the researcher to identify ambiguous, repetitive or sensitive questions, estimate the time required to complete each instrument, check the clarity of instructions and test the data entry and coding procedures. The feedback from the pilot will be used to revise the instruments before the main data collection.</w:t>
+        <w:t xml:space="preserve">The instruments will be tried out first in neighbouring Wajir South Sub-County, which is similar to Habaswein in climate, way of life and schooling but falls outside the main study. The pilot will involve roughly 10% of the sample: 18 teachers, 2 head teachers and 2 classroom observations. It will help the researcher spot questions that are unclear, repeated or sensitive, find out how long each instrument takes, check that the instructions make sense and test the procedures for data entry and coding. The instruments will then be revised in light of what the pilot shows, before the main fieldwork begins.</w:t>
       </w:r>
     </w:p>
     <w:p>
@@ -9766,7 +9794,7 @@
           <w:sz w:val="24"/>
           <w:szCs w:val="24"/>
         </w:rPr>
-        <w:t xml:space="preserve">Validity refers to the extent to which an instrument measures what it is intended to measure. The study will focus on content validity and construct validity. To establish content validity, the instruments will be reviewed by the researcher’s supervisors and two experts in curriculum studies at Mount Kenya University. Each expert will rate the relevance of every item to the study objectives on a four-point scale, and a Content Validity Index (CVI) will be calculated by dividing the number of items rated relevant or highly relevant by the total number of items. An index of 0.78 or above will be considered acceptable, and items falling below this threshold will be revised or removed. Construct validity will be enhanced by basing the questionnaire items on the indicators derived from the theories and literature reviewed in Chapter Two, and by checking during the pilot that items intended to measure the same construct are correlated with one another.</w:t>
+        <w:t xml:space="preserve">Validity is about whether an instrument measures what it is meant to measure. This study is concerned mainly with content validity and construct validity. For content validity, the instruments will be reviewed by the researcher’s supervisors and by two curriculum studies specialists at Mount Kenya University. Each reviewer will rate how relevant every item is to the study objectives on a four-point scale. A Content Validity Index (CVI) will then be worked out by dividing the number of items rated relevant or highly relevant by the total number of items. An index of 0.78 or more will be taken as acceptable, and items that fall below this mark will be reworded or dropped. Construct validity will be supported by drawing questionnaire items from indicators found in the theories and studies reviewed in Chapter Two, and by checking in the pilot that items meant to measure the same idea are correlated.</w:t>
       </w:r>
     </w:p>
     <w:p>
@@ -9791,7 +9819,7 @@
           <w:sz w:val="24"/>
           <w:szCs w:val="24"/>
         </w:rPr>
-        <w:t xml:space="preserve">Reliability refers to the consistency with which an instrument produces the same results under similar conditions. The internal consistency of the Likert-scale sections of the teachers’ questionnaire will be tested using Cronbach’s alpha coefficient, computed from the pilot data. A coefficient of 0.70 or higher will be considered acceptable, as recommended in social science research (Field, 2024). Where a section records a lower coefficient, the item-total statistics will be examined and weak items revised or removed. To improve the reliability of the observation checklist, the researcher and one trained research assistant will observe the same pilot lessons independently, and their ratings will be compared. Differences will be discussed and the descriptors on the checklist clarified until a high level of agreement is achieved.</w:t>
+        <w:t xml:space="preserve">Reliability is about consistency: whether an instrument gives similar results under similar conditions. The internal consistency of the Likert sections of the teachers’ questionnaire will be checked with Cronbach’s alpha, calculated from the pilot data. A coefficient of 0.70 or higher will be regarded as acceptable, in line with common practice in social science research (Field, 2024). If a section falls short, its item-total statistics will be examined and weak items revised or removed. To make the observation checklist more reliable, the researcher and a trained research assistant will observe the same pilot lessons separately and compare their ratings. Where they differ, they will talk through the differences and sharpen the checklist descriptors until they agree closely.</w:t>
       </w:r>
     </w:p>
     <w:p>
@@ -9816,7 +9844,7 @@
           <w:sz w:val="24"/>
           <w:szCs w:val="24"/>
         </w:rPr>
-        <w:t xml:space="preserve">For the qualitative data, the study will observe the criteria of credibility, dependability, confirmability and transferability. Credibility will be enhanced through triangulation of data from teachers, head teachers, CSOs and classroom observations, and through member checking, in which a sample of interviewees will be given summaries of their interviews to confirm that their views have been accurately captured. Dependability will be supported by keeping an audit trail of all decisions made during data collection and analysis. Confirmability will be enhanced by reflexive notes in which the researcher records personal assumptions that might influence interpretation. Transferability will be supported by providing a detailed description of the study context so that readers can judge whether the findings apply to similar settings (Braun &amp; Clarke, 2022).</w:t>
+        <w:t xml:space="preserve">The qualitative data will be judged against four criteria: credibility, dependability, confirmability and transferability. Credibility will come from comparing what teachers, head teachers, CSOs and classroom observations reveal, and from member checking, in which some interviewees will be shown a summary of their interview and asked whether it reflects their views accurately. Dependability will be supported by an audit trail recording the decisions made during data collection and analysis. For confirmability, the researcher will keep reflective notes on personal assumptions that might colour the interpretation. Transferability will be helped by a rich description of the study setting, so that readers can decide for themselves whether the findings apply elsewhere (Braun &amp; Clarke, 2022).</w:t>
       </w:r>
     </w:p>
     <w:p>
@@ -9841,7 +9869,7 @@
           <w:sz w:val="24"/>
           <w:szCs w:val="24"/>
         </w:rPr>
-        <w:t xml:space="preserve">The researcher will first obtain an introduction letter from the School of Education at Mount Kenya University and ethical approval from the University’s Ethics Review Committee. A research permit will then be sought from the National Commission for Science, Technology and Innovation (NACOSTI). Upon receiving the permit, the researcher will report to the Wajir County Commissioner and the County Director of Education to seek authority to conduct research in the county, and then to the Sub-County Director of Education and the TSC Sub-County Director in Habaswein. Head teachers of the sampled schools will be contacted in advance to explain the purpose of the study and to agree on convenient dates for the visits.</w:t>
+        <w:t xml:space="preserve">The first step will be to obtain an introduction letter from the School of Education at Mount Kenya University and ethical approval from the University’s Ethics Review Committee. The researcher will then apply for a research permit from the National Commission for Science, Technology and Innovation (NACOSTI). With the permit in hand, the researcher will report to the Wajir County Commissioner and the County Director of Education for authority to work in the county, and then to the Sub-County Director of Education and the TSC Sub-County Director in Habaswein. Head teachers of the sampled schools will be contacted beforehand to explain the study and to agree on suitable dates for visits.</w:t>
       </w:r>
     </w:p>
     <w:p>
@@ -9855,7 +9883,7 @@
           <w:sz w:val="24"/>
           <w:szCs w:val="24"/>
         </w:rPr>
-        <w:t xml:space="preserve">Two research assistants, who are qualified teachers familiar with the area and fluent in both English and Somali, will be recruited and trained for two days on the study objectives, the instruments, ethical procedures and security precautions. During school visits, the researcher and assistants will introduce themselves to the head teacher, explain the study and seek informed consent from participants. Questionnaires will be administered to the sampled teachers and collected on the same day wherever possible, to maximise the response rate. Where teachers request more time, the questionnaires will be collected within three days. Interviews with head teachers will be held in a private room at the school, while interviews with CSOs will be held at their offices. Classroom observations will be conducted at times agreed with the teachers. Data collection is expected to take about six weeks and will be scheduled during school terms, avoiding examination periods and, as far as possible, the peak of the dry season when some families move away.</w:t>
+        <w:t xml:space="preserve">Two research assistants will be recruited. They will be qualified teachers who know the area and speak both English and Somali, and they will receive two days of training on the study objectives, the instruments, ethical procedures and personal safety. At each school, the team will first meet the head teacher, explain the study and seek informed consent from participants. Questionnaires will be handed to the sampled teachers and, wherever possible, collected the same day to keep the response rate high. Teachers who ask for more time will have up to three days. Head teachers will be interviewed in a private room at the school and CSOs at their offices. Lesson observations will take place at times agreed with the teachers. Fieldwork should take about six weeks. It will be timed to fall within the school term, away from examination periods and, as far as possible, away from the height of the dry season, when some families move away with their animals.</w:t>
       </w:r>
     </w:p>
     <w:p>
@@ -9891,7 +9919,7 @@
           <w:sz w:val="24"/>
           <w:szCs w:val="24"/>
         </w:rPr>
-        <w:t xml:space="preserve">After data collection, the questionnaires and observation checklists will be checked for completeness and consistency, coded and entered into the Statistical Package for the Social Sciences (SPSS), version 29. Data cleaning will involve checking for missing values, outliers and entry errors. Descriptive statistics, including frequencies, percentages, means and standard deviations, will be used to describe the demographic characteristics of respondents and to answer the first three research questions. Mean scores on the Likert items will be interpreted as follows: 1.00 to 1.80 very low, 1.81 to 2.60 low, 2.61 to 3.40 moderate, 3.41 to 4.20 high and 4.21 to 5.00 very high.</w:t>
+        <w:t xml:space="preserve">Once fieldwork is over, the completed questionnaires and observation checklists will be checked for completeness and consistency, coded and entered into the Statistical Package for the Social Sciences (SPSS), version 29. The data will then be cleaned by looking for missing values, outliers and entry errors. Frequencies, percentages, means and standard deviations will be used to describe the respondents and to answer the first three research questions. Mean scores on the Likert items will be read as follows: 1.00 to 1.80 very low, 1.81 to 2.60 low, 2.61 to 3.40 moderate, 3.41 to 4.20 high and 4.21 to 5.00 very high.</w:t>
       </w:r>
     </w:p>
     <w:p>
@@ -9905,7 +9933,7 @@
           <w:sz w:val="24"/>
           <w:szCs w:val="24"/>
         </w:rPr>
-        <w:t xml:space="preserve">To test the hypotheses under the fourth objective, inferential statistics will be used. Pearson’s product-moment correlation coefficient will be used to determine the strength and direction of the relationship between each dimension of teachers’ competence and effective CBC implementation (H01 and H02). Multiple linear regression analysis will then be used to establish the combined and separate influence of the dimensions of competence on effective implementation (H03). The regression model will take the following form:</w:t>
+        <w:t xml:space="preserve">The hypotheses under the fourth objective will be tested with inferential statistics. Pearson’s product-moment correlation will show how strong the relationship is, and in which direction, between each dimension of teachers’ competence and effective CBC implementation (H01 and H02). Multiple linear regression will then show the combined and separate influence of the two dimensions of competence on effective implementation (H03). The regression model is:</w:t>
       </w:r>
     </w:p>
     <w:p>
@@ -9935,7 +9963,7 @@
           <w:sz w:val="24"/>
           <w:szCs w:val="24"/>
         </w:rPr>
-        <w:t xml:space="preserve">Where Y represents effective CBC implementation, β₀ is the constant, β₁ and β₂ are the regression coefficients, X₁ is teachers’ knowledge and understanding of the CBC, X₂ is teachers’ pedagogical competence and ε is the error term. Composite scores for each variable will be computed as the mean of the relevant items. Before running the regression, the researcher will check the assumptions of normality, linearity, homoscedasticity, independence of errors and absence of multicollinearity, using histograms, scatter plots, the Durbin-Watson statistic and variance inflation factors (Field, 2024). The coefficient of determination (R²) will show the proportion of variation in implementation explained by teachers’ competence, while the F-test will indicate the overall significance of the model. Hypotheses will be tested at the 0.05 level of significance. The results will be presented in tables, bar charts and pie charts, accompanied by interpretation and discussion.</w:t>
+        <w:t xml:space="preserve">In this model, Y is effective CBC implementation, β₀ is the constant, β₁ and β₂ are the regression coefficients, X₁ is teachers’ knowledge and understanding of the CBC, X₂ is teachers’ pedagogical competence and ε is the error term. Each variable’s composite score will be the mean of its items. Before running the regression, the researcher will check that its assumptions hold, namely normality, linearity, homoscedasticity, independence of errors and the absence of multicollinearity, using histograms, scatter plots, the Durbin-Watson statistic and variance inflation factors (Field, 2024). The coefficient of determination (R²) will show how much of the variation in implementation is explained by teachers’ competence, and the F-test will show whether the model as a whole is significant. All hypotheses will be tested at the 0.05 level of significance. Results will be presented in tables, bar charts and pie charts, each followed by interpretation and discussion.</w:t>
       </w:r>
     </w:p>
     <w:p>
@@ -9960,7 +9988,7 @@
           <w:sz w:val="24"/>
           <w:szCs w:val="24"/>
         </w:rPr>
-        <w:t xml:space="preserve">The qualitative data from interviews, open-ended questionnaire items and observation field notes will be analysed using reflexive thematic analysis, following the six phases described by Braun and Clarke (2022): familiarisation with the data, generating initial codes, constructing themes, reviewing themes, defining and naming themes, and writing up. Interview recordings will first be transcribed verbatim, and any responses given in Somali will be translated into English and checked by a second translator for accuracy. The transcripts will then be read several times, coded and organised into themes that relate to the study objectives. NVivo software will be used to organise the codes and themes. The findings will be presented in narrative form, supported by direct quotations from participants, identified only by codes such as HT1 for the first head teacher and CSO2 for the second Curriculum Support Officer.</w:t>
+        <w:t xml:space="preserve">Data from interviews, open-ended questionnaire items and observation notes will be analysed through reflexive thematic analysis, following the six phases set out by Braun and Clarke (2022). These are getting familiar with the data, generating initial codes, building themes, reviewing them, defining and naming them, and writing up. Interview recordings will be transcribed word for word. Any answers given in Somali will be translated into English, and a second translator will check the translation. The researcher will read the transcripts several times, code them and group the codes into themes linked to the study objectives, using NVivo to keep the codes and themes organised. Findings will be reported as a narrative supported by direct quotations. Participants will be identified only by codes, for example HT1 for the first head teacher and CSO2 for the second Curriculum Support Officer.</w:t>
       </w:r>
     </w:p>
     <w:p>
@@ -9985,7 +10013,7 @@
           <w:sz w:val="24"/>
           <w:szCs w:val="24"/>
         </w:rPr>
-        <w:t xml:space="preserve">In line with the convergent design, the quantitative and qualitative results will be merged during interpretation. The researcher will prepare a joint display table showing, for each objective, the main statistical results alongside the corresponding qualitative themes and observation evidence. Areas of agreement will strengthen confidence in the findings, while areas of disagreement will be explored and explained, for instance where teachers report a higher level of competence than is observed in lessons (Creswell &amp; Creswell, 2023).</w:t>
+        <w:t xml:space="preserve">As the convergent design requires, the quantitative and qualitative results will be brought together at the interpretation stage. For each objective, the researcher will prepare a joint display that sets the main statistical results beside the related qualitative themes and observation evidence. Where the two agree, confidence in the findings grows. Where they differ, for example if teachers rate their competence higher than what is seen in their lessons, the researcher will look into the reasons and explain them (Creswell &amp; Creswell, 2023).</w:t>
       </w:r>
     </w:p>
     <w:p>
@@ -10010,7 +10038,7 @@
           <w:sz w:val="24"/>
           <w:szCs w:val="24"/>
         </w:rPr>
-        <w:t xml:space="preserve">The study will require careful logistical planning because of the vast distances and security situation in the sub-county. The researcher will hire a reliable vehicle for fieldwork and will plan the visits so that schools in the same area are covered on the same day. Movement will be restricted to daylight hours, and the researcher will consult the local administration and security officers before visiting remote schools. Research assistants will be drawn from the local community to ease communication and build trust. A detailed work plan and budget for the study are provided in Appendices VI and VII.</w:t>
+        <w:t xml:space="preserve">The long distances and security situation in the sub-county mean that fieldwork will need careful planning. The researcher will hire a dependable vehicle and plan visits so that schools close to one another are covered on the same day. Travel will take place only in daylight, and the local administration and security officers will be consulted before visits to remote schools. The research assistants will come from the local community, which should make communication easier and help build trust. The work plan and budget appear in Appendices VI and VII.</w:t>
       </w:r>
     </w:p>
     <w:p>
@@ -10035,7 +10063,7 @@
           <w:sz w:val="24"/>
           <w:szCs w:val="24"/>
         </w:rPr>
-        <w:t xml:space="preserve">The study will observe the ethical standards required for research involving human participants. Ethical approval will be sought from the Mount Kenya University Ethics Review Committee, and a research permit will be obtained from NACOSTI before data collection begins. Permission will also be sought from the county and sub-county education authorities and from the head teachers of the sampled schools.</w:t>
+        <w:t xml:space="preserve">The study will follow the ethical standards expected of research with human participants. Ethical approval will be sought from the Mount Kenya University Ethics Review Committee, and a NACOSTI research permit will be obtained before any data are collected. Permission will also be sought from the county and sub-county education authorities and from the head teachers of the sampled schools.</w:t>
       </w:r>
     </w:p>
     <w:p>
@@ -10049,7 +10077,7 @@
           <w:sz w:val="24"/>
           <w:szCs w:val="24"/>
         </w:rPr>
-        <w:t xml:space="preserve">Participation in the study will be voluntary. Each participant will receive an information sheet and a consent form (Appendix II) explaining the purpose of the study, what participation involves, the expected duration and the right to withdraw at any stage without penalty. Written informed consent will be obtained before any questionnaire is administered, interview conducted or lesson observed. Teachers will be assured that the classroom observation is not an appraisal and that the results will not be shared with their employer or used for any disciplinary purpose.</w:t>
+        <w:t xml:space="preserve">Taking part will be entirely voluntary. Every participant will receive an information sheet and consent form (Appendix II) explaining what the study is about, what taking part involves, how long it will take and that they may withdraw at any time without penalty. Written consent will be obtained before any questionnaire is completed, any interview is held or any lesson is observed. Teachers will be assured that the observation is not an appraisal and that nothing seen will be passed to their employer or used for disciplinary purposes.</w:t>
       </w:r>
     </w:p>
     <w:p>
@@ -10063,7 +10091,7 @@
           <w:sz w:val="24"/>
           <w:szCs w:val="24"/>
         </w:rPr>
-        <w:t xml:space="preserve">Confidentiality and anonymity will be protected. Respondents will not be required to write their names on the questionnaires, and schools and participants will be identified by codes in all reports. Audio recordings, transcripts and completed instruments will be stored securely, with electronic files protected by passwords, in line with the Data Protection Act of 2019. The data will be used only for academic purposes and will be destroyed after the period required by the university. The researcher will also be sensitive to the cultural and religious norms of the community, including dress codes, prayer times and gender norms, and will ensure that interviews are conducted at times and places that are convenient and acceptable to participants. Finally, the researcher will acknowledge all sources used in the study through proper citation and referencing in APA style, and the final report will be checked for plagiarism in accordance with university policy.</w:t>
+        <w:t xml:space="preserve">Confidentiality and anonymity will be protected throughout. Respondents will not write their names on the questionnaires, and schools and individuals will be referred to by codes in every report. Recordings, transcripts and completed instruments will be kept securely, and electronic files will be password-protected in line with the Data Protection Act of 2019. The data will be used only for academic purposes and destroyed once the period required by the university has passed. The researcher will respect the cultural and religious norms of the community, including dress codes, prayer times and gender norms, and will hold interviews at times and places that suit participants. Lastly, all sources used in the study will be properly acknowledged using APA style, and the final report will be checked for plagiarism in line with university policy.</w:t>
       </w:r>
     </w:p>
     <w:p>

</xml_diff>

<commit_message>
Rewrite CBC proposal in conventional postgraduate register
Recast Chapters One to Three and the abstract in the plain reporting
style typical of Kenyan postgraduate proposals, with a study-by-study
empirical review and fewer stylistic flourishes. Citations, tables,
figures and structure are unchanged.

Co-Authored-By: Claude Opus 5.5 <noreply@anthropic.com>
Claude-Session: https://claude.ai/code/session_01MJoZ5fMVrPBePWFDmyN3pz
</commit_message>
<xml_diff>
--- a/Research_Proposal_Teachers_Competence_CBC_Habaswein.docx
+++ b/Research_Proposal_Teachers_Competence_CBC_Habaswein.docx
@@ -686,7 +686,7 @@
           <w:sz w:val="24"/>
           <w:szCs w:val="24"/>
         </w:rPr>
-        <w:t xml:space="preserve">	3</w:t>
+        <w:t xml:space="preserve">	4</w:t>
       </w:r>
     </w:p>
     <w:p>
@@ -711,7 +711,7 @@
           <w:sz w:val="24"/>
           <w:szCs w:val="24"/>
         </w:rPr>
-        <w:t xml:space="preserve">	4</w:t>
+        <w:t xml:space="preserve">	5</w:t>
       </w:r>
     </w:p>
     <w:p>
@@ -736,7 +736,7 @@
           <w:sz w:val="24"/>
           <w:szCs w:val="24"/>
         </w:rPr>
-        <w:t xml:space="preserve">	4</w:t>
+        <w:t xml:space="preserve">	5</w:t>
       </w:r>
     </w:p>
     <w:p>
@@ -761,7 +761,7 @@
           <w:sz w:val="24"/>
           <w:szCs w:val="24"/>
         </w:rPr>
-        <w:t xml:space="preserve">	4</w:t>
+        <w:t xml:space="preserve">	5</w:t>
       </w:r>
     </w:p>
     <w:p>
@@ -836,7 +836,7 @@
           <w:sz w:val="24"/>
           <w:szCs w:val="24"/>
         </w:rPr>
-        <w:t xml:space="preserve">	5</w:t>
+        <w:t xml:space="preserve">	6</w:t>
       </w:r>
     </w:p>
     <w:p>
@@ -886,7 +886,7 @@
           <w:sz w:val="24"/>
           <w:szCs w:val="24"/>
         </w:rPr>
-        <w:t xml:space="preserve">	6</w:t>
+        <w:t xml:space="preserve">	7</w:t>
       </w:r>
     </w:p>
     <w:p>
@@ -936,7 +936,7 @@
           <w:sz w:val="24"/>
           <w:szCs w:val="24"/>
         </w:rPr>
-        <w:t xml:space="preserve">	7</w:t>
+        <w:t xml:space="preserve">	8</w:t>
       </w:r>
     </w:p>
     <w:p>
@@ -961,7 +961,7 @@
           <w:sz w:val="24"/>
           <w:szCs w:val="24"/>
         </w:rPr>
-        <w:t xml:space="preserve">	7</w:t>
+        <w:t xml:space="preserve">	8</w:t>
       </w:r>
     </w:p>
     <w:p>
@@ -1313,7 +1313,7 @@
           <w:sz w:val="24"/>
           <w:szCs w:val="24"/>
         </w:rPr>
-        <w:t xml:space="preserve">	17</w:t>
+        <w:t xml:space="preserve">	18</w:t>
       </w:r>
     </w:p>
     <w:p>
@@ -1338,7 +1338,7 @@
           <w:sz w:val="24"/>
           <w:szCs w:val="24"/>
         </w:rPr>
-        <w:t xml:space="preserve">	18</w:t>
+        <w:t xml:space="preserve">	19</w:t>
       </w:r>
     </w:p>
     <w:p>
@@ -1363,7 +1363,7 @@
           <w:sz w:val="24"/>
           <w:szCs w:val="24"/>
         </w:rPr>
-        <w:t xml:space="preserve">	19</w:t>
+        <w:t xml:space="preserve">	20</w:t>
       </w:r>
     </w:p>
     <w:p>
@@ -3218,7 +3218,7 @@
           <w:sz w:val="24"/>
           <w:szCs w:val="24"/>
         </w:rPr>
-        <w:t xml:space="preserve">Kenya introduced the Competency-Based Curriculum (CBC) in 2017 to raise learners who can think critically, solve problems, communicate well and use what they learn in real life. Whether the reform succeeds rests largely on teachers. They are expected to understand what the curriculum is trying to achieve, to teach in learner-centred ways and to assess learners through a range of authentic tools. Studies from different parts of the country suggest that many teachers have not yet developed this competence, and the gap may be widest in marginalised arid and semi-arid counties such as Wajir. This study therefore sets out to assess teachers’ competence and its influence on the effective implementation of the CBC in public primary schools in Habaswein Sub-County, Wajir County, Kenya. It has four objectives: to assess teachers’ knowledge and understanding of the principles and practices of the CBC; to analyse their pedagogical competence in implementing it; to identify the factors that affect their competence; and to establish the relationship between teachers’ competence and effective implementation. The study draws on the Concerns-Based Adoption Model, the Teacher Professional Competence Model and the Technological Pedagogical Content Knowledge framework. It will use a convergent parallel mixed methods design that combines a descriptive survey with a correlational approach. The target population is about 42 public primary schools, 42 head teachers, 336 teachers and 3 Curriculum Support Officers. Stratified random sampling will be used to select 21 schools, and a sample of 183 teachers, worked out with a finite population formula, will be spread proportionately across the strata. The head teachers of the 21 schools and all 3 Curriculum Support Officers will also take part. Data will be gathered through questionnaires, semi-structured interviews and classroom observation. The instruments will be piloted in Wajir South Sub-County, with content validity checked by experts and reliability tested using Cronbach’s alpha. Quantitative data will be analysed in SPSS using descriptive statistics, Pearson correlation and multiple linear regression, while qualitative data will be analysed thematically. The findings should help the Ministry of Education, the Teachers Service Commission, the Kenya Institute of Curriculum Development and the County Government of Wajir to plan better-targeted support for teachers in marginalised areas.</w:t>
+        <w:t xml:space="preserve">The Competency-Based Curriculum (CBC) was introduced in Kenya in 2017 with the aim of producing learners who can think critically, solve problems, communicate effectively and apply knowledge in real life. The success of the curriculum depends largely on teachers, who are expected to understand its aims, use learner-centred methods and assess learners using a variety of authentic tools. Studies in different parts of the country, however, show that many teachers have not yet acquired these competences, and the gap is likely to be wider in marginalised arid and semi-arid counties such as Wajir. The purpose of this study is to assess teachers’ competence and its influence on the effective implementation of the CBC in public primary schools in Habaswein Sub-County, Wajir County, Kenya. The study has four objectives, namely to assess teachers’ knowledge and understanding of the principles and practices of the CBC; to analyse their pedagogical competence in implementing it; to identify the factors that affect their competence; and to establish the relationship between teachers’ competence and effective implementation. The study is based on the Concerns-Based Adoption Model, the Teacher Professional Competence Model and the Technological Pedagogical Content Knowledge framework. A convergent parallel mixed methods design combining a descriptive survey and a correlational approach will be used. The target population is about 42 public primary schools, 42 head teachers, 336 teachers and 3 Curriculum Support Officers. Stratified random sampling will be used to select 21 schools, while a sample of 183 teachers, determined using a finite population formula, will be distributed proportionately across the strata. The head teachers of the 21 schools and all 3 Curriculum Support Officers will also take part. Data will be collected through questionnaires, semi-structured interviews and classroom observation. The instruments will be piloted in Wajir South Sub-County, with content validity checked by experts and reliability tested using Cronbach’s alpha. Quantitative data will be analysed in SPSS using descriptive statistics, Pearson correlation and multiple linear regression, while qualitative data will be analysed thematically. The findings are expected to help the Ministry of Education, the Teachers Service Commission, the Kenya Institute of Curriculum Development and the County Government of Wajir to plan targeted support for teachers in marginalised areas.</w:t>
       </w:r>
     </w:p>
     <w:p>
@@ -3294,7 +3294,7 @@
           <w:sz w:val="24"/>
           <w:szCs w:val="24"/>
         </w:rPr>
-        <w:t xml:space="preserve">Schools in many parts of the world are rethinking what it means to learn. For a long time, a good pupil was one who could recall facts and reproduce them in an examination. Today, many education systems want more than that. They want learners who can use what they know to solve problems, work with others and make sound decisions in everyday life. This approach, usually called competency-based education, gives weight to skills, values and attitudes rather than to the amount of content a learner can remember (Jentsch &amp; König, 2022). The change is happening at a difficult time. UNESCO and the International Task Force on Teachers for Education 2030 (2024) estimate that the world will need 44 million more primary and secondary teachers by 2030, about 15 million of them in sub-Saharan Africa. The same report warns that hiring alone will not close the gap. Teachers who are already in service also need help to build the kind of competence that newer curricula ask of them.</w:t>
+        <w:t xml:space="preserve">Education systems in many countries have in recent years moved away from content-heavy curricula and adopted curricula that focus on what learners are able to do with what they learn. Under this approach, commonly referred to as competency-based education, the emphasis is placed on skills, values and attitudes that a learner can apply in real situations, and less on the amount of content the learner can recall during an examination (Jentsch &amp; König, 2022). This shift has coincided with a global shortage of teachers. UNESCO and the International Task Force on Teachers for Education 2030 (2024) estimate that 44 million additional primary and secondary school teachers will be needed worldwide by 2030, and that sub-Saharan Africa alone will require about 15 million of them. The report notes that recruiting new teachers will not be enough on its own, since teachers who are already in service also need support to acquire the competences that new curricula demand.</w:t>
       </w:r>
     </w:p>
     <w:p>
@@ -3308,7 +3308,7 @@
           <w:sz w:val="24"/>
           <w:szCs w:val="24"/>
         </w:rPr>
-        <w:t xml:space="preserve">What, then, makes a teacher competent? A certificate is only the starting point. Jentsch and König (2022) see teacher competence as a blend of professional knowledge, practical skill, beliefs and motivation, which together allow a teacher to handle the everyday demands of a real classroom. Drawing on large international studies, they show that these qualities grow over time, during initial training and later through professional development, and that they shape the quality of teaching that learners receive. Mishra et al. (2023) make a related point: teachers’ knowledge cannot stand still. As curricula and technologies change, teachers have to keep bringing together what they know about content, about teaching and about the tools available to them. Put simply, a curriculum is only as strong as the people who teach it.</w:t>
+        <w:t xml:space="preserve">Teacher competence goes beyond possessing a teaching qualification. Jentsch and König (2022) describe it as a combination of professional knowledge, practical skills, beliefs and motivation which enables a teacher to deal with the day-to-day demands of the classroom. Drawing on international large-scale studies, the authors show that these attributes develop gradually, first during initial teacher training and later through professional development, and that they have a bearing on the quality of instruction that learners receive. In a related argument, Mishra et al. (2023) observe that teachers’ knowledge has to keep changing as curricula and technologies change, because teachers are expected to bring together knowledge of content, of pedagogy and of the tools available to them. For this reason, the success of any curriculum reform depends to a large extent on the teachers who implement it.</w:t>
       </w:r>
     </w:p>
     <w:p>
@@ -3322,7 +3322,7 @@
           <w:sz w:val="24"/>
           <w:szCs w:val="24"/>
         </w:rPr>
-        <w:t xml:space="preserve">Several African countries have introduced competence-based curricula over the past decade, and their experience is instructive. Wawire et al. (2026) reviewed studies from Ghana, Kenya, Rwanda, South Africa, Tanzania, Uganda and Zambia. On paper, these countries all promote learner-centred teaching and formative assessment. In many classrooms, though, lessons are still dominated by teacher talk, note copying and end-of-term tests. Kasuga and Kalolo (2025) describe similar tensions in Njombe Region, Tanzania, where poorly prepared teachers, an uneven spread of resources and parents’ continued focus on examination results pulled against the new approach. Uganda tells much the same story. Teachers in Gulu City reported large classes, few materials and too little training (Kidega et al., 2024), and Barasa et al. (2025) worry that schools serving poorer families are falling behind, so that a reform meant to reduce inequality may end up widening it.</w:t>
+        <w:t xml:space="preserve">A number of African countries have adopted competence-based curricula within the last decade. Wawire et al. (2026) carried out a scoping review of studies from Ghana, Kenya, Rwanda, South Africa, Tanzania, Uganda and Zambia and reported that, although policy documents in these countries promote learner-centred teaching and formative assessment, classroom practice in many schools has remained teacher-centred. In Tanzania, Kasuga and Kalolo (2025) identified several dilemmas affecting implementation in Njombe Region, among them inadequate preparation of teachers, uneven distribution of resources between schools and the continued attachment of society to examination results. In Uganda, Kidega et al. (2024) found that teachers in Gulu City were constrained by large classes, inadequate materials and insufficient training, while Barasa et al. (2025) raised the concern that schools serving poorer communities were lagging behind in implementing the new lower secondary curriculum, which could widen inequality instead of reducing it.</w:t>
       </w:r>
     </w:p>
     <w:p>
@@ -3336,7 +3336,7 @@
           <w:sz w:val="24"/>
           <w:szCs w:val="24"/>
         </w:rPr>
-        <w:t xml:space="preserve">Kenya started its own reform in 2017, when the Competency-Based Curriculum (CBC) began to replace the 8-4-4 system, beginning with pre-primary and the lower primary grades. The new curriculum aims to nurture every learner’s potential through seven core competencies: communication and collaboration, critical thinking and problem solving, imagination and creativity, citizenship, digital literacy, learning to learn, and self-efficacy (Akala, 2021). Learners now spend two years in pre-primary, six in primary, three in junior school and three in senior school before moving on to tertiary education. In 2022, the government set up the Presidential Working Party on Education Reform (PWPER) to review how the reform was working. The Working Party kept the competency approach. It did, however, ask for fewer learning areas, a lighter assessment burden and a much stronger investment in teacher capacity (Presidential Working Party on Education Reform [PWPER], 2023). Since then, the reform has increasingly been described as Competency-Based Education (CBE), although what is expected of teachers in the classroom has hardly changed.</w:t>
+        <w:t xml:space="preserve">In Kenya, the Competency-Based Curriculum (CBC) was introduced in 2017 to replace the 8-4-4 system. The rollout was phased, beginning with pre-primary and lower primary grades. The curriculum seeks to nurture the potential of every learner through seven core competencies, namely communication and collaboration, critical thinking and problem solving, imagination and creativity, citizenship, digital literacy, learning to learn, and self-efficacy (Akala, 2021). Under the new structure, a learner spends two years in pre-primary, six years in primary school, three years in junior school and three years in senior school before joining tertiary education. The government appointed the Presidential Working Party on Education Reform (PWPER) in 2022 to review the implementation of the reform. The Working Party recommended that the competency approach be retained, but it also recommended a reduction in the number of learning areas, a lighter assessment load and more investment in building the capacity of teachers (Presidential Working Party on Education Reform [PWPER], 2023). The reform has since been referred to more often as Competency-Based Education (CBE), although what teachers are expected to do in class has remained largely the same.</w:t>
       </w:r>
     </w:p>
     <w:p>
@@ -3350,7 +3350,7 @@
           <w:sz w:val="24"/>
           <w:szCs w:val="24"/>
         </w:rPr>
-        <w:t xml:space="preserve">Assessment sits at the heart of the Kenyan reform. The Kenya National Examinations Council (KNEC, 2021) introduced a competency-based assessment framework in which teachers combine summative tests with a range of formative tools, among them observation schedules, rating scales, checklists, portfolios, projects and rubrics. The framework takes for granted that teachers can design authentic tasks, judge learners’ work against clear criteria and keep accurate records for every child. That assumption does not always hold. Several years into the reform, Macheso, Kati, and Wafula (2024) found that many primary teachers in western Kenya still leaned heavily on written tests, while portfolios, anecdotal records and projects were used far less often. The competence the curriculum depends on, in other words, has not yet taken root among many of the teachers expected to deliver it.</w:t>
+        <w:t xml:space="preserve">Assessment forms a major part of the reform. The Kenya National Examinations Council (KNEC, 2021) developed a competency-based assessment framework under which teachers are required to use formative tools such as observation schedules, rating scales, checklists, portfolios, projects and rubrics alongside summative tests. The framework assumes that teachers are able to design authentic tasks, judge learners’ work against set criteria and keep proper records for each learner. Macheso, Kati, and Wafula (2024) found that several years after the rollout, many primary school teachers in western Kenya were still depending mostly on written tests, and that portfolios, anecdotal records and projects were used much less often. This suggests that many teachers are yet to acquire the competences on which the curriculum depends.</w:t>
       </w:r>
     </w:p>
     <w:p>
@@ -3364,7 +3364,7 @@
           <w:sz w:val="24"/>
           <w:szCs w:val="24"/>
         </w:rPr>
-        <w:t xml:space="preserve">Other Kenyan studies paint a similar picture. Research in Nairobi, Nyamira, Kirinyaga, Kinangop, Moiben and Bomet has found, again and again, that teachers were either not trained for the new curriculum or were trained in a rush that left gaps in their understanding (Isaboke et al., 2021; Karua et al., 2025; Keter &amp; Wabuke, 2025; Mohamed et al., 2022; Mutai et al., 2024; Okeyo &amp; Mokua, 2023). One finding stands out. Mwangi et al. (2026) report that 95% of the teachers they studied had attended CBC training, yet 65% still viewed the curriculum negatively. Sitting through a workshop, it seems, does not by itself make a teacher competent or committed. Mwang’ombe (2021) described teachers’ grasp of the CBC as vague, a weakness that showed in their planning, their teaching and their assessment. In a classroom-based evaluation, the African Population and Health Research Center (APHRC, 2022) found that some teachers were delivering effective CBC lessons, but many lessons fell short on learner engagement and on the integration of core competencies.</w:t>
+        <w:t xml:space="preserve">Studies conducted in other parts of Kenya have reported similar gaps. In Nairobi, Nyamira, Kirinyaga, Kinangop, Moiben and Bomet, researchers found that teachers had either not been trained for the new curriculum or had been trained within a short period that left gaps in their understanding (Isaboke et al., 2021; Karua et al., 2025; Keter &amp; Wabuke, 2025; Mohamed et al., 2022; Mutai et al., 2024; Okeyo &amp; Mokua, 2023). Mwangi et al. (2026) reported that 95% of the teachers in their study had attended CBC training, yet 65% of them still held negative perceptions of the curriculum. Attendance at training therefore does not necessarily mean that a teacher is competent or committed to the curriculum. Mwang’ombe (2021) had earlier described teachers’ understanding of the CBC as vague and noted that this affected their planning, teaching and assessment. An evaluation by the African Population and Health Research Center (APHRC, 2022) also found that although some teachers were delivering effective CBC lessons, many lessons fell short in learner engagement and in the integration of core competencies.</w:t>
       </w:r>
     </w:p>
     <w:p>
@@ -3378,7 +3378,7 @@
           <w:sz w:val="24"/>
           <w:szCs w:val="24"/>
         </w:rPr>
-        <w:t xml:space="preserve">These problems are likely to be sharper in the arid and semi-arid lands (ASAL) of northern Kenya. Hussein (2023) found that poor infrastructure, scarce learning resources and limited training were holding back the CBC across the region. In Township Ward, Garissa County, more than 60% of public primary teachers had not received comprehensive in-service training on the curriculum (Ongubo, 2025). Wajir County, the setting of this study, faces many of the same pressures. Its County Integrated Development Plan lists a shortage of teachers, long distances to school, recurrent drought that disrupts enrolment and attendance, and a pastoralist way of life that makes continuous schooling hard to sustain (County Government of Wajir, 2023). Insecurity in the border areas has added to the strain, as many teachers from outside the region have sought transfers, leaving schools short-staffed and increasingly dependent on teachers hired by Boards of Management.</w:t>
+        <w:t xml:space="preserve">The challenges mentioned above are likely to be greater in the arid and semi-arid lands (ASAL) of northern Kenya. Hussein (2023) reported that CBC implementation in the region was hindered by poor infrastructure, a shortage of learning resources and limited training of teachers. Ongubo (2025) found that more than 60% of public primary school teachers in Township Ward, Garissa County, had not received comprehensive in-service training on the CBC. Wajir County, where the present study will be carried out, faces many of the same problems. The County Integrated Development Plan lists a shortage of teachers, long distances to school, recurrent drought that affects enrolment and attendance, and a pastoralist lifestyle that makes it difficult for children to attend school continuously (County Government of Wajir, 2023). Insecurity in parts of the region has also led many teachers from outside the county to seek transfers, and schools have increasingly relied on teachers employed by Boards of Management.</w:t>
       </w:r>
     </w:p>
     <w:p>
@@ -3392,7 +3392,7 @@
           <w:sz w:val="24"/>
           <w:szCs w:val="24"/>
         </w:rPr>
-        <w:t xml:space="preserve">Habaswein Sub-County lies in the south of Wajir County, along the road between Garissa and Wajir. Most of its public primary schools serve pastoralist and agro-pastoralist families, and several run low-cost boarding facilities so that children from mobile households can stay in school. The teachers here work in tough conditions. Classes are often large, teaching materials are few, electricity and internet are unreliable and chances for professional development are rare. Even so, they teach the same curriculum as teachers in well-equipped urban schools, and their learners sit the same national assessments. It is worth asking, then, how well prepared these teachers are to deliver the CBC, what shapes their competence and how that competence shows up in their classrooms. These are the questions this study sets out to answer.</w:t>
+        <w:t xml:space="preserve">Habaswein Sub-County is located in the southern part of Wajir County along the Garissa–Wajir road. Most public primary schools in the sub-county serve pastoralist and agro-pastoralist communities, and some of them operate low-cost boarding facilities to keep children from mobile households in school. Teachers in these schools often handle large classes with few teaching materials, and electricity and internet connectivity are unreliable. Opportunities for professional development are also limited. Despite these conditions, the teachers implement the same curriculum as their colleagues in well-equipped urban schools, and their learners sit the same national assessments. There is need, therefore, to establish the level of competence of teachers in Habaswein, the factors that influence it and how it relates to the implementation of the CBC in their classrooms.</w:t>
       </w:r>
     </w:p>
     <w:p>
@@ -3417,7 +3417,7 @@
           <w:sz w:val="24"/>
           <w:szCs w:val="24"/>
         </w:rPr>
-        <w:t xml:space="preserve">For the CBC to work, teachers need to understand what it is trying to achieve. They need to teach in learner-centred ways, weave core competencies and pertinent and contemporary issues into their lessons and assess learners through authentic tasks. In an ideal situation, every public primary teacher in Kenya would have these abilities, and a child in Habaswein would enjoy much the same classroom experience as a child in Nairobi or Nakuru. The government has taken real steps in this direction through national training, the supply of curriculum designs and textbooks, and the work of Curriculum Support Officers (PWPER, 2023).</w:t>
+        <w:t xml:space="preserve">Effective implementation of the CBC requires teachers who understand the aims of the curriculum, use learner-centred methods, integrate core competencies and pertinent and contemporary issues in their lessons and assess learners through authentic tasks. Ideally, all public primary school teachers in Kenya should have these competences, so that a learner in Habaswein receives an education comparable to that of a learner in Nairobi or Nakuru. The government has taken steps towards this through national training programmes, the supply of curriculum designs and textbooks, and the deployment of Curriculum Support Officers (PWPER, 2023).</w:t>
       </w:r>
     </w:p>
     <w:p>
@@ -3431,7 +3431,7 @@
           <w:sz w:val="24"/>
           <w:szCs w:val="24"/>
         </w:rPr>
-        <w:t xml:space="preserve">The reality falls short of this ideal. Research from across the country shows that many teachers have only a partial understanding of the principles of the CBC, struggle to prepare schemes of work and lesson plans in the required format and use a narrow set of assessment tools (Karua et al., 2025; Macheso, Kati, &amp; Wafula, 2024; Mwang’ombe, 2021). In northern Kenya, teacher shortages, insecurity, weak infrastructure and patchy in-service training make matters worse (Hussein, 2023; Ongubo, 2025). Where teachers lack the competence they need, implementation tends to stay on the surface. The vocabulary of the new curriculum is adopted, but lessons remain teacher-centred and driven by examinations (Awiti, 2023; Wawire et al., 2026). Learners in marginalised areas then miss out on the very skills the reform was designed to build, and old inequalities grow deeper (Barasa et al., 2025).</w:t>
+        <w:t xml:space="preserve">However, available studies indicate that there is still a wide gap between what the curriculum expects of teachers and what many teachers are able to do. Many teachers have limited understanding of CBC principles, find it difficult to prepare schemes of work and lesson plans in the required format and use only a few assessment tools (Karua et al., 2025; Macheso, Kati, &amp; Wafula, 2024; Mwang’ombe, 2021). In northern Kenya the situation is made worse by teacher shortages, insecurity, poor infrastructure and limited in-service training (Hussein, 2023; Ongubo, 2025). Where teachers lack the required competence, implementation is likely to be superficial, with schools adopting the terminology of the new curriculum while teaching remains teacher-centred and examination-oriented (Awiti, 2023; Wawire et al., 2026). Learners in marginalised areas may then fail to acquire the competences that the reform was intended to develop, and existing inequalities may deepen (Barasa et al., 2025).</w:t>
       </w:r>
     </w:p>
     <w:p>
@@ -3445,7 +3445,7 @@
           <w:sz w:val="24"/>
           <w:szCs w:val="24"/>
         </w:rPr>
-        <w:t xml:space="preserve">Plenty of studies have looked at teacher preparedness for the CBC, but most were carried out in urban or relatively well-served counties such as Nairobi, Machakos, Kirinyaga, Nyandarua and Uasin Gishu (Isaboke et al., 2021; Mogere, 2022; Mutua &amp; Waweru, 2023). Wajir County has received little attention, and the researcher knows of no study that has examined teachers’ competence and CBC implementation in Habaswein Sub-County. A second weakness is one of measurement. Many earlier studies judged preparedness mainly by whether teachers had attended training. They did not assess what teachers actually know, how they teach or how they assess learners, and they rarely tested statistically how these abilities relate to the quality of implementation. Without evidence of this kind, the Ministry of Education, the Teachers Service Commission and the County Government of Wajir have little to guide targeted support. This study responds to that gap by assessing teachers’ competence and establishing its influence on the effective implementation of the CBC in public primary schools in Habaswein Sub-County, Wajir County.</w:t>
+        <w:t xml:space="preserve">Most of the studies on teacher preparedness for the CBC have been conducted in urban or relatively well-served counties such as Nairobi, Machakos, Kirinyaga, Nyandarua and Uasin Gishu (Isaboke et al., 2021; Mogere, 2022; Mutua &amp; Waweru, 2023). Few studies have been done in Wajir County, and the researcher is not aware of any study that has examined teachers’ competence and its influence on CBC implementation in Habaswein Sub-County. In addition, many of the earlier studies measured preparedness mainly by asking whether teachers had attended training. They did not assess teachers’ actual knowledge, classroom practice and assessment skills, and few of them tested statistically how these relate to the effectiveness of implementation. This lack of context-specific evidence makes it difficult for the Ministry of Education, the Teachers Service Commission and the County Government of Wajir to plan targeted support for teachers. It is against this background that the present study seeks to assess teachers’ competence and its influence on the effective implementation of the CBC in public primary schools in Habaswein Sub-County, Wajir County.</w:t>
       </w:r>
     </w:p>
     <w:p>
@@ -3470,7 +3470,7 @@
           <w:sz w:val="24"/>
           <w:szCs w:val="24"/>
         </w:rPr>
-        <w:t xml:space="preserve">The purpose of this study is to assess teachers’ competence and to establish how it influences the effective implementation of the Competency-Based Curriculum in public primary schools in Habaswein Sub-County, Wajir County, Kenya. The aim is to produce evidence that can guide teacher support and education policy in marginalised settings.</w:t>
+        <w:t xml:space="preserve">The purpose of this study is to assess teachers’ competence and establish its influence on the effective implementation of the Competency-Based Curriculum in public primary schools in Habaswein Sub-County, Wajir County, Kenya, in order to generate evidence that can guide teacher support and policy in marginalised areas.</w:t>
       </w:r>
     </w:p>
     <w:p>
@@ -3853,7 +3853,7 @@
           <w:sz w:val="24"/>
           <w:szCs w:val="24"/>
         </w:rPr>
-        <w:t xml:space="preserve">The fourth objective will be tested statistically through the following null hypotheses, each at the 0.05 level of significance:</w:t>
+        <w:t xml:space="preserve">The following null hypotheses will be tested at 0.05 level of significance in relation to the fourth objective:</w:t>
       </w:r>
     </w:p>
     <w:p>
@@ -3980,7 +3980,7 @@
           <w:sz w:val="24"/>
           <w:szCs w:val="24"/>
         </w:rPr>
-        <w:t xml:space="preserve">The CBC is one of the most ambitious education reforms Kenya has ever undertaken, and the first learners to go through it have only recently moved into junior and senior school. This is the right moment to ask how well it is working in different parts of the country. Equity is a second reason. The reform was meant to widen opportunity, yet experience elsewhere in the region shows that competence-based reforms can deepen the divide between advantaged and disadvantaged schools when support for teachers is uneven (Barasa et al., 2025; Kasuga &amp; Kalolo, 2025). Habaswein is exactly the kind of place where such a divide would appear first.</w:t>
+        <w:t xml:space="preserve">The CBC is one of the biggest education reforms that Kenya has undertaken, and the first learners to go through it have only recently joined junior and senior school. Information on how the curriculum is being implemented in different regions is therefore timely. The reform was also meant to promote equity. Studies from Uganda and Tanzania, however, show that competence-based reforms may increase the gap between advantaged and disadvantaged schools where teachers do not receive equal support (Barasa et al., 2025; Kasuga &amp; Kalolo, 2025). Habaswein is one of the areas where such a gap would be expected.</w:t>
       </w:r>
     </w:p>
     <w:p>
@@ -3994,7 +3994,7 @@
           <w:sz w:val="24"/>
           <w:szCs w:val="24"/>
         </w:rPr>
-        <w:t xml:space="preserve">There is also a practical case. The PWPER (2023) called for stronger teacher capacity building, and the Teachers Service Commission continues to spend on in-service training. That money will be better used if it is guided by evidence on where teachers are strong, where they struggle and what stands in their way. Finally, Kenyan research on the CBC has been concentrated in central, western and urban areas. A study set in the North Eastern region will add a missing voice to the national picture.</w:t>
+        <w:t xml:space="preserve">The PWPER (2023) recommended more investment in teacher capacity building, and the Teachers Service Commission continues to organise in-service training for teachers. Such investment is more likely to succeed if it is based on evidence about the areas in which teachers are competent, the areas in which they struggle and the factors that hold them back. Lastly, most Kenyan studies on the CBC have been done in central, western and urban parts of the country. A study in the North Eastern region will add to the national body of evidence, which currently says little about this part of Kenya.</w:t>
       </w:r>
     </w:p>
     <w:p>
@@ -4019,7 +4019,7 @@
           <w:sz w:val="24"/>
           <w:szCs w:val="24"/>
         </w:rPr>
-        <w:t xml:space="preserve">The findings should be of use to several groups. The Ministry of Education and the Kenya Institute of Curriculum Development (KICD) could draw on them to adjust curriculum support for ASAL counties, for example by simplifying materials or offering assessment guidance that suits local conditions. The Teachers Service Commission (TSC) could use them to shape in-service training and professional development, and to revisit staffing and incentive policies for hardship areas.</w:t>
+        <w:t xml:space="preserve">The findings of the study may be of benefit to various stakeholders. The Ministry of Education and the Kenya Institute of Curriculum Development (KICD) may use them to improve curriculum support for ASAL counties, for example by simplifying curriculum materials or giving assessment guidelines suited to local conditions. The Teachers Service Commission (TSC) may use the findings when planning in-service training and professional development and when reviewing staffing and incentive policies for hardship areas.</w:t>
       </w:r>
     </w:p>
     <w:p>
@@ -4033,7 +4033,7 @@
           <w:sz w:val="24"/>
           <w:szCs w:val="24"/>
         </w:rPr>
-        <w:t xml:space="preserve">Teacher training colleges and universities may find the results helpful in strengthening pre-service preparation, particularly in learner-centred teaching, competency-based assessment and teaching in multi-grade or poorly resourced classrooms. The County Government of Wajir could use the evidence when planning support for basic education and when making the case for more national resources. Closer to the classroom, head teachers and Curriculum Support Officers in Habaswein could use the findings to plan school-based professional learning, mentoring and supervision, while teachers may gain a clearer sense of which parts of their practice need attention. For researchers, the study adds to a thin body of work on the CBC in marginalised settings and points to questions that deserve further inquiry.</w:t>
+        <w:t xml:space="preserve">Teacher training colleges and universities may find the findings useful in improving the pre-service training of teachers, particularly in learner-centred methods, competency-based assessment and teaching in multi-grade and poorly resourced classrooms. The County Government of Wajir may use the findings to plan its support for basic education and to lobby for more resources from the national government. Head teachers and Curriculum Support Officers in Habaswein may use them to organise school-based professional learning, mentoring and supervision, while teachers may be able to identify areas of their own practice that need improvement. The study will also add to the limited literature on CBC implementation in marginalised areas and may point to areas for further research.</w:t>
       </w:r>
     </w:p>
     <w:p>
@@ -4058,7 +4058,7 @@
           <w:sz w:val="24"/>
           <w:szCs w:val="24"/>
         </w:rPr>
-        <w:t xml:space="preserve">A few limitations are expected. Part of the data will come from teachers’ own reports in questionnaires, and some teachers may rate their competence more highly than is warranted. To guard against this, the researcher will compare questionnaire responses with classroom observations and with interviews with head teachers and Curriculum Support Officers.</w:t>
+        <w:t xml:space="preserve">Some of the data will be self-reported by teachers through questionnaires, and some respondents may rate their competence higher than it actually is. To reduce this problem, the researcher will compare the questionnaire responses with data from classroom observation and from interviews with head teachers and Curriculum Support Officers.</w:t>
       </w:r>
     </w:p>
     <w:p>
@@ -4072,7 +4072,7 @@
           <w:sz w:val="24"/>
           <w:szCs w:val="24"/>
         </w:rPr>
-        <w:t xml:space="preserve">Access is another concern. Schools in the sub-county are far apart, roads are poor and some areas experience occasional insecurity. The researcher will plan fieldwork for the dry months, work closely with local education and security offices and engage research assistants who know the area well. Drought or the seasonal movement of pastoralist families may also close some schools for a time or reduce attendance. If that happens, a replacement school will be drawn from the same stratum. Lastly, because the study covers a single sub-county, its findings cannot simply be applied to the rest of Kenya, though they should speak to other ASAL areas with similar conditions.</w:t>
+        <w:t xml:space="preserve">Schools in the sub-county are far apart, the roads are poor and some areas experience insecurity from time to time, which may make some schools difficult to reach. The researcher will carry out fieldwork during the dry months, work with the local education and security offices and use research assistants who are familiar with the area. Some schools may also be closed for a period, or have low attendance, because of drought or the movement of pastoralist families. In such cases a replacement school will be selected from the same stratum. Since the study will cover only one sub-county, its findings may not apply to the whole country, although they are likely to be relevant to other ASAL areas with similar conditions.</w:t>
       </w:r>
     </w:p>
     <w:p>
@@ -4097,7 +4097,7 @@
           <w:sz w:val="24"/>
           <w:szCs w:val="24"/>
         </w:rPr>
-        <w:t xml:space="preserve">The study is limited to public primary schools in Habaswein Sub-County, Wajir County. Private primary schools, pre-primary centres and junior schools are left out because they are staffed, funded and managed differently, which would make comparison difficult. Respondents will be TSC and Board of Management teachers who teach Grades 1 to 6, the head teachers of the sampled schools and the Curriculum Support Officers who serve the sub-county. The study focuses on four areas: teachers’ knowledge and understanding of the CBC, their pedagogical competence, the factors that affect their competence, and the link between competence and effective implementation. Other influences, such as parental involvement and learner characteristics, are recognised but will not be examined in depth.</w:t>
+        <w:t xml:space="preserve">The study will be confined to public primary schools in Habaswein Sub-County, Wajir County. Private primary schools, pre-primary centres and junior schools will not be included, since their staffing, funding and management are different and would make comparison difficult. The respondents will be TSC and Board of Management teachers teaching Grades 1 to 6, head teachers of the sampled schools and the Curriculum Support Officers serving the sub-county. The study will focus on teachers’ knowledge and understanding of the CBC, their pedagogical competence, the factors affecting their competence and the relationship between competence and effective implementation. Other factors such as parental involvement and learner characteristics will be acknowledged but will not be studied in depth.</w:t>
       </w:r>
     </w:p>
     <w:p>
@@ -4293,7 +4293,7 @@
           <w:sz w:val="24"/>
           <w:szCs w:val="24"/>
         </w:rPr>
-        <w:t xml:space="preserve"> The curriculum introduced in Kenya from 2017, which aims to develop learners’ core competencies, values and practical skills through learner-centred teaching and continuous assessment. In this study, the term also covers the current reference to Competency-Based Education (CBE).</w:t>
+        <w:t xml:space="preserve"> The curriculum introduced in Kenya from 2017 which aims at developing learners’ core competencies, values and practical skills through learner-centred teaching and continuous assessment. In this study the term also refers to Competency-Based Education (CBE), the name now used for the reform.</w:t>
       </w:r>
     </w:p>
     <w:p>
@@ -4317,7 +4317,7 @@
           <w:sz w:val="24"/>
           <w:szCs w:val="24"/>
         </w:rPr>
-        <w:t xml:space="preserve"> The mix of knowledge, teaching skills, assessment skills and attitudes that allows a teacher to plan, teach and assess CBC lessons as intended. It will be measured through teachers’ knowledge of the CBC, their pedagogical competence and their assessment practice.</w:t>
+        <w:t xml:space="preserve"> The knowledge, teaching skills, assessment skills and attitudes that enable a teacher to plan, teach and assess CBC lessons as required. In this study it will be measured through teachers’ knowledge of the CBC, their pedagogical competence and their assessment practices.</w:t>
       </w:r>
     </w:p>
     <w:p>
@@ -4341,7 +4341,7 @@
           <w:sz w:val="24"/>
           <w:szCs w:val="24"/>
         </w:rPr>
-        <w:t xml:space="preserve"> How well a teacher can explain the goals, core competencies, values, pertinent and contemporary issues, learning areas and assessment requirements of the CBC.</w:t>
+        <w:t xml:space="preserve"> The extent to which a teacher is able to explain the goals, core competencies, values, pertinent and contemporary issues, learning areas and assessment requirements of the CBC.</w:t>
       </w:r>
     </w:p>
     <w:p>
@@ -4365,7 +4365,7 @@
           <w:sz w:val="24"/>
           <w:szCs w:val="24"/>
         </w:rPr>
-        <w:t xml:space="preserve"> A teacher’s ability to plan and deliver lessons using learner-centred methods, build core competencies and values into lessons, manage learner activities and make good use of locally available resources.</w:t>
+        <w:t xml:space="preserve"> The ability of a teacher to plan and deliver lessons using learner-centred methods, integrate core competencies and values in lessons, manage learner activities and use locally available resources.</w:t>
       </w:r>
     </w:p>
     <w:p>
@@ -4389,7 +4389,7 @@
           <w:sz w:val="24"/>
           <w:szCs w:val="24"/>
         </w:rPr>
-        <w:t xml:space="preserve"> The extent to which classroom practice matches what the CBC intends, as shown by learner engagement, the integration of core competencies, the use of competency-based assessment, lesson planning in the prescribed format and timely coverage of learning areas.</w:t>
+        <w:t xml:space="preserve"> The extent to which classroom practice reflects the intentions of the CBC, as shown by learner participation, integration of core competencies, use of competency-based assessment, lesson planning in the prescribed format and coverage of learning areas within the set time.</w:t>
       </w:r>
     </w:p>
     <w:p>
@@ -4413,7 +4413,7 @@
           <w:sz w:val="24"/>
           <w:szCs w:val="24"/>
         </w:rPr>
-        <w:t xml:space="preserve"> Conditions in the school, in the teacher and in the wider setting, such as training, workload, resources, supervision and the physical environment, that help or hinder a teacher in implementing the CBC.</w:t>
+        <w:t xml:space="preserve"> Conditions within the school, the teacher and the surrounding environment, such as training, workload, resources, supervision and the physical environment, which enhance or limit a teacher’s ability to implement the CBC.</w:t>
       </w:r>
     </w:p>
     <w:p>
@@ -4437,7 +4437,7 @@
           <w:sz w:val="24"/>
           <w:szCs w:val="24"/>
         </w:rPr>
-        <w:t xml:space="preserve"> An area with poor access to social services, weak infrastructure and limited economic opportunity, as is the case in many ASAL counties, Wajir included.</w:t>
+        <w:t xml:space="preserve"> An area with poor access to social services, poor infrastructure and limited economic opportunities, as is the case in many ASAL counties including Wajir.</w:t>
       </w:r>
     </w:p>
     <w:p>
@@ -4462,7 +4462,7 @@
           <w:sz w:val="24"/>
           <w:szCs w:val="24"/>
         </w:rPr>
-        <w:t xml:space="preserve">The proposal has three chapters. Chapter One introduces the study. It sets out the background, the problem, the purpose, the objectives, research questions and hypotheses, and then explains why the study matters, where its boundaries lie and what it assumes, before defining key terms. Chapter Two reviews the theories behind the study and the empirical literature related to each objective, and closes with the conceptual framework and the gaps the study will address. Chapter Three explains how the study will be done, covering the design, location, population, sampling, instruments, piloting, data collection and analysis, and ethical safeguards. References and appendices come at the end.</w:t>
+        <w:t xml:space="preserve">This proposal is organised in three chapters. Chapter One covers the background to the study, the statement of the problem, the purpose, objectives, research questions and hypotheses, the justification and significance of the study, its limitations, delimitations and assumptions, and the operational definition of terms. Chapter Two reviews the theoretical and empirical literature related to the objectives of the study, presents the conceptual framework and highlights the research gaps. Chapter Three describes the research methodology, including the research design, location, target population, sampling techniques and sample size, research instruments, pilot study, data collection and analysis procedures, and ethical considerations. The references and appendices are presented at the end.</w:t>
       </w:r>
     </w:p>
     <w:p>
@@ -4503,7 +4503,7 @@
           <w:sz w:val="24"/>
           <w:szCs w:val="24"/>
         </w:rPr>
-        <w:t xml:space="preserve">This chapter looks at what other scholars have said about teacher competence and curriculum reform. It opens with three theories that help explain how teachers take up a new curriculum and what it means to be a competent teacher. A short description of Kenya’s Competency-Based Curriculum follows. The chapter then reviews empirical studies under each of the four objectives, offers a critique of that body of work, presents the conceptual framework and ends by setting out the gaps this study hopes to fill.</w:t>
+        <w:t xml:space="preserve">This chapter reviews literature related to the study. The first part presents the theories on which the study is based. This is followed by an overview of the Competency-Based Curriculum in Kenya and a review of empirical studies under each of the four objectives. The chapter then gives a critique of the literature, the conceptual framework and a summary of the research gaps.</w:t>
       </w:r>
     </w:p>
     <w:p>
@@ -4528,7 +4528,7 @@
           <w:sz w:val="24"/>
           <w:szCs w:val="24"/>
         </w:rPr>
-        <w:t xml:space="preserve">The study draws on three theories. The Concerns-Based Adoption Model describes how teachers’ worries and practices change as they get used to an innovation. The Teacher Professional Competence Model explains what competence is made of and how it turns into classroom performance. The Technological Pedagogical Content Knowledge framework describes the combined knowledge teachers need in order to teach particular content well with the tools at hand, a point that matters because digital literacy is one of the CBC’s core competencies.</w:t>
+        <w:t xml:space="preserve">The study is guided by three theories: the Concerns-Based Adoption Model, the Teacher Professional Competence Model and the Technological Pedagogical Content Knowledge framework. The first explains how teachers adopt a new curriculum over time. The second explains what teacher competence consists of and how it affects classroom practice, while the third explains the kind of integrated knowledge a teacher needs to teach content effectively with the tools available. The third theory is relevant because digital literacy is one of the core competencies of the CBC.</w:t>
       </w:r>
     </w:p>
     <w:p>
@@ -4553,7 +4553,7 @@
           <w:sz w:val="24"/>
           <w:szCs w:val="24"/>
         </w:rPr>
-        <w:t xml:space="preserve">The Concerns-Based Adoption Model (CBAM) grew out of work by Gene Hall and his colleagues at the University of Texas in the 1970s. They wanted to understand how people, teachers in particular, experience and adopt new ideas in education. Their starting point was simple but important: change is a process, not an event, and it happens first in individuals before it becomes part of an institution. The model looks at change through three lenses, namely stages of concern, levels of use and innovation configurations (Okeyo &amp; Mokua, 2023).</w:t>
+        <w:t xml:space="preserve">The Concerns-Based Adoption Model (CBAM) was developed in the 1970s by Gene Hall and colleagues at the University of Texas. It was meant to explain how individuals, especially teachers, experience and adopt innovations in education. The model is based on the view that change is a process and not a one-off event, and that change takes place in individuals before it becomes part of an institution. It has three dimensions, which are stages of concern, levels of use and innovation configurations (Okeyo &amp; Mokua, 2023).</w:t>
       </w:r>
     </w:p>
     <w:p>
@@ -4567,7 +4567,7 @@
           <w:sz w:val="24"/>
           <w:szCs w:val="24"/>
         </w:rPr>
-        <w:t xml:space="preserve">Stages of concern trace how a teacher’s feelings about an innovation shift over time. Early on, teachers mostly want information. They want to know what the innovation is and how it will affect them. Once they start using it, their worries turn to practical matters such as time, materials and organisation. Later still, they begin to think about its effect on learners, about working with colleagues and about how to make it work better. Levels of use describe what teachers actually do, moving from non-use, through mechanical and routine use, to refinement and renewal. Innovation configurations capture the fact that different teachers often end up using the same innovation in quite different ways (Okeyo &amp; Mokua, 2023).</w:t>
+        <w:t xml:space="preserve">The stages of concern describe how the feelings of a teacher towards an innovation change with time. At the beginning, teachers are mainly concerned about getting information on the innovation and about how it will affect them personally. When they start using it, they become more concerned with management issues such as time, materials and organisation. At later stages, their concern moves to the effect of the innovation on learners, working with colleagues and improving the innovation. The levels of use describe what teachers actually do with the innovation. They range from non-use, to mechanical and routine use, and finally to refinement and renewal. Innovation configurations refer to the different ways in which different teachers put the same innovation into practice (Okeyo &amp; Mokua, 2023).</w:t>
       </w:r>
     </w:p>
     <w:p>
@@ -4581,7 +4581,7 @@
           <w:sz w:val="24"/>
           <w:szCs w:val="24"/>
         </w:rPr>
-        <w:t xml:space="preserve">The model has been used widely in studies of curriculum reform in Africa. In Kenya, Okeyo and Mokua (2023) applied it to teachers’ preparedness for the CBC in Nyamira South and found that most teachers were ill-prepared for the new curriculum. For this study, CBAM offers a helpful way of reading teachers’ knowledge and practice as points along a path of growth. A teacher with only a surface understanding of the CBC is likely to be stuck at an early, self-focused stage and to use the curriculum mechanically. A highly competent teacher, by contrast, is more likely to be thinking about learners’ progress and adapting the curriculum with some creativity. The model also reminds us that teachers’ concerns need the right kind of support, which ties in with the third objective on factors affecting competence.</w:t>
+        <w:t xml:space="preserve">CBAM has been used in several studies on curriculum change in Africa. In Kenya, Okeyo and Mokua (2023) used it in their study of teachers’ preparedness for the CBC in Nyamira South Sub-County and found that most teachers were ill-prepared to implement the curriculum. In the present study, the model will help in interpreting teachers’ knowledge and practice as stages in a process of growth. A teacher with little understanding of the CBC is likely to be at an early stage of concern and to use the curriculum mechanically. A competent teacher is more likely to be concerned about learners’ progress and to adapt the curriculum to suit them. The model also suggests that teachers need support that responds to their concerns, which relates to the third objective of the study.</w:t>
       </w:r>
     </w:p>
     <w:p>
@@ -4595,7 +4595,7 @@
           <w:sz w:val="24"/>
           <w:szCs w:val="24"/>
         </w:rPr>
-        <w:t xml:space="preserve">CBAM is not without its critics. It concentrates on the individual teacher and says relatively little about structural barriers such as funding, class size, infrastructure and inconsistent policy, any of which can stall implementation no matter how willing a teacher is. It has also been faulted for implying a tidy, one-way progression, when in reality teachers can slip back to earlier concerns as conditions change. For these reasons, the study pairs CBAM with a model of teacher competence and pays close attention to the particular conditions in Habaswein.</w:t>
+        <w:t xml:space="preserve">The model has, however, been criticised for focusing on the individual teacher and giving little attention to structural problems such as funding, class size, infrastructure and policy, which can hinder implementation regardless of the teacher’s level of concern. It has also been criticised for suggesting that teachers move through the stages in a straight line, whereas teachers may go back to earlier concerns when conditions change. For this reason, the study combines CBAM with a model of teacher competence and gives attention to the conditions found in Habaswein.</w:t>
       </w:r>
     </w:p>
     <w:p>
@@ -4620,7 +4620,7 @@
           <w:sz w:val="24"/>
           <w:szCs w:val="24"/>
         </w:rPr>
-        <w:t xml:space="preserve">The second theory is the Teacher Professional Competence Model. It draws on the work of German and international researchers, Sigrid Blömeke and her colleagues among them, who argued that competence is best seen as a continuum. At one end are a teacher’s dispositions: professional knowledge, but also beliefs, motivation and self-regulation. These feed into situation-specific skills, meaning the ability to notice what is happening in a lesson, make sense of it and decide what to do next. Those skills, in turn, show up as observable performance in the classroom (Jentsch &amp; König, 2022).</w:t>
+        <w:t xml:space="preserve">The Teacher Professional Competence Model is based on the work of Sigrid Blömeke and other researchers who argued that competence should be seen as a continuum. According to the model, a teacher’s dispositions, which include professional knowledge, beliefs, motivation and self-regulation, influence situation-specific skills. These skills are the ability to notice what is happening in class, interpret it and decide how to respond. The skills in turn lead to observable performance in the classroom (Jentsch &amp; König, 2022).</w:t>
       </w:r>
     </w:p>
     <w:p>
@@ -4634,7 +4634,7 @@
           <w:sz w:val="24"/>
           <w:szCs w:val="24"/>
         </w:rPr>
-        <w:t xml:space="preserve">Jentsch and König (2022) divide competence into two broad parts. The cognitive part covers content knowledge, pedagogical content knowledge and general pedagogical knowledge. The affective-motivational part covers teachers’ beliefs about teaching and learning, their enthusiasm and their confidence in their own ability. Evidence from large international studies suggests that both parts affect the quality of teaching and what learners achieve, and that both can be developed during initial training and through ongoing professional learning. The lesson for this study is that knowledge alone is not enough. A teacher may know the principles of the CBC perfectly well and still struggle to apply them if confidence is low, if they doubt the curriculum’s value or if they find it hard to read and respond to what is happening in class.</w:t>
+        <w:t xml:space="preserve">Jentsch and König (2022) explain that the cognitive part of competence is made up of content knowledge, pedagogical content knowledge and general pedagogical knowledge. The affective-motivational part is made up of teachers’ beliefs about teaching and learning, their enthusiasm and their self-efficacy. Based on international large-scale studies, the authors show that both parts affect the quality of instruction and the achievement of learners, and that both can be developed during initial teacher education and through professional development. One implication of the model is that knowledge alone does not make a good teacher. A teacher may know the principles of the CBC and still fail to apply them because of low confidence, negative beliefs about the curriculum or difficulty in responding to classroom situations.</w:t>
       </w:r>
     </w:p>
     <w:p>
@@ -4648,7 +4648,7 @@
           <w:sz w:val="24"/>
           <w:szCs w:val="24"/>
         </w:rPr>
-        <w:t xml:space="preserve">The model is useful here in three ways. It gives a clear structure to the independent variable, allowing competence to be split into knowledge and understanding of the CBC on the one hand and pedagogical competence on the other. It also explains why simply counting how many teachers attended training says little about competence, a weakness in much of the earlier CBC research. And because it treats competence as something that becomes visible in practice, it supports the decision to observe lessons as well as to use questionnaires. Its main weakness is that it was developed mostly in well-resourced school systems. It may therefore underplay how much hard conditions in marginalised areas can limit even very capable teachers, which is why the study examines contextual factors under the third objective.</w:t>
+        <w:t xml:space="preserve">The model is relevant to the present study in three ways. It provides a structure for the independent variable, which the study divides into knowledge and understanding of the CBC and pedagogical competence. It also explains why attendance at training is not a good measure of competence, which is a weakness of many earlier studies on the CBC. In addition, since the model treats competence as something that can be seen in practice, it supports the use of classroom observation alongside questionnaires. The main weakness of the model is that it was developed mostly in countries with well-resourced school systems, and it may therefore not fully account for the way difficult conditions in marginalised areas limit what competent teachers can do. The study addresses this through the third objective.</w:t>
       </w:r>
     </w:p>
     <w:p>
@@ -4673,7 +4673,7 @@
           <w:sz w:val="24"/>
           <w:szCs w:val="24"/>
         </w:rPr>
-        <w:t xml:space="preserve">The third lens is the Technological Pedagogical Content Knowledge (TPACK) framework, proposed by Punya Mishra and Matthew Koehler in the mid-2000s as an extension of the idea of pedagogical content knowledge. It holds that good teaching draws on three kinds of knowledge at once: knowledge of content (what to teach), knowledge of pedagogy (how to teach it) and knowledge of technology (the tools that can support learning). Where these overlap, for instance in pedagogical content knowledge or technological pedagogical knowledge, we find the specialised understanding that sets an expert teacher apart from someone who simply knows a subject or enjoys using gadgets (Mishra et al., 2023).</w:t>
+        <w:t xml:space="preserve">The Technological Pedagogical Content Knowledge (TPACK) framework was proposed by Punya Mishra and Matthew Koehler in the mid-2000s as an extension of the idea of pedagogical content knowledge. The framework states that effective teaching requires teachers to combine content knowledge (what to teach), pedagogical knowledge (how to teach) and technological knowledge (the tools that support teaching). The areas where these forms of knowledge overlap, such as pedagogical content knowledge and technological pedagogical knowledge, represent the specialised knowledge that distinguishes an expert teacher (Mishra et al., 2023).</w:t>
       </w:r>
     </w:p>
     <w:p>
@@ -4687,7 +4687,7 @@
           <w:sz w:val="24"/>
           <w:szCs w:val="24"/>
         </w:rPr>
-        <w:t xml:space="preserve">In revisiting the framework, Mishra et al. (2023) stress that teachers also need contextual knowledge, an understanding of the circumstances, limits and opportunities of the setting in which they teach. That point carries real weight in Habaswein, where electricity, devices and internet access cannot be taken for granted. Digital literacy is one of the CBC’s core competencies, and teachers are expected to build it into every learning area. Yet Murithi and Yoo (2021) found that many Kenyan primary teachers had received only basic computer training and lacked the capacity to use technology meaningfully in CBC lessons. TPACK therefore helps the study to ask whether teachers can bring together content, pedagogy and whatever technology is available, including low-cost alternatives, to develop the intended competencies. Because its knowledge areas overlap and are hard to measure one by one, the study will use TPACK to interpret findings rather than as a measurement tool.</w:t>
+        <w:t xml:space="preserve">Mishra et al. (2023) revisited the framework and emphasised that teachers also need contextual knowledge, that is, knowledge of the conditions, limitations and opportunities of the setting in which they teach. This is relevant to Habaswein, where electricity, digital devices and internet access are not always available. Digital literacy is one of the core competencies of the CBC and teachers are expected to integrate it in all learning areas. Murithi and Yoo (2021), however, found that many Kenyan primary school teachers had only received basic computer literacy training and were not able to integrate technology meaningfully in CBC lessons. The TPACK framework will help the study to examine whether teachers are able to combine content, pedagogy and the technology available to them, including low-cost resources. Because the knowledge areas in TPACK overlap and are difficult to measure separately, the framework will be used to interpret the findings and not as a measurement tool.</w:t>
       </w:r>
     </w:p>
     <w:p>
@@ -4712,7 +4712,7 @@
           <w:sz w:val="24"/>
           <w:szCs w:val="24"/>
         </w:rPr>
-        <w:t xml:space="preserve">Kenya turned to a competency-based curriculum partly because the 8-4-4 system had become heavily focused on examinations and was not producing school leavers with the practical skills and values a changing economy needs (Akala, 2021). The Basic Education Curriculum Framework set out a vision of nurturing every learner’s potential. It named seven core competencies and a set of national values, and it listed pertinent and contemporary issues (PCIs), such as health, the environment, citizenship and life skills, to be woven across learning areas. Learners are meant to discover, create and apply knowledge through activities, while teachers guide the process rather than serving as the only source of information (Thukia, 2025).</w:t>
+        <w:t xml:space="preserve">Kenya adopted a competency-based curriculum partly because the 8-4-4 system had become too examination-oriented and was not producing school leavers with the skills and values required in a changing economy (Akala, 2021). The Basic Education Curriculum Framework set out the vision of nurturing every learner’s potential. It identified seven core competencies and a set of national values, together with pertinent and contemporary issues (PCIs) such as health, environmental awareness, citizenship and life skills, which are to be integrated across the learning areas. Learners are expected to discover, create and apply knowledge through activities, while the teacher acts as a facilitator rather than the only source of knowledge (Thukia, 2025).</w:t>
       </w:r>
     </w:p>
     <w:p>
@@ -4726,7 +4726,7 @@
           <w:sz w:val="24"/>
           <w:szCs w:val="24"/>
         </w:rPr>
-        <w:t xml:space="preserve">Thukia (2025) reads the reform through Basil Bernstein’s ideas on curriculum and pedagogy. In this reading, the CBC moves away from a tightly controlled, teacher-led model towards one in which learners have more say over the pace and order of their learning. The shift is demanding. Teachers must be secure enough to let go of some control while still steering learning with purpose. Where that confidence or skill is missing, schools may end up with a hybrid: new terminology on the surface, old routines underneath.</w:t>
+        <w:t xml:space="preserve">Thukia (2025) analysed the reform using Basil Bernstein’s ideas on curriculum and pedagogy. According to this analysis, the CBC is a move from a teacher-controlled model of teaching to a model in which learners have more control over the pace and order of learning. This places heavy demands on teachers, who must be confident enough to give learners some control while still guiding the learning process. Where teachers lack this confidence or the necessary skills, schools may adopt the terminology of the new curriculum while old classroom routines continue.</w:t>
       </w:r>
     </w:p>
     <w:p>
@@ -4740,7 +4740,7 @@
           <w:sz w:val="24"/>
           <w:szCs w:val="24"/>
         </w:rPr>
-        <w:t xml:space="preserve">Assessment is one of the pillars of the reform. Under the KNEC (2021) framework, teachers carry out school-based assessment with a variety of tools and record learners’ progress at four levels: exceeding expectations, meeting expectations, approaching expectations and below expectations. The PWPER (2023) acknowledged that inadequate teacher preparation, an overloaded timetable and a shortage of resources had held implementation back. It recommended fewer learning areas and a stronger push on teacher capacity building. These recommendations make clear that teacher competence is widely seen as decisive for the reform. They also show that the curriculum is still changing, so teachers will need to keep updating what they know.</w:t>
+        <w:t xml:space="preserve">Assessment is a key part of the CBC. Under the KNEC (2021) framework, teachers carry out school-based assessment using a variety of tools and record learners’ progress at four levels: exceeding expectations, meeting expectations, approaching expectations and below expectations. The PWPER (2023) noted that implementation of the curriculum had been affected by inadequate preparation of teachers, an overloaded timetable and a shortage of resources. It recommended a reduction in the number of learning areas and more investment in teacher capacity building. These recommendations show that teacher competence is regarded as critical to the success of the reform. They also show that the curriculum is still being reviewed, and teachers will need to keep updating their knowledge.</w:t>
       </w:r>
     </w:p>
     <w:p>
@@ -4765,7 +4765,7 @@
           <w:sz w:val="24"/>
           <w:szCs w:val="24"/>
         </w:rPr>
-        <w:t xml:space="preserve">This section reviews empirical studies under each of the four objectives. Where relevant, evidence from other countries comes first and Kenyan studies follow, so that the issues can be seen at both regional and national level.</w:t>
+        <w:t xml:space="preserve">This section reviews studies related to each of the four objectives of the study. Studies done outside Kenya are reviewed first where available, followed by those done in Kenya.</w:t>
       </w:r>
     </w:p>
     <w:p>
@@ -4790,7 +4790,7 @@
           <w:sz w:val="24"/>
           <w:szCs w:val="24"/>
         </w:rPr>
-        <w:t xml:space="preserve">It is hard to implement a curriculum well without understanding what it is trying to do. Across Africa, teachers’ understanding of competence-based reforms appears to be uneven. In their review of studies from seven countries, Wawire et al. (2026) found a clear gap between policy and practice: the reforms call for a shift from covering content to developing competences, yet much classroom practice still reflects the older approach. Kasuga and Kalolo (2025) point to inadequate training and support as a central problem in Tanzania, noting that many teachers had not been properly prepared for the new way of working. In Uganda, Kidega et al. (2024) likewise traced many of the difficulties teachers faced in Gulu City back to insufficient training on the new curriculum.</w:t>
+        <w:t xml:space="preserve">Wawire et al. (2026) conducted a scoping review of literature on pedagogical and assessment practices in schools implementing competence-based curricula in Ghana, Kenya, Rwanda, South Africa, Tanzania, Uganda and Zambia. The review established that although the reforms call for a shift from content coverage to the development of competences, much of the classroom practice in these countries still reflects the older approach. The review, however, was a synthesis of existing studies and did not collect primary data on teachers’ knowledge in any particular context.</w:t>
       </w:r>
     </w:p>
     <w:p>
@@ -4804,7 +4804,7 @@
           <w:sz w:val="24"/>
           <w:szCs w:val="24"/>
         </w:rPr>
-        <w:t xml:space="preserve">Kenyan evidence points the same way. Mwang’ombe (2021) looked at teachers’ understanding and skills in relation to the CBC and found that understanding was often vague and uneven. In practice, this kind of vagueness can mean a teacher is able to list the core competencies but is unsure how to develop them in a particular lesson. Working in public pre-primary schools in Nairobi City County, Isaboke et al. (2021) found that 65.9% of teachers had received no CBC training at all. The authors linked this lack of training, along with poor facilities and large classes, to weak implementation. Their study targeted 450 pre-primary teachers, 225 ECD centre managers and 225 head teachers, and the findings are all the more striking because Nairobi is one of the best-resourced counties in Kenya.</w:t>
+        <w:t xml:space="preserve">Kasuga and Kalolo (2025) studied the dilemmas facing the implementation of the competency-based curriculum in Njombe Region, Tanzania. The study found that many teachers had not received adequate training and support, and it identified teachers’ readiness as one of the main dilemmas affecting implementation. In Uganda, Kidega et al. (2024) examined the challenges facing teachers in implementing the competency-based curriculum in secondary schools in Gulu City. The study found that the challenges were linked to insufficient training, large classes and inadequate materials. Both studies were conducted at secondary school level and outside Kenya.</w:t>
       </w:r>
     </w:p>
     <w:p>
@@ -4818,7 +4818,7 @@
           <w:sz w:val="24"/>
           <w:szCs w:val="24"/>
         </w:rPr>
-        <w:t xml:space="preserve">More recent studies give a mixed picture. In Machakos County, Mutua and Waweru (2023) found that yearly in-service training was considered adequate, yet shortages of learning materials and a high pupil-teacher ratio still got in the way. Karua et al. (2025) examined teachers’ awareness of the tenets of the CBC in Kinangop Sub-County and found that a majority (52.3%) were not competent in preparing schemes of work in line with the curriculum. Being aware of a curriculum, it seems, is not the same as knowing how to plan for it.</w:t>
+        <w:t xml:space="preserve">In Kenya, Mwang’ombe (2021) examined teachers’ understanding and skills in relation to the CBC and concluded that their understanding of the curriculum was vague and uneven. Isaboke et al. (2021) studied teacher preparedness and the implementation of the CBC in public pre-primary schools in Nairobi City County. The study targeted 450 pre-primary teachers, 225 ECD centre managers and 225 head teachers. It found that 65.9% of the teachers had not received any CBC training and that implementation was hindered by lack of training, inadequate facilities and large classes. The study was done in pre-primary schools in an urban county, and its findings may not apply to primary schools in ASAL areas.</w:t>
       </w:r>
     </w:p>
     <w:p>
@@ -4832,7 +4832,7 @@
           <w:sz w:val="24"/>
           <w:szCs w:val="24"/>
         </w:rPr>
-        <w:t xml:space="preserve">Mwangi et al. (2026) add a further twist. Although 95% of the teachers in their study had been trained, 65% held negative views of the curriculum. This suggests that training may have passed on information without building real understanding or a sense of ownership, which fits the argument of Jentsch and König (2022) that competence involves beliefs and motivation as well as knowledge. In junior secondary schools in Bomet County, Keter and Wabuke (2025) found that teacher preparedness was significantly associated with the level of implementation, and that gaps in preparation continued to hold back the quality of that implementation.</w:t>
+        <w:t xml:space="preserve">Mutua and Waweru (2023) investigated teachers’ competence and its influence on the implementation of the CBC in public primary schools in Machakos County. The study used a descriptive survey design and targeted 79 public primary schools, 941 teachers, 79 deputy head teachers and 79 head teachers. It found that yearly in-service training for teachers was adequate, but implementation was hindered by lack of enough teaching and learning materials and a high pupil-teacher ratio. Karua et al. (2025) studied teacher preparedness to implement the CBC in public primary schools in Kinangop Sub-County. The study targeted 268 lower primary teachers in 46 schools and found that the majority of teachers (52.3%) were not competent in preparing schemes of work, and that teachers had low capacity to select appropriate teaching and learning approaches. This shows that awareness of the curriculum does not always mean that a teacher knows how to plan for it.</w:t>
       </w:r>
     </w:p>
     <w:p>
@@ -4846,7 +4846,21 @@
           <w:sz w:val="24"/>
           <w:szCs w:val="24"/>
         </w:rPr>
-        <w:t xml:space="preserve">Very little of this research has been done in the ASAL counties. Hussein (2023) reported that teachers in northern Kenya had little exposure to CBC training and that poor infrastructure and scarce resources made proper grading difficult. Ongubo (2025) found that more than 60% of public primary teachers in Township Ward, Garissa, had not received comprehensive in-service training. Neither study, however, measured teachers’ knowledge systematically or linked it statistically to implementation. The present study will do both in Habaswein.</w:t>
+        <w:t xml:space="preserve">Mwangi et al. (2026) studied teacher training and perceptions of the CBC in Kenyan schools. They found that although 95% of the teachers had been trained to implement the curriculum, 65% held negative perceptions of it. This finding is in line with the argument by Jentsch and König (2022) that competence includes beliefs and motivation as well as knowledge. Keter and Wabuke (2025) investigated teacher preparedness and the implementation of the CBC in public junior secondary schools in Bomet County and found that teacher preparedness significantly influenced implementation.</w:t>
+      </w:r>
+    </w:p>
+    <w:p>
+      <w:pPr>
+        <w:spacing w:after="160" w:before="0" w:line="360"/>
+        <w:jc w:val="both"/>
+      </w:pPr>
+      <w:r>
+        <w:rPr>
+          <w:rFonts w:ascii="Times New Roman" w:cs="Times New Roman" w:eastAsia="Times New Roman" w:hAnsi="Times New Roman"/>
+          <w:sz w:val="24"/>
+          <w:szCs w:val="24"/>
+        </w:rPr>
+        <w:t xml:space="preserve">Few studies have been done in the ASAL counties. Hussein (2023) examined the challenges facing CBC implementation in northern Kenya and found that teachers had limited exposure to training and that poor infrastructure and inadequate learning resources made proper grading difficult. Ongubo (2025) assessed public primary school teacher preparedness for CBC adoption in Township Ward, Garissa County, and found that more than 60% of the teachers had not received comprehensive in-service training. Neither of the two studies measured teachers’ knowledge using a knowledge scale or tested its relationship with implementation. The present study intends to fill this gap in Habaswein Sub-County.</w:t>
       </w:r>
     </w:p>
     <w:p>
@@ -4871,7 +4885,7 @@
           <w:sz w:val="24"/>
           <w:szCs w:val="24"/>
         </w:rPr>
-        <w:t xml:space="preserve">Pedagogical competence is about what teachers actually do in class: how they plan, how they organise activities, how they draw learners in and how they use the resources available. The CBC asks teachers to use learner-centred approaches such as inquiry, cooperative learning, role play, projects, field visits and problem solving, and to build values and PCIs into their lessons. Wawire et al. (2026) found that across African countries using competence-based curricula, classroom practice remained largely teacher-centred. Learners had few chances to work together, investigate or create. The reasons are partly practical, such as large classes, a lack of materials and weak preparation, and partly a matter of habits formed over many years of examination-driven teaching.</w:t>
+        <w:t xml:space="preserve">Pedagogical competence refers to what a teacher does in class, including how the teacher plans, organises learning activities, involves learners and uses resources. The CBC requires teachers to use learner-centred methods such as inquiry, cooperative learning, role play, projects, field visits and problem solving, and to integrate values and PCIs in their lessons. In their review, Wawire et al. (2026) found that classroom practice in African countries implementing competence-based curricula has remained largely teacher-centred, with learners given few opportunities to work together, investigate or create. This was attributed to factors such as large classes, a shortage of materials and inadequate preparation of teachers.</w:t>
       </w:r>
     </w:p>
     <w:p>
@@ -4885,7 +4899,7 @@
           <w:sz w:val="24"/>
           <w:szCs w:val="24"/>
         </w:rPr>
-        <w:t xml:space="preserve">In Kenya, the APHRC (2022) evaluation offers one of the closest looks at CBC teaching in practice. It examined lessons in schools and tried to identify what an effective CBC lesson looks like, with features such as clear learning outcomes, active learner involvement and deliberate attention to core competencies. The evidence shows that such lessons are possible in Kenyan public schools, but their quality varies a great deal, and many lessons meet the curriculum’s expectations only in part. In Kirinyaga County, Mohamed et al. (2022) found that geography teachers’ pedagogical preparedness for the CBC was low.</w:t>
+        <w:t xml:space="preserve">In Kenya, APHRC (2022) evaluated the quality of CBC implementation by examining lessons in schools with the aim of identifying the features of effective lessons, such as clear learning outcomes, active participation of learners and deliberate integration of core competencies. The evaluation found that effective CBC lessons were being delivered in some public schools, but that the quality of lessons varied widely. Mohamed et al. (2022) studied the pedagogical preparedness of geography teachers for the implementation of the CBC in public secondary schools in Kirinyaga County. The study targeted 24 schools, 24 head teachers and 100 geography teachers, from which a sample of 40 respondents was drawn. It found that teachers’ pedagogical preparedness for the CBC was low. The small sample, however, limits the extent to which the findings can be generalised.</w:t>
       </w:r>
     </w:p>
     <w:p>
@@ -4899,7 +4913,7 @@
           <w:sz w:val="24"/>
           <w:szCs w:val="24"/>
         </w:rPr>
-        <w:t xml:space="preserve">In Sabatia Sub-County, Vihiga County, Alwang’a and Were (2026) looked at the state of teachers’ pedagogical knowledge and its connection to CBC implementation in public primary schools. Their work ties the quality of implementation to the strength of teachers’ pedagogical knowledge and marks it out as a key ingredient of effective delivery. Karua et al. (2025) found that teachers in Kinangop had limited capacity to choose suitable teaching and learning approaches for CBC classes. Mutai et al. (2024), surveying 605 respondents in Moiben Sub-County, reported that teacher preparedness had a significant influence on how the CBC was implemented.</w:t>
+        <w:t xml:space="preserve">Alwang’a and Were (2026) examined the status of teachers’ pedagogical knowledge and the implementation of the CBC in public primary schools in Sabatia Sub-County, Vihiga County. Their study linked the quality of implementation to teachers’ pedagogical knowledge. Mutai et al. (2024) studied CBC implementation and teacher preparedness in public schools in Moiben Sub-County, Uasin Gishu County, using a descriptive survey of 605 respondents, including teachers, head teachers and Curriculum Support Officers. The study found that teacher preparedness had a significant influence on the implementation of the CBC.</w:t>
       </w:r>
     </w:p>
     <w:p>
@@ -4913,7 +4927,7 @@
           <w:sz w:val="24"/>
           <w:szCs w:val="24"/>
         </w:rPr>
-        <w:t xml:space="preserve">Assessment is part and parcel of teaching under the CBC. Macheso, Kati, and Wafula (2024) found that teachers in western Kenya relied on written tests far more than on portfolios, projects and anecdotal records, even though the KNEC (2021) framework calls for a wide range of tools. In a companion study of Grade 6 science and technology teachers in Bungoma, Busia and Trans-Nzoia, Macheso, Wafula, and Kati (2024) found that teachers’ self-efficacy was linked to how far they implemented competency-based assessment. Put plainly, teachers who felt confident about assessment tended to carry it out more fully. This matters because it shows that pedagogical competence depends not only on skill but also on teachers’ belief in their own ability, just as the Teacher Professional Competence Model would predict.</w:t>
+        <w:t xml:space="preserve">Macheso, Kati, and Wafula (2024) investigated the extent to which teachers in western Kenya used competency-based assessment tools. They found that teachers used written tests much more than portfolios, projects and anecdotal records, although the KNEC (2021) framework requires the use of a variety of tools. In another study of Grade 6 science and technology teachers in Bungoma, Busia and Trans-Nzoia counties, Macheso, Wafula, and Kati (2024) found that teachers’ self-efficacy was related to the extent to which they implemented competency-based assessment. Teachers who were confident about assessment implemented it more fully. These findings suggest that pedagogical competence depends on teachers’ belief in their own ability as well as on their skills.</w:t>
       </w:r>
     </w:p>
     <w:p>
@@ -4927,7 +4941,7 @@
           <w:sz w:val="24"/>
           <w:szCs w:val="24"/>
         </w:rPr>
-        <w:t xml:space="preserve">Digital teaching is a further dimension. Murithi and Yoo (2021) surveyed 351 teachers. Most saw ICT as necessary for the CBC, but they had received only basic computer training and found it hard to use technology in their lessons. In Habaswein, where power and connectivity are limited, the challenge is probably greater still. We know little about how teachers in such places understand and teach the digital literacy competency, or whether they turn to low-cost alternatives.</w:t>
+        <w:t xml:space="preserve">Murithi and Yoo (2021) studied teachers’ use of ICT in implementing the CBC in Kenyan public primary schools. The study involved 351 teachers who responded to an online questionnaire. Most of the teachers considered ICT necessary for the CBC, but they had received only basic computer literacy training and had difficulty integrating technology in their lessons. The study was done online, and teachers in remote areas with poor connectivity may not have been well represented. It is not clear how teachers in areas such as Habaswein, where electricity and internet access are limited, handle the digital literacy competency.</w:t>
       </w:r>
     </w:p>
     <w:p>
@@ -4952,7 +4966,7 @@
           <w:sz w:val="24"/>
           <w:szCs w:val="24"/>
         </w:rPr>
-        <w:t xml:space="preserve">The literature points to several sets of factors that shape teachers’ competence. They can be grouped under training and professional development, resources and infrastructure, workload and staffing, supervision and support, attitudes and beliefs, and the wider context.</w:t>
+        <w:t xml:space="preserve">The literature identifies several factors that affect teachers’ competence in implementing the CBC. These include training and professional development, teaching resources and infrastructure, workload and staffing, supervision and support, attitudes, and the wider context in which schools operate.</w:t>
       </w:r>
     </w:p>
     <w:p>
@@ -4966,7 +4980,7 @@
           <w:sz w:val="24"/>
           <w:szCs w:val="24"/>
         </w:rPr>
-        <w:t xml:space="preserve">Training is the factor mentioned most often. UNESCO and the International Task Force on Teachers for Education 2030 (2024) argue that professional development only improves teaching when it is continuous, grounded in practice and responsive to what teachers need. In Kenya, by contrast, early CBC training was widely described as short and rushed. Having found most teachers in Nyamira South ill-prepared, Okeyo and Mokua (2023) warned that training should not be carried out hurriedly as a public relations exercise. Ongubo (2025) found that the reach of in-service training in Township Ward, Garissa, was limited. In Nairobi County, Mogere (2022) likewise identified teacher training as an important determinant of how well the CBC was being implemented.</w:t>
+        <w:t xml:space="preserve">UNESCO and the International Task Force on Teachers for Education 2030 (2024) argue that professional development improves teaching only when it is continuous, practical and based on the needs of teachers. In Kenya, the initial CBC training was widely described as short and rushed. Okeyo and Mokua (2023) studied teacher preparedness for the CBC in public secondary schools in Nyamira South Sub-County using a convergent mixed methods design and a sample of 483 respondents. They found that the schools were ill-prepared and most teachers had not been trained, and they recommended that training should not be done hurriedly as a public relations exercise. Ongubo (2025) also found that the coverage of in-service training in Township Ward, Garissa County, was limited. Mogere (2022) studied the determinants of CBC implementation in public primary schools in Nairobi County and identified teacher training as an important determinant.</w:t>
       </w:r>
     </w:p>
     <w:p>
@@ -4980,7 +4994,7 @@
           <w:sz w:val="24"/>
           <w:szCs w:val="24"/>
         </w:rPr>
-        <w:t xml:space="preserve">Resources and infrastructure form the second set. Cheruiyot (2024) identified shortages of learning materials, inadequate classrooms and weak technological infrastructure as major problems in junior schools, together with resistance to change among teachers, parents and learners. In northern Kenya, Hussein (2023) found that poor infrastructure and a lack of learning resources made proper assessment difficult. Mutua and Waweru (2023) reported that a shortage of teaching and learning materials held back implementation in Machakos. When resources are this thin, even skilled teachers may be unable to use the methods they know would work best.</w:t>
+        <w:t xml:space="preserve">Teaching resources and infrastructure also affect teachers’ ability to implement the curriculum. Cheruiyot (2024) studied the challenges facing CBC implementation in junior schools in Kenya and identified a shortage of learning materials, inadequate classrooms and limited technological infrastructure. The study also found resistance to change among teachers, parents and learners. Hussein (2023) reported that poor infrastructure and lack of learning resources affected proper grading in northern Kenya, while Mutua and Waweru (2023) found that inadequate teaching and learning materials hindered implementation in Machakos County. Where resources are lacking, even competent teachers may not be able to use the methods they know to be effective.</w:t>
       </w:r>
     </w:p>
     <w:p>
@@ -4994,7 +5008,7 @@
           <w:sz w:val="24"/>
           <w:szCs w:val="24"/>
         </w:rPr>
-        <w:t xml:space="preserve">Workload and staffing come next, because they decide how much time and energy teachers have for planning, assessment and reflection. The CBC calls for detailed lesson plans and continuous assessment records for every learner, which can quickly become overwhelming in a large class. Isaboke et al. (2021) listed large classes and understaffing among the main barriers in Nairobi, and Mutua and Waweru (2023) drew attention to the high pupil-teacher ratio. The shortage of teachers is sharper still in ASAL counties. The County Government of Wajir (2023) recognises it as a serious and continuing problem. In practice, many schools lean on Board of Management teachers, some of whom may never have received formal CBC training.</w:t>
+        <w:t xml:space="preserve">Workload and staffing determine the time that teachers have for planning, assessment and reflection. The CBC requires detailed lesson plans and continuous assessment records for every learner, which is demanding when classes are large. Isaboke et al. (2021) listed large classes and understaffing among the challenges facing implementation in Nairobi, and Mutua and Waweru (2023) identified a high pupil-teacher ratio as a constraint. The shortage of teachers is more serious in ASAL counties. The County Government of Wajir (2023) acknowledges the shortage of teachers as a major problem in the county. Many schools therefore depend on Board of Management teachers, some of whom may not have received formal CBC training.</w:t>
       </w:r>
     </w:p>
     <w:p>
@@ -5008,7 +5022,7 @@
           <w:sz w:val="24"/>
           <w:szCs w:val="24"/>
         </w:rPr>
-        <w:t xml:space="preserve">Supervision and support make up a fourth set. Awiti (2023), studying primary schools in Nairobi City, examined a range of school-level factors affecting CBC implementation and underlined the importance of the support teachers receive within their schools. It is reasonable to expect that where head teachers observe lessons regularly, review schemes of work and organise peer learning, teachers will grow in confidence. Keter and Wabuke (2025) also stress the value of continuous support in strengthening teacher preparedness.</w:t>
+        <w:t xml:space="preserve">Supervision and support from head teachers and Curriculum Support Officers also influence teacher competence. Awiti (2023) examined factors affecting the implementation of the CBC in primary schools in Nairobi City and pointed out the importance of the support that teachers receive within their schools. Keter and Wabuke (2025) also emphasised the role of continuous support in improving teacher preparedness. It is expected that teachers become more confident where head teachers observe lessons regularly, check schemes of work and organise peer learning.</w:t>
       </w:r>
     </w:p>
     <w:p>
@@ -5022,7 +5036,7 @@
           <w:sz w:val="24"/>
           <w:szCs w:val="24"/>
         </w:rPr>
-        <w:t xml:space="preserve">Attitudes and beliefs are a fifth. Mwangi et al. (2026) found that most teachers held negative views of the CBC despite having been trained, and Cheruiyot (2024) identified resistance to change among teachers as a barrier. The Teacher Professional Competence Model suggests that such beliefs colour how teachers read classroom situations and how they respond. A teacher who doubts the value of learner-centred methods may slip back into lecturing, especially when there is pressure to finish the syllabus.</w:t>
+        <w:t xml:space="preserve">Teachers’ attitudes are another factor. Mwangi et al. (2026) found that most teachers had negative perceptions of the CBC even after being trained, and Cheruiyot (2024) reported resistance to change among teachers. According to the Teacher Professional Competence Model, such attitudes influence how teachers interpret classroom situations and how they respond. A teacher who does not believe in learner-centred methods may go back to the lecture method, especially when under pressure to complete the syllabus.</w:t>
       </w:r>
     </w:p>
     <w:p>
@@ -5036,7 +5050,7 @@
           <w:sz w:val="24"/>
           <w:szCs w:val="24"/>
         </w:rPr>
-        <w:t xml:space="preserve">The last set concerns the wider context, which is especially important in marginalised areas. Barasa et al. (2025) showed that in Uganda, schools serving low-income communities found the competence-based reform harder to implement than schools serving wealthier families, and they warned that without deliberate support the reform could lock in inequality. Kasuga and Kalolo (2025) made a similar point about rural schools in Tanzania. In northern Kenya, drought, pastoralist movement, long distances and insecurity disrupt both learners’ attendance and teachers’ access to training (County Government of Wajir, 2023; Hussein, 2023). Such conditions can wear down morale and push up staff turnover, breaking the continuity that competence needs in order to grow. Few studies have looked at how these conditions interact with teacher competence under the CBC in Kenya, and this study aims to do so.</w:t>
+        <w:t xml:space="preserve">The context in which schools operate is also important, especially in marginalised areas. Barasa et al. (2025) studied the implementation of the lower secondary competence-based curriculum in Uganda and found that schools serving learners from poor backgrounds were less able to implement the reform than schools serving wealthier learners. They warned that the reform could increase inequality unless deliberate support was given. Kasuga and Kalolo (2025) reported that rural schools in Tanzania faced serious shortages of materials and infrastructure. In northern Kenya, drought, the movement of pastoralist families, long distances and insecurity affect learners’ attendance and teachers’ access to training (County Government of Wajir, 2023; Hussein, 2023). These conditions may lower teachers’ morale and increase staff turnover. Few studies have examined how such conditions relate to teachers’ competence in implementing the CBC in Kenya, and the present study will address this.</w:t>
       </w:r>
     </w:p>
     <w:p>
@@ -5061,7 +5075,7 @@
           <w:sz w:val="24"/>
           <w:szCs w:val="24"/>
         </w:rPr>
-        <w:t xml:space="preserve">The fourth objective concerns the link between teachers’ competence and how effectively the CBC is implemented. A number of Kenyan studies have explored related links, though most used preparedness rather than competence as the explanatory variable. Mutai et al. (2024) found a significant positive relationship between teacher preparedness and CBC implementation in Moiben Sub-County. Keter and Wabuke (2025) reported that teacher preparedness significantly influenced implementation in public junior secondary schools in Bomet County. Mutua and Waweru (2023) examined teachers’ competence, in terms of values, attitudes, knowledge and skills, alongside the extent of CBC implementation in Machakos County. They concluded that implementation depended both on the teachers and on the conditions in which they worked, such as the supply of materials and the pupil-teacher ratio.</w:t>
+        <w:t xml:space="preserve">Several Kenyan studies have looked at the relationship between teacher-related factors and CBC implementation, although most of them used preparedness rather than competence as the independent variable. Mutai et al. (2024) found a significant positive relationship between teacher preparedness and CBC implementation in Moiben Sub-County. Keter and Wabuke (2025) found that teacher preparedness significantly influenced the implementation of the CBC in public junior secondary schools in Bomet County. Mutua and Waweru (2023) examined teachers’ competence in terms of values, attitudes, knowledge and skills together with the extent of CBC implementation in Machakos County, and concluded that implementation depended on both the teachers and the conditions under which they worked, such as the availability of materials and the pupil-teacher ratio.</w:t>
       </w:r>
     </w:p>
     <w:p>
@@ -5075,7 +5089,7 @@
           <w:sz w:val="24"/>
           <w:szCs w:val="24"/>
         </w:rPr>
-        <w:t xml:space="preserve">Alwang’a and Were (2026) narrowed the focus to pedagogical knowledge as one specific dimension of competence. Their work suggests that the state of teachers’ pedagogical knowledge has a direct bearing on how the CBC is implemented in Sabatia, which strengthens the case for targeted professional development in learner-centred methods. Macheso, Wafula, and Kati (2024) found that teacher efficacy was linked to the implementation of competency-based assessment. The APHRC (2022) evaluation also suggests that the quality of CBC lessons depends heavily on what teachers bring into the classroom, including how they plan and how well they understand the intended competencies.</w:t>
+        <w:t xml:space="preserve">Alwang’a and Were (2026) focused on pedagogical knowledge as one aspect of competence and linked it to the implementation of the CBC in Sabatia Sub-County. Macheso, Wafula, and Kati (2024) found that teacher efficacy was related to the implementation of competency-based assessment. The evaluation by APHRC (2022) also suggests that the quality of CBC lessons depends a great deal on teachers’ planning and their understanding of the competences that the lessons are meant to develop.</w:t>
       </w:r>
     </w:p>
     <w:p>
@@ -5089,7 +5103,7 @@
           <w:sz w:val="24"/>
           <w:szCs w:val="24"/>
         </w:rPr>
-        <w:t xml:space="preserve">Beyond Kenya, the review by Wawire et al. (2026) shows that the gap between competence-based policy and classroom practice is closely bound up with teacher preparation and the resources available to schools. In Uganda, Kidega et al. (2024) recommended sustained training and support for teachers, noting that many of the challenges they faced came from gaps in their preparation for the new curriculum. Jentsch and König (2022) supply the theoretical thread that ties these findings together: teacher competence affects the quality of teaching, and the quality of teaching affects what learners gain.</w:t>
+        <w:t xml:space="preserve">Outside Kenya, the review by Wawire et al. (2026) shows that the gap between competence-based policy and classroom practice is closely related to teacher preparation and the resources available in schools. Kidega et al. (2024) recommended continuous training and support for teachers in Uganda after finding that many of the challenges they faced were due to inadequate preparation for the new curriculum. Jentsch and König (2022) provide the theoretical basis for these findings, since they argue that teacher competence influences the quality of instruction, which in turn influences learners’ outcomes.</w:t>
       </w:r>
     </w:p>
     <w:p>
@@ -5103,7 +5117,7 @@
           <w:sz w:val="24"/>
           <w:szCs w:val="24"/>
         </w:rPr>
-        <w:t xml:space="preserve">Useful as this evidence is, it has three weaknesses. Most studies measured competence or preparedness through self-report questionnaires alone, which may paint too rosy a picture. Few separated the different dimensions of competence or tested what each contributes to implementation. And almost none were carried out in the ASAL counties of North Eastern Kenya. This study responds by combining questionnaires with classroom observation and interviews, by testing the separate and combined effects of knowledge and pedagogical competence, and by focusing on Habaswein Sub-County.</w:t>
+        <w:t xml:space="preserve">These studies have three main weaknesses. Most of them relied on self-report questionnaires, which may overstate teachers’ competence. Few of them separated the different aspects of competence and tested their individual contribution to implementation. In addition, very few were conducted in the ASAL counties of North Eastern Kenya. The present study will combine questionnaires with classroom observation and interviews, test the separate and combined influence of knowledge and pedagogical competence on implementation, and focus on Habaswein Sub-County.</w:t>
       </w:r>
     </w:p>
     <w:p>
@@ -5128,7 +5142,7 @@
           <w:sz w:val="24"/>
           <w:szCs w:val="24"/>
         </w:rPr>
-        <w:t xml:space="preserve">Taken together, the literature agrees that teacher competence is central to the success of the CBC and that many Kenyan teachers have yet to acquire the full set of competences the curriculum requires. The body of work does, however, have its weak spots. The most obvious is geographical. Most studies have been carried out in Nairobi, central Kenya, the Rift Valley and western Kenya (Isaboke et al., 2021; Karua et al., 2025; Mohamed et al., 2022; Mutai et al., 2024). The handful of studies from northern Kenya, such as Hussein (2023) and Ongubo (2025), were mainly descriptive and did not test how competence relates to implementation.</w:t>
+        <w:t xml:space="preserve">The literature reviewed agrees that teacher competence is important for the success of the CBC and that many teachers in Kenya have not yet acquired the competences required. The literature, however, has some weaknesses. First, most of the studies were done in Nairobi, central Kenya, the Rift Valley and western Kenya (Isaboke et al., 2021; Karua et al., 2025; Mohamed et al., 2022; Mutai et al., 2024). The few studies done in northern Kenya, such as Hussein (2023) and Ongubo (2025), were mainly descriptive and did not test the relationship between competence and implementation.</w:t>
       </w:r>
     </w:p>
     <w:p>
@@ -5142,7 +5156,7 @@
           <w:sz w:val="24"/>
           <w:szCs w:val="24"/>
         </w:rPr>
-        <w:t xml:space="preserve">There is also some confusion over concepts. Preparedness, readiness, competence and capacity are often used as if they meant the same thing, and many studies gauged preparedness mainly by asking whether teachers had attended training. The work of Mwangi et al. (2026) shows how weak that measure is, since trained teachers may still lack understanding or hold negative views of the curriculum. This study uses a clearer definition of competence, drawn from the Teacher Professional Competence Model (Jentsch &amp; König, 2022), which separates knowledge from pedagogical competence.</w:t>
+        <w:t xml:space="preserve">Second, the literature is not consistent in the use of concepts. Terms such as preparedness, readiness, competence and capacity are often used to mean the same thing, and many studies measured preparedness mainly by asking whether teachers had attended training. The findings of Mwangi et al. (2026) show that this is a weak measure, since trained teachers may still lack understanding or have negative attitudes towards the curriculum. The present study uses a clearer definition of competence based on the Teacher Professional Competence Model (Jentsch &amp; König, 2022), and separates knowledge from pedagogical competence.</w:t>
       </w:r>
     </w:p>
     <w:p>
@@ -5156,7 +5170,7 @@
           <w:sz w:val="24"/>
           <w:szCs w:val="24"/>
         </w:rPr>
-        <w:t xml:space="preserve">Method is a third concern. Many studies relied on questionnaires alone, which invite respondents to present themselves in a good light. Only a few, among them APHRC (2022) and Okeyo and Mokua (2023), used observation or document analysis to check what teachers said against what they did. Some studies also worked with small or purposively chosen samples, which limits how far their findings can be generalised. Mohamed et al. (2022), for example, drew their sample from a target population of just 24 schools. This study will use stratified random sampling, an adequate sample and several sources of data to make its findings more credible.</w:t>
+        <w:t xml:space="preserve">Third, many studies relied only on questionnaires, which are prone to social desirability bias. Only a few, such as APHRC (2022) and Okeyo and Mokua (2023), used observation or document analysis to confirm what teachers reported. Some studies also used small samples. Mohamed et al. (2022), for instance, based their findings on 40 respondents. The present study will use stratified random sampling, an adequate sample size and data from several sources.</w:t>
       </w:r>
     </w:p>
     <w:p>
@@ -5170,7 +5184,7 @@
           <w:sz w:val="24"/>
           <w:szCs w:val="24"/>
         </w:rPr>
-        <w:t xml:space="preserve">Lastly, context has usually been treated as background rather than as something that interacts with teacher competence. Barasa et al. (2025) and Kasuga and Kalolo (2025) show that context shapes how competence-based reforms play out, yet Kenyan studies have seldom asked how drought, insecurity and pastoralist movement affect teachers’ professional growth. This study will look at these factors directly.</w:t>
+        <w:t xml:space="preserve">Lastly, most studies treated the context of schools as background information rather than as a factor that interacts with teacher competence. Barasa et al. (2025) and Kasuga and Kalolo (2025) show that context affects how competence-based reforms are implemented, but Kenyan studies have rarely examined how drought, insecurity and pastoralist movement affect teachers’ professional growth. The present study will examine these factors.</w:t>
       </w:r>
     </w:p>
     <w:p>
@@ -5195,7 +5209,7 @@
           <w:sz w:val="24"/>
           <w:szCs w:val="24"/>
         </w:rPr>
-        <w:t xml:space="preserve">Figure 2.1 shows the relationship the study expects to find between the independent, intervening and dependent variables.</w:t>
+        <w:t xml:space="preserve">The conceptual framework in Figure 2.1 shows the expected relationship between the independent, intervening and dependent variables of the study.</w:t>
       </w:r>
     </w:p>
     <w:p>
@@ -5289,7 +5303,7 @@
           <w:sz w:val="24"/>
           <w:szCs w:val="24"/>
         </w:rPr>
-        <w:t xml:space="preserve">The independent variable is teachers’ competence, which has two dimensions. The first is knowledge and understanding of the CBC: how well teachers grasp the curriculum’s goals, core competencies, values, PCIs, learning areas and assessment requirements. The second is pedagogical competence: teachers’ ability to prepare schemes of work and lesson plans in the required format, teach through learner-centred methods, build core competencies and values into lessons, use and improvise resources and carry out competency-based assessment.</w:t>
+        <w:t xml:space="preserve">The independent variable is teachers’ competence, which has two dimensions. The first is knowledge and understanding of the CBC, which refers to teachers’ understanding of the goals, core competencies, values, PCIs, learning areas and assessment requirements of the curriculum. The second is pedagogical competence, which refers to teachers’ ability to prepare schemes of work and lesson plans in the required format, use learner-centred methods, integrate core competencies and values in lessons, use and improvise resources, and carry out competency-based assessment.</w:t>
       </w:r>
     </w:p>
     <w:p>
@@ -5303,7 +5317,7 @@
           <w:sz w:val="24"/>
           <w:szCs w:val="24"/>
         </w:rPr>
-        <w:t xml:space="preserve">The dependent variable is the effective implementation of the CBC. It will be measured through indicators that reflect what the curriculum sets out to achieve: active learner participation, the integration of core competencies and PCIs in lessons, the use of varied assessment tools and proper learner records, coverage of learning areas on schedule and parents’ involvement in learning.</w:t>
+        <w:t xml:space="preserve">The dependent variable is the effective implementation of the CBC. It will be measured using indicators that reflect the intentions of the curriculum. These are active participation of learners, integration of core competencies and PCIs in lessons, use of a variety of assessment tools and proper learner records, coverage of learning areas within the set time, and involvement of parents in learning activities.</w:t>
       </w:r>
     </w:p>
     <w:p>
@@ -5317,7 +5331,7 @@
           <w:sz w:val="24"/>
           <w:szCs w:val="24"/>
         </w:rPr>
-        <w:t xml:space="preserve">The factors affecting teachers’ competence are treated as intervening variables. They include how adequate CBC training and continuous professional development have been, the availability of teaching resources and ICT, teachers’ workload and class size, supervision and support from head teachers and Curriculum Support Officers, teachers’ attitudes towards the CBC and local conditions such as drought, insecurity and pastoralist movement. These factors can strengthen or weaken the link between competence and implementation. A knowledgeable teacher, for instance, may still find group work almost impossible with 90 learners and no desks. Government policy, including the reforms recommended by the PWPER (2023), is acknowledged as a wider influence but will not be measured directly.</w:t>
+        <w:t xml:space="preserve">The factors affecting teachers’ competence are the intervening variables. They include the adequacy of CBC training and professional development, availability of teaching resources and ICT facilities, teachers’ workload and class size, supervision and support from head teachers and Curriculum Support Officers, teachers’ attitudes towards the CBC, and local conditions such as drought, insecurity and the movement of pastoralist families. These factors may strengthen or weaken the relationship between competence and implementation. For example, a teacher who understands the CBC well may still find it difficult to use group work in a class of 90 learners without desks. Government policy, including the reforms recommended by the PWPER (2023), is acknowledged as a wider influence, but it will not be measured in this study.</w:t>
       </w:r>
     </w:p>
     <w:p>
@@ -5342,7 +5356,7 @@
           <w:sz w:val="24"/>
           <w:szCs w:val="24"/>
         </w:rPr>
-        <w:t xml:space="preserve">The review shows that the CBC asks a great deal of teachers: a solid understanding of the curriculum, skill in learner-centred teaching and the ability to assess competences. Each of the three theories sheds light on a different part of this demand. CBAM shows that teachers take up new ideas gradually and need support that matches their concerns. The Teacher Professional Competence Model shows that competence is a blend of knowledge, beliefs and situation-specific skills. TPACK draws attention to the combined knowledge needed to teach content well with the tools available in a given setting. Studies from Kenya and elsewhere in Africa confirm that gaps in teacher competence are common and that training, resources, workload, supervision, attitudes and context all play a part. Table 2.1 summarises the main studies and the gaps they leave.</w:t>
+        <w:t xml:space="preserve">The literature shows that the CBC requires teachers to have a good understanding of the curriculum, skills in learner-centred teaching and the ability to assess competences. CBAM explains that teachers adopt new ideas gradually and need support that addresses their concerns. The Teacher Professional Competence Model shows that competence is made up of knowledge, beliefs and situation-specific skills, while the TPACK framework points to the combined knowledge that teachers need in order to teach content effectively with the tools available in their setting. Studies in Kenya and in other African countries show that gaps in teacher competence are common and are influenced by training, resources, workload, supervision, attitudes and context. Table 2.1 summarises the main studies reviewed and the gaps identified.</w:t>
       </w:r>
     </w:p>
     <w:p>
@@ -6830,7 +6844,7 @@
           <w:sz w:val="24"/>
           <w:szCs w:val="24"/>
         </w:rPr>
-        <w:t xml:space="preserve">Three gaps stand out. The first is contextual: no known study has examined teacher competence and CBC implementation in Habaswein Sub-County, or in Wajir County more broadly. The second is conceptual, since many studies have used training attendance as a stand-in for competence. The third is methodological, as few studies have checked self-reported data against classroom observation or tested what each dimension of competence contributes on its own. This study has been designed with all three gaps in mind.</w:t>
+        <w:t xml:space="preserve">From the review, three gaps are evident. There is a contextual gap, since no known study has examined teacher competence and CBC implementation in Habaswein Sub-County or in Wajir County. There is a conceptual gap, because many studies have used attendance at training to represent competence. There is also a methodological gap, since few studies have confirmed self-reported data through classroom observation or tested the separate contribution of each aspect of competence. The present study seeks to fill these gaps.</w:t>
       </w:r>
     </w:p>
     <w:p>
@@ -6871,7 +6885,7 @@
           <w:sz w:val="24"/>
           <w:szCs w:val="24"/>
         </w:rPr>
-        <w:t xml:space="preserve">This chapter explains how the study will be carried out. It covers the research design and the setting, the people who will take part and how they will be chosen, and the instruments that will be used. It also describes how the instruments will be piloted and checked, how data will be gathered and analysed, the practical arrangements for fieldwork and the ethical safeguards that will guide the whole process.</w:t>
+        <w:t xml:space="preserve">This chapter describes the methodology that will be used in the study. It presents the research design, location of the study, target population, sampling techniques and sample size, and research instruments. It also describes the pilot study, validity and reliability of the instruments, data collection procedures, data analysis, logistical considerations and ethical considerations.</w:t>
       </w:r>
     </w:p>
     <w:p>
@@ -6896,7 +6910,7 @@
           <w:sz w:val="24"/>
           <w:szCs w:val="24"/>
         </w:rPr>
-        <w:t xml:space="preserve">The study will use a convergent parallel mixed methods design that combines a descriptive survey with a correlational component. In this kind of design, quantitative and qualitative data are gathered during the same period and analysed separately. The two sets of results are then brought together at the interpretation stage, so that each can confirm, extend or question the other (Creswell &amp; Creswell, 2023). The descriptive survey will show the current level of teachers’ knowledge and pedagogical competence and the factors that affect them, as they are, without any attempt to manipulate variables. The correlational part will test how strongly, and in which direction, teachers’ competence is related to effective CBC implementation, as set out in the hypotheses.</w:t>
+        <w:t xml:space="preserve">The study will use a convergent parallel mixed methods design that combines a descriptive survey with a correlational component. In a convergent design, quantitative and qualitative data are collected at the same time and analysed separately, and the results are then merged during interpretation so that one set of results can confirm or explain the other (Creswell &amp; Creswell, 2023). The descriptive survey will enable the researcher to describe the level of teachers’ knowledge, their pedagogical competence and the factors affecting their competence without manipulating any variables. The correlational part will enable the researcher to test the strength and direction of the relationship between teachers’ competence and effective CBC implementation, as stated in the hypotheses.</w:t>
       </w:r>
     </w:p>
     <w:p>
@@ -6910,7 +6924,7 @@
           <w:sz w:val="24"/>
           <w:szCs w:val="24"/>
         </w:rPr>
-        <w:t xml:space="preserve">The design suits the study for a few reasons. The study needs both to describe a situation and to test relationships, and that calls for quantitative data from a fairly large number of teachers. Competence, however, is a complex idea, and questionnaires alone may not capture it faithfully. Interviews with head teachers and Curriculum Support Officers, together with classroom observation, will add depth and make the evidence more believable. The approach also has a track record in Kenyan research on the CBC. Okeyo and Mokua (2023) used a convergent mixed methods design to study teacher preparedness in Nyamira South, while Mutua and Waweru (2023) used a descriptive survey to study teacher competence in Machakos. The main demand of the design is that the two strands of data must be properly brought together. The researcher will handle this by preparing a joint display of the findings during analysis.</w:t>
+        <w:t xml:space="preserve">This design is suitable because the study seeks both to describe the situation and to test relationships, which requires quantitative data from a relatively large number of teachers. Competence is also a complex concept that may not be fully captured through questionnaires. Interviews with head teachers and Curriculum Support Officers and classroom observation will therefore provide additional evidence. The design has also been used in other Kenyan studies on the CBC. Okeyo and Mokua (2023) used a convergent mixed methods design to study teacher preparedness in Nyamira South, while Mutua and Waweru (2023) used a descriptive survey to study teacher competence in Machakos. The design requires that the two sets of data are properly integrated, and the researcher will do this by preparing a joint display of the findings during analysis.</w:t>
       </w:r>
     </w:p>
     <w:p>
@@ -6935,7 +6949,7 @@
           <w:sz w:val="24"/>
           <w:szCs w:val="24"/>
         </w:rPr>
-        <w:t xml:space="preserve">The study will take place in Habaswein Sub-County, one of the sub-counties of Wajir County in Kenya’s North Eastern region. It lies in the southern part of the county, along the main road between Garissa and Wajir towns, and shares a boundary with Garissa County to the south and west. The land is mostly dry. Rainfall is low and unpredictable, temperatures are high and droughts come round often. Most residents are pastoralists who keep camels, cattle, goats and sheep, and many households move with the seasons in search of water and pasture. Habaswein town is the administrative and trading centre, while the rest of the population lives in small settlements scattered over a very large area (County Government of Wajir, 2023).</w:t>
+        <w:t xml:space="preserve">The study will take place in Habaswein Sub-County, one of the sub-counties of Wajir County in Kenya’s North Eastern region. It lies in the southern part of the county, along the main road between Garissa and Wajir towns, and shares a boundary with Garissa County to the south and west. The area is mainly arid, with low and unreliable rainfall, high temperatures and frequent droughts. Most residents are pastoralists who keep camels, cattle, goats and sheep, and many households move with the seasons in search of water and pasture. Habaswein town is the administrative and trading centre, while the rest of the population lives in small settlements scattered over a very large area (County Government of Wajir, 2023).</w:t>
       </w:r>
     </w:p>
     <w:p>
@@ -6949,7 +6963,7 @@
           <w:sz w:val="24"/>
           <w:szCs w:val="24"/>
         </w:rPr>
-        <w:t xml:space="preserve">Wajir County has some of the weakest education indicators in the country. Its County Integrated Development Plan names low enrolment and transition rates, too few teachers, inadequate classrooms and sanitation facilities, and the disruption caused by drought and insecurity as key challenges (County Government of Wajir, 2023). Several public primary schools in the sub-county run low-cost boarding facilities to keep children from mobile households in school. Habaswein was chosen for three reasons. It typifies the marginalised ASAL setting in which the CBC is thought to be hardest to implement. No earlier study has examined teacher competence and CBC implementation there. And the researcher knows the area well, which should make it easier to reach schools and communicate with respondents.</w:t>
+        <w:t xml:space="preserve">Wajir County has some of the lowest education indicators in Kenya. Its County Integrated Development Plan names low enrolment and transition rates, too few teachers, inadequate classrooms and sanitation facilities, and the disruption caused by drought and insecurity as key challenges (County Government of Wajir, 2023). Several public primary schools in the sub-county run low-cost boarding facilities to keep children from mobile households in school. Habaswein was selected because it represents the marginalised ASAL setting in which the CBC is likely to be most difficult to implement, because no previous study has examined teacher competence and CBC implementation in the sub-county, and because the researcher is familiar with the area, which will make it easier to access schools and communicate with respondents.</w:t>
       </w:r>
     </w:p>
     <w:p>
@@ -6974,7 +6988,7 @@
           <w:sz w:val="24"/>
           <w:szCs w:val="24"/>
         </w:rPr>
-        <w:t xml:space="preserve">The target population is made up of all public primary schools in Habaswein Sub-County, their head teachers and teachers, and the Curriculum Support Officers (CSOs) who serve the sub-county. The school will be the unit of analysis, while teachers, head teachers and CSOs will be the units of observation. Teachers are included because they are the ones who deliver the CBC day to day. Head teachers lead teaching and learning in their schools, supervise staff and decide how resources are used. CSOs support teachers professionally and monitor how the curriculum is being implemented across schools.</w:t>
+        <w:t xml:space="preserve">The target population is made up of all public primary schools in Habaswein Sub-County, their head teachers and teachers, and the Curriculum Support Officers (CSOs) who serve the sub-county. The school will be the unit of analysis, while teachers, head teachers and CSOs will be the units of observation. Teachers are included because they are the implementers of the CBC. Head teachers are included because they are responsible for instructional leadership, supervision of teachers and allocation of resources in their schools. CSOs are included because they provide professional support to teachers and monitor curriculum implementation in schools.</w:t>
       </w:r>
     </w:p>
     <w:p>
@@ -7624,7 +7638,7 @@
           <w:sz w:val="24"/>
           <w:szCs w:val="24"/>
         </w:rPr>
-        <w:t xml:space="preserve">The 3 Curriculum Support Officers serving Habaswein Sub-County will also form part of the target population, in addition to the groups shown in Table 3.1.</w:t>
+        <w:t xml:space="preserve">In addition to the population shown in Table 3.1, the 3 Curriculum Support Officers serving Habaswein Sub-County will form part of the target population.</w:t>
       </w:r>
     </w:p>
     <w:p>
@@ -7660,7 +7674,7 @@
           <w:sz w:val="24"/>
           <w:szCs w:val="24"/>
         </w:rPr>
-        <w:t xml:space="preserve">Several sampling methods will be combined: stratified random sampling, simple random sampling, proportionate allocation and a census. Schools will first be split into two strata by location, namely schools in Habaswein town and its surroundings and schools in rural settlements. The split matters because schools in and near the town probably enjoy better transport, electricity, access to training and supervision than those further out, and such differences may shape teachers’ competence. Within each stratum, schools will then be picked by simple random sampling, using a table of random numbers or a computer-generated list. This gives every school the same chance of selection and reduces bias (Creswell &amp; Creswell, 2023).</w:t>
+        <w:t xml:space="preserve">The study will use stratified random sampling, simple random sampling, proportionate allocation and census. Schools will first be divided into two strata according to location, that is, schools in Habaswein town and its environs and schools in rural settlements. Stratification is necessary because schools in and around the town are likely to have better access to transport, electricity, training and supervision than rural schools, and these differences may affect teachers’ competence. Schools in each stratum will then be selected through simple random sampling using a table of random numbers or a computer-generated list, which gives each school an equal chance of being selected (Creswell &amp; Creswell, 2023).</w:t>
       </w:r>
     </w:p>
     <w:p>
@@ -7674,7 +7688,7 @@
           <w:sz w:val="24"/>
           <w:szCs w:val="24"/>
         </w:rPr>
-        <w:t xml:space="preserve">Half of the schools in each stratum will be selected, which means 6 from the town stratum and 15 from the rural stratum, or 21 schools in all. Taking half of a fairly small number of schools gives good coverage of both strata while keeping the work within the time and money available. Because each school has only one head teacher, the head teachers of the 21 sampled schools will automatically form part of the sample. All 3 CSOs will be included through a census, as there are few of them and their view of the support available to teachers is important.</w:t>
+        <w:t xml:space="preserve">Fifty percent of the schools in each stratum will be selected, giving 6 schools from the town stratum and 15 from the rural stratum, a total of 21 schools. This proportion is considered adequate for a small population of schools and will allow the researcher to cover both strata within the available time and budget. The head teachers of the 21 sampled schools will automatically be included in the sample. All 3 CSOs will be included through census because their number is small.</w:t>
       </w:r>
     </w:p>
     <w:p>
@@ -7699,7 +7713,7 @@
           <w:sz w:val="24"/>
           <w:szCs w:val="24"/>
         </w:rPr>
-        <w:t xml:space="preserve">The number of teachers to be sampled will be worked out with the following formula, which is widely used in educational surveys when the size of the population is known:</w:t>
+        <w:t xml:space="preserve">The sample size of teachers will be determined using the following formula, which is commonly used in educational surveys where the population is known:</w:t>
       </w:r>
     </w:p>
     <w:p>
@@ -7729,7 +7743,7 @@
           <w:sz w:val="24"/>
           <w:szCs w:val="24"/>
         </w:rPr>
-        <w:t xml:space="preserve">Here, n is the required sample size, N is the target population of teachers (336) and e is the level of precision, set at 0.05 for a 95% confidence level. Putting in these values gives:</w:t>
+        <w:t xml:space="preserve">Where n is the sample size, N is the target population of teachers (336) and e is the level of precision, set at 0.05 for a 95% confidence level. Substituting these values gives:</w:t>
       </w:r>
     </w:p>
     <w:p>
@@ -7759,7 +7773,7 @@
           <w:sz w:val="24"/>
           <w:szCs w:val="24"/>
         </w:rPr>
-        <w:t xml:space="preserve">The 183 teachers will be shared between the two strata in proportion to their size, using the formula: stratum sample = (stratum population / total population) × 183. In each sampled school, teachers will be listed from the staff register and chosen by simple random sampling until the number needed for that stratum is reached. If a school has fewer teachers than required, all of them will be included and the shortfall made up from other sampled schools in the same stratum. Table 3.2 shows the resulting sample.</w:t>
+        <w:t xml:space="preserve">The 183 teachers will be distributed proportionately between the two strata, using the formula: stratum sample = (stratum population / total population) × 183. In each sampled school, teachers will be listed from the staff register and selected through simple random sampling until the required number for that stratum is reached. Where a school has fewer teachers than required, all its teachers will be included and the balance drawn from other sampled schools in the same stratum. The sample distribution is shown in Table 3.2.</w:t>
       </w:r>
     </w:p>
     <w:p>
@@ -8669,7 +8683,7 @@
           <w:sz w:val="24"/>
           <w:szCs w:val="24"/>
         </w:rPr>
-        <w:t xml:space="preserve">On top of this, the researcher will observe 21 CBC lessons, one in each sampled school, using a classroom observation checklist. In each school, the teacher to be observed will be picked at random from the sampled teachers who handle Grades 4 to 6, where most upper primary learning areas and school-based assessments take place. Taking part in the observation will be voluntary.</w:t>
+        <w:t xml:space="preserve">In addition, 21 CBC lessons will be observed, one in each sampled school, using a classroom observation checklist. The teacher to be observed in each school will be randomly selected from the sampled teachers teaching Grades 4 to 6, where most upper primary learning areas and school-based assessments are found. Participation in the observation will be voluntary.</w:t>
       </w:r>
     </w:p>
     <w:p>
@@ -8694,7 +8708,7 @@
           <w:sz w:val="24"/>
           <w:szCs w:val="24"/>
         </w:rPr>
-        <w:t xml:space="preserve">Data will be collected with three instruments: a questionnaire for teachers, an interview guide for head teachers and CSOs, and a classroom observation checklist. Using more than one instrument will make it possible to cross-check the data and will add to the credibility of the findings.</w:t>
+        <w:t xml:space="preserve">Three instruments will be used to collect data, namely a questionnaire for teachers, an interview guide for head teachers and CSOs, and a classroom observation checklist. The use of more than one instrument will make it possible to triangulate the data and improve the credibility of the findings.</w:t>
       </w:r>
     </w:p>
     <w:p>
@@ -8719,7 +8733,7 @@
           <w:sz w:val="24"/>
           <w:szCs w:val="24"/>
         </w:rPr>
-        <w:t xml:space="preserve">The teachers’ questionnaire (Appendix III) will be the main source of quantitative data. It has six sections. Section A asks about the respondent: gender, age, academic and professional qualifications, teaching experience, employer (TSC or Board of Management), grades taught and any CBC training attended. Section B deals with knowledge and understanding of the CBC, and Section C with pedagogical competence, covering planning, learner-centred methods, the integration of competencies and assessment. Section D looks at the factors that affect teachers’ competence, and Section E at how effectively the CBC is being implemented. Section F offers open-ended questions so that teachers can share their views in their own words.</w:t>
+        <w:t xml:space="preserve">The questionnaire for teachers (Appendix III) will be the main instrument for collecting quantitative data. It has six sections. Section A will collect background information, including gender, age, academic and professional qualifications, teaching experience, employer (TSC or Board of Management), grades taught and CBC training attended. Section B will measure knowledge and understanding of the CBC, while Section C will measure pedagogical competence, including planning, learner-centred methods, integration of competencies and assessment. Section D will cover the factors affecting teachers’ competence and Section E the effectiveness of CBC implementation. Section F will have open-ended questions to allow teachers to give their views in their own words.</w:t>
       </w:r>
     </w:p>
     <w:p>
@@ -8733,7 +8747,7 @@
           <w:sz w:val="24"/>
           <w:szCs w:val="24"/>
         </w:rPr>
-        <w:t xml:space="preserve">Sections B to E use five-point Likert items that run from 1 (Strongly Disagree) to 5 (Strongly Agree). Section B also includes a short set of true-or-false knowledge items, so that knowledge is not measured by self-rating alone. A questionnaire makes sense for this study because it can reach many respondents in a short time, it protects their anonymity and it produces data that can be coded and analysed statistically without difficulty (Creswell &amp; Creswell, 2023). It will be given in English, which is both the language of instruction and teachers’ official working language.</w:t>
+        <w:t xml:space="preserve">Sections B to E use five-point Likert items that run from 1 (Strongly Disagree) to 5 (Strongly Agree). Section B also includes a short set of true-or-false knowledge items, so that knowledge is not measured by self-rating alone. A questionnaire is appropriate for this study because it can be used to collect data from many respondents within a short time, it allows anonymity and the data can easily be coded and analysed (Creswell &amp; Creswell, 2023). The questionnaire will be administered in English, which is the language of instruction and the official working language of teachers.</w:t>
       </w:r>
     </w:p>
     <w:p>
@@ -8758,7 +8772,7 @@
           <w:sz w:val="24"/>
           <w:szCs w:val="24"/>
         </w:rPr>
-        <w:t xml:space="preserve">The 21 head teachers and 3 CSOs will take part in semi-structured interviews based on the guide in Appendix IV. The questions ask about teachers’ knowledge and classroom practice, the support available to them, the difficulties of implementing the CBC and ideas for improvement. A semi-structured format lets the researcher follow up on interesting answers and ask for clarification while keeping the conversation on the study’s objectives. Each interview should take 30 to 45 minutes. With the interviewee’s permission, it will be audio-recorded and transcribed later; where permission is refused, the researcher will take detailed notes instead.</w:t>
+        <w:t xml:space="preserve">The 21 head teachers and 3 CSOs will take part in semi-structured interviews based on the guide in Appendix IV. The interviews will seek their views on teachers’ knowledge and classroom practice, the support available to teachers, the challenges of implementing the CBC and suggestions for improvement. Semi-structured interviews allow the researcher to probe for more information while keeping the discussion focused on the objectives of the study. Each interview is expected to take between 30 and 45 minutes. With the permission of the interviewee, the interview will be audio-recorded and transcribed later. Where permission is not given, detailed notes will be taken.</w:t>
       </w:r>
     </w:p>
     <w:p>
@@ -8783,7 +8797,7 @@
           <w:sz w:val="24"/>
           <w:szCs w:val="24"/>
         </w:rPr>
-        <w:t xml:space="preserve">A structured checklist (Appendix V) will be used to record what actually happens in CBC lessons. It looks for evidence of lesson planning, learner-centred methods, the integration of core competencies, values and PCIs, the use of teaching and learning resources, learner participation and assessment. Each item is rated from 1 (Not observed) to 4 (Fully observed), and the observer will also keep short field notes. Observation offers a check on what teachers say in the questionnaire and gives direct evidence of implementation. To lessen the effect of having a visitor in the room, the researcher will arrive a few minutes before the lesson starts and sit quietly at the back without taking part.</w:t>
+        <w:t xml:space="preserve">A structured observation checklist (Appendix V) will be used to record what takes place during CBC lessons. It will capture evidence of lesson planning, learner-centred methods, the integration of core competencies, values and PCIs, the use of teaching and learning resources, learner participation and assessment. Each item is rated from 1 (Not observed) to 4 (Fully observed), and the observer will also keep short field notes. Observation will help to confirm what teachers report in the questionnaire and will provide direct evidence of implementation. To reduce the effect of the observer’s presence, the researcher will enter the classroom a few minutes before the lesson begins and sit at the back without interfering.</w:t>
       </w:r>
     </w:p>
     <w:p>
@@ -9769,7 +9783,7 @@
           <w:sz w:val="24"/>
           <w:szCs w:val="24"/>
         </w:rPr>
-        <w:t xml:space="preserve">The instruments will be tried out first in neighbouring Wajir South Sub-County, which is similar to Habaswein in climate, way of life and schooling but falls outside the main study. The pilot will involve roughly 10% of the sample: 18 teachers, 2 head teachers and 2 classroom observations. It will help the researcher spot questions that are unclear, repeated or sensitive, find out how long each instrument takes, check that the instructions make sense and test the procedures for data entry and coding. The instruments will then be revised in light of what the pilot shows, before the main fieldwork begins.</w:t>
+        <w:t xml:space="preserve">The instruments will be pre-tested in neighbouring Wajir South Sub-County, which has similar climatic, social and educational conditions to Habaswein but will not be part of the main study. About 10% of the sample will be used in the pilot, that is, 18 teachers, 2 head teachers and 2 classroom observations. The pilot will help the researcher to identify unclear or sensitive items, estimate the time needed to complete each instrument, check the clarity of instructions and test the procedures for coding and data entry. The instruments will be revised based on the results of the pilot before the main data collection.</w:t>
       </w:r>
     </w:p>
     <w:p>
@@ -9794,7 +9808,7 @@
           <w:sz w:val="24"/>
           <w:szCs w:val="24"/>
         </w:rPr>
-        <w:t xml:space="preserve">Validity is about whether an instrument measures what it is meant to measure. This study is concerned mainly with content validity and construct validity. For content validity, the instruments will be reviewed by the researcher’s supervisors and by two curriculum studies specialists at Mount Kenya University. Each reviewer will rate how relevant every item is to the study objectives on a four-point scale. A Content Validity Index (CVI) will then be worked out by dividing the number of items rated relevant or highly relevant by the total number of items. An index of 0.78 or more will be taken as acceptable, and items that fall below this mark will be reworded or dropped. Construct validity will be supported by drawing questionnaire items from indicators found in the theories and studies reviewed in Chapter Two, and by checking in the pilot that items meant to measure the same idea are correlated.</w:t>
+        <w:t xml:space="preserve">Validity is the extent to which an instrument measures what it is supposed to measure. The study will focus on content validity and construct validity. For content validity, the instruments will be reviewed by the researcher’s supervisors and by two curriculum studies specialists at Mount Kenya University. Each reviewer will rate how relevant every item is to the study objectives on a four-point scale. A Content Validity Index (CVI) will then be worked out by dividing the number of items rated relevant or highly relevant by the total number of items. An index of 0.78 or more will be taken as acceptable, and items that fall below this mark will be reworded or dropped. Construct validity will be supported by drawing questionnaire items from indicators found in the theories and studies reviewed in Chapter Two, and by checking in the pilot that items meant to measure the same idea are correlated.</w:t>
       </w:r>
     </w:p>
     <w:p>
@@ -9819,7 +9833,7 @@
           <w:sz w:val="24"/>
           <w:szCs w:val="24"/>
         </w:rPr>
-        <w:t xml:space="preserve">Reliability is about consistency: whether an instrument gives similar results under similar conditions. The internal consistency of the Likert sections of the teachers’ questionnaire will be checked with Cronbach’s alpha, calculated from the pilot data. A coefficient of 0.70 or higher will be regarded as acceptable, in line with common practice in social science research (Field, 2024). If a section falls short, its item-total statistics will be examined and weak items revised or removed. To make the observation checklist more reliable, the researcher and a trained research assistant will observe the same pilot lessons separately and compare their ratings. Where they differ, they will talk through the differences and sharpen the checklist descriptors until they agree closely.</w:t>
+        <w:t xml:space="preserve">Reliability is the extent to which an instrument gives consistent results under similar conditions. The internal consistency of the Likert sections of the teachers’ questionnaire will be checked with Cronbach’s alpha, calculated from the pilot data. A coefficient of 0.70 or higher will be regarded as acceptable, in line with common practice in social science research (Field, 2024). If a section falls short, its item-total statistics will be examined and weak items revised or removed. To make the observation checklist more reliable, the researcher and a trained research assistant will observe the same pilot lessons separately and compare their ratings. Where their ratings differ, the differences will be discussed and the checklist descriptors clarified until a high level of agreement is reached.</w:t>
       </w:r>
     </w:p>
     <w:p>
@@ -9869,7 +9883,7 @@
           <w:sz w:val="24"/>
           <w:szCs w:val="24"/>
         </w:rPr>
-        <w:t xml:space="preserve">The first step will be to obtain an introduction letter from the School of Education at Mount Kenya University and ethical approval from the University’s Ethics Review Committee. The researcher will then apply for a research permit from the National Commission for Science, Technology and Innovation (NACOSTI). With the permit in hand, the researcher will report to the Wajir County Commissioner and the County Director of Education for authority to work in the county, and then to the Sub-County Director of Education and the TSC Sub-County Director in Habaswein. Head teachers of the sampled schools will be contacted beforehand to explain the study and to agree on suitable dates for visits.</w:t>
+        <w:t xml:space="preserve">The researcher will first obtain an introduction letter from the School of Education at Mount Kenya University and ethical approval from the University’s Ethics Review Committee. The researcher will then apply for a research permit from the National Commission for Science, Technology and Innovation (NACOSTI). After obtaining the permit, the researcher will report to the Wajir County Commissioner and the County Director of Education for authority to work in the county, and then to the Sub-County Director of Education and the TSC Sub-County Director in Habaswein. Head teachers of the sampled schools will be contacted beforehand to explain the study and to agree on suitable dates for visits.</w:t>
       </w:r>
     </w:p>
     <w:p>
@@ -9883,7 +9897,7 @@
           <w:sz w:val="24"/>
           <w:szCs w:val="24"/>
         </w:rPr>
-        <w:t xml:space="preserve">Two research assistants will be recruited. They will be qualified teachers who know the area and speak both English and Somali, and they will receive two days of training on the study objectives, the instruments, ethical procedures and personal safety. At each school, the team will first meet the head teacher, explain the study and seek informed consent from participants. Questionnaires will be handed to the sampled teachers and, wherever possible, collected the same day to keep the response rate high. Teachers who ask for more time will have up to three days. Head teachers will be interviewed in a private room at the school and CSOs at their offices. Lesson observations will take place at times agreed with the teachers. Fieldwork should take about six weeks. It will be timed to fall within the school term, away from examination periods and, as far as possible, away from the height of the dry season, when some families move away with their animals.</w:t>
+        <w:t xml:space="preserve">Two research assistants will be recruited. They will be qualified teachers who know the area and speak both English and Somali, and they will receive two days of training on the study objectives, the instruments, ethical procedures and personal safety. On arrival at each school, the researcher will report to the head teacher, explain the purpose of the study and seek informed consent from the participants. Questionnaires will be handed to the sampled teachers and, wherever possible, collected the same day to keep the response rate high. Teachers who ask for more time will have up to three days. Head teachers will be interviewed in a private room at the school and CSOs at their offices. Lesson observations will take place at times agreed with the teachers. Data collection is expected to take about six weeks. It will be carried out during the school term, avoiding examination periods and, as far as possible, the peak of the dry season when some families migrate with their livestock.</w:t>
       </w:r>
     </w:p>
     <w:p>
@@ -9919,7 +9933,7 @@
           <w:sz w:val="24"/>
           <w:szCs w:val="24"/>
         </w:rPr>
-        <w:t xml:space="preserve">Once fieldwork is over, the completed questionnaires and observation checklists will be checked for completeness and consistency, coded and entered into the Statistical Package for the Social Sciences (SPSS), version 29. The data will then be cleaned by looking for missing values, outliers and entry errors. Frequencies, percentages, means and standard deviations will be used to describe the respondents and to answer the first three research questions. Mean scores on the Likert items will be read as follows: 1.00 to 1.80 very low, 1.81 to 2.60 low, 2.61 to 3.40 moderate, 3.41 to 4.20 high and 4.21 to 5.00 very high.</w:t>
+        <w:t xml:space="preserve">After data collection, the completed questionnaires and observation checklists will be checked for completeness and consistency, coded and entered into the Statistical Package for the Social Sciences (SPSS), version 29. The data will then be cleaned by checking for missing values, outliers and entry errors. Frequencies, percentages, means and standard deviations will be used to describe the respondents and to answer the first three research questions. Mean scores on the Likert items will be interpreted as follows: 1.00 to 1.80 very low, 1.81 to 2.60 low, 2.61 to 3.40 moderate, 3.41 to 4.20 high and 4.21 to 5.00 very high.</w:t>
       </w:r>
     </w:p>
     <w:p>
@@ -9933,7 +9947,7 @@
           <w:sz w:val="24"/>
           <w:szCs w:val="24"/>
         </w:rPr>
-        <w:t xml:space="preserve">The hypotheses under the fourth objective will be tested with inferential statistics. Pearson’s product-moment correlation will show how strong the relationship is, and in which direction, between each dimension of teachers’ competence and effective CBC implementation (H01 and H02). Multiple linear regression will then show the combined and separate influence of the two dimensions of competence on effective implementation (H03). The regression model is:</w:t>
+        <w:t xml:space="preserve">The hypotheses under the fourth objective will be tested with inferential statistics. Pearson’s product-moment correlation will show how strong the relationship is, and in which direction, between each dimension of teachers’ competence and effective CBC implementation (H01 and H02). Multiple linear regression will then show the combined and separate influence of the two dimensions of competence on effective implementation (H03). The regression model will be as follows:</w:t>
       </w:r>
     </w:p>
     <w:p>
@@ -9963,7 +9977,7 @@
           <w:sz w:val="24"/>
           <w:szCs w:val="24"/>
         </w:rPr>
-        <w:t xml:space="preserve">In this model, Y is effective CBC implementation, β₀ is the constant, β₁ and β₂ are the regression coefficients, X₁ is teachers’ knowledge and understanding of the CBC, X₂ is teachers’ pedagogical competence and ε is the error term. Each variable’s composite score will be the mean of its items. Before running the regression, the researcher will check that its assumptions hold, namely normality, linearity, homoscedasticity, independence of errors and the absence of multicollinearity, using histograms, scatter plots, the Durbin-Watson statistic and variance inflation factors (Field, 2024). The coefficient of determination (R²) will show how much of the variation in implementation is explained by teachers’ competence, and the F-test will show whether the model as a whole is significant. All hypotheses will be tested at the 0.05 level of significance. Results will be presented in tables, bar charts and pie charts, each followed by interpretation and discussion.</w:t>
+        <w:t xml:space="preserve">Where Y is effective CBC implementation, β₀ is the constant, β₁ and β₂ are the regression coefficients, X₁ is teachers’ knowledge and understanding of the CBC, X₂ is teachers’ pedagogical competence and ε is the error term. Composite scores for each variable will be computed as the mean of the relevant items. Before running the regression, the researcher will check that its assumptions hold, namely normality, linearity, homoscedasticity, independence of errors and the absence of multicollinearity, using histograms, scatter plots, the Durbin-Watson statistic and variance inflation factors (Field, 2024). The coefficient of determination (R²) will show how much of the variation in implementation is explained by teachers’ competence, and the F-test will show whether the model as a whole is significant. All hypotheses will be tested at the 0.05 level of significance. Results will be presented in tables, bar charts and pie charts, each followed by interpretation and discussion.</w:t>
       </w:r>
     </w:p>
     <w:p>
@@ -9988,7 +10002,7 @@
           <w:sz w:val="24"/>
           <w:szCs w:val="24"/>
         </w:rPr>
-        <w:t xml:space="preserve">Data from interviews, open-ended questionnaire items and observation notes will be analysed through reflexive thematic analysis, following the six phases set out by Braun and Clarke (2022). These are getting familiar with the data, generating initial codes, building themes, reviewing them, defining and naming them, and writing up. Interview recordings will be transcribed word for word. Any answers given in Somali will be translated into English, and a second translator will check the translation. The researcher will read the transcripts several times, code them and group the codes into themes linked to the study objectives, using NVivo to keep the codes and themes organised. Findings will be reported as a narrative supported by direct quotations. Participants will be identified only by codes, for example HT1 for the first head teacher and CSO2 for the second Curriculum Support Officer.</w:t>
+        <w:t xml:space="preserve">Data from interviews, open-ended questionnaire items and observation notes will be analysed through reflexive thematic analysis, following the six phases set out by Braun and Clarke (2022). The phases are familiarisation with the data, generating initial codes, constructing themes, reviewing themes, defining and naming themes, and writing the report. Interview recordings will be transcribed word for word. Any answers given in Somali will be translated into English, and a second translator will check the translation. The researcher will read the transcripts several times, code them and group the codes into themes linked to the study objectives, using NVivo to keep the codes and themes organised. The findings will be presented in narrative form and supported by direct quotations. Participants will be identified only by codes, for example HT1 for the first head teacher and CSO2 for the second Curriculum Support Officer.</w:t>
       </w:r>
     </w:p>
     <w:p>
@@ -10013,7 +10027,7 @@
           <w:sz w:val="24"/>
           <w:szCs w:val="24"/>
         </w:rPr>
-        <w:t xml:space="preserve">As the convergent design requires, the quantitative and qualitative results will be brought together at the interpretation stage. For each objective, the researcher will prepare a joint display that sets the main statistical results beside the related qualitative themes and observation evidence. Where the two agree, confidence in the findings grows. Where they differ, for example if teachers rate their competence higher than what is seen in their lessons, the researcher will look into the reasons and explain them (Creswell &amp; Creswell, 2023).</w:t>
+        <w:t xml:space="preserve">In line with the convergent design, the quantitative and qualitative results will be merged during interpretation. For each objective, the researcher will prepare a joint display that sets the main statistical results beside the related qualitative themes and observation evidence. Where the two sets of results agree, this will increase confidence in the findings. Where they differ, for example where teachers rate their competence higher than what is observed in their lessons, the researcher will explore and explain the differences (Creswell &amp; Creswell, 2023).</w:t>
       </w:r>
     </w:p>
     <w:p>
@@ -10038,7 +10052,7 @@
           <w:sz w:val="24"/>
           <w:szCs w:val="24"/>
         </w:rPr>
-        <w:t xml:space="preserve">The long distances and security situation in the sub-county mean that fieldwork will need careful planning. The researcher will hire a dependable vehicle and plan visits so that schools close to one another are covered on the same day. Travel will take place only in daylight, and the local administration and security officers will be consulted before visits to remote schools. The research assistants will come from the local community, which should make communication easier and help build trust. The work plan and budget appear in Appendices VI and VII.</w:t>
+        <w:t xml:space="preserve">Because of the long distances between schools and the security situation in the sub-county, fieldwork will require careful planning. The researcher will hire a reliable vehicle and plan the visits so that schools in the same area are covered on the same day. Travel will take place only in daylight, and the local administration and security officers will be consulted before visits to remote schools. The research assistants will come from the local community, to make communication easier and build trust with respondents. The work plan and budget appear in Appendices VI and VII.</w:t>
       </w:r>
     </w:p>
     <w:p>
@@ -10077,7 +10091,7 @@
           <w:sz w:val="24"/>
           <w:szCs w:val="24"/>
         </w:rPr>
-        <w:t xml:space="preserve">Taking part will be entirely voluntary. Every participant will receive an information sheet and consent form (Appendix II) explaining what the study is about, what taking part involves, how long it will take and that they may withdraw at any time without penalty. Written consent will be obtained before any questionnaire is completed, any interview is held or any lesson is observed. Teachers will be assured that the observation is not an appraisal and that nothing seen will be passed to their employer or used for disciplinary purposes.</w:t>
+        <w:t xml:space="preserve">Participation in the study will be voluntary. Every participant will receive an information sheet and consent form (Appendix II) explaining what the study is about, what taking part involves, how long it will take and that they may withdraw at any time without penalty. Written consent will be obtained before any questionnaire is completed, any interview is held or any lesson is observed. Teachers will be assured that the observation is not an appraisal and that nothing seen will be passed to their employer or used for disciplinary purposes.</w:t>
       </w:r>
     </w:p>
     <w:p>
@@ -10091,7 +10105,7 @@
           <w:sz w:val="24"/>
           <w:szCs w:val="24"/>
         </w:rPr>
-        <w:t xml:space="preserve">Confidentiality and anonymity will be protected throughout. Respondents will not write their names on the questionnaires, and schools and individuals will be referred to by codes in every report. Recordings, transcripts and completed instruments will be kept securely, and electronic files will be password-protected in line with the Data Protection Act of 2019. The data will be used only for academic purposes and destroyed once the period required by the university has passed. The researcher will respect the cultural and religious norms of the community, including dress codes, prayer times and gender norms, and will hold interviews at times and places that suit participants. Lastly, all sources used in the study will be properly acknowledged using APA style, and the final report will be checked for plagiarism in line with university policy.</w:t>
+        <w:t xml:space="preserve">The confidentiality and anonymity of participants will be protected. Respondents will not write their names on the questionnaires, and schools and individuals will be referred to by codes in every report. Recordings, transcripts and completed instruments will be kept securely, and electronic files will be password-protected in line with the Data Protection Act of 2019. The data will be used only for academic purposes and destroyed once the period required by the university has passed. The researcher will respect the cultural and religious norms of the community, including dress codes, prayer times and gender norms, and will hold interviews at times and places that suit participants. Lastly, all sources used in the study will be properly acknowledged using APA style, and the final report will be checked for plagiarism in line with university policy.</w:t>
       </w:r>
     </w:p>
     <w:p>

</xml_diff>